<commit_message>
feat -- NI: done with SOFM, Jesus thank you
</commit_message>
<xml_diff>
--- a/42NI Nejroiformatyka/3/NI_KNT-122_Onyshchenko_19_PR3.docx
+++ b/42NI Nejroiformatyka/3/NI_KNT-122_Onyshchenko_19_PR3.docx
@@ -149,15 +149,7 @@
       </w:pPr>
       <w:r>
         <w:rPr/>
-        <w:t xml:space="preserve">Тема «Нейромережі </w:t>
-      </w:r>
-      <w:r>
-        <w:rPr/>
-        <w:t>з латеральними</w:t>
-      </w:r>
-      <w:r>
-        <w:rPr/>
-        <w:t xml:space="preserve"> зв’язками»</w:t>
+        <w:t>Тема «Нейромережі з латеральними зв’язками»</w:t>
       </w:r>
     </w:p>
     <w:p>
@@ -442,27 +434,7 @@
           <w:smallCaps w:val="false"/>
           <w:spacing w:val="0"/>
         </w:rPr>
-        <w:t xml:space="preserve">Вивчити моделі </w:t>
-      </w:r>
-      <w:r>
-        <w:rPr>
-          <w:b w:val="false"/>
-          <w:i w:val="false"/>
-          <w:caps w:val="false"/>
-          <w:smallCaps w:val="false"/>
-          <w:spacing w:val="0"/>
-        </w:rPr>
-        <w:t>нейронних мереж з латеральними зв’язками та методи їхнього навчання; порівняти можливості нейромереж з латеральними зв’язками з можливостями нейромереж прямого поширення та можливостями мереж зі зворотними зв’язками; ознайомитися з програмними засобами, що моделюють нейромережі з латеральними зв’язками</w:t>
-      </w:r>
-      <w:r>
-        <w:rPr>
-          <w:b w:val="false"/>
-          <w:i w:val="false"/>
-          <w:caps w:val="false"/>
-          <w:smallCaps w:val="false"/>
-          <w:spacing w:val="0"/>
-        </w:rPr>
-        <w:t>.</w:t>
+        <w:t>Вивчити моделі нейронних мереж з латеральними зв’язками та методи їхнього навчання; порівняти можливості нейромереж з латеральними зв’язками з можливостями нейромереж прямого поширення та можливостями мереж зі зворотними зв’язками; ознайомитися з програмними засобами, що моделюють нейромережі з латеральними зв’язками.</w:t>
       </w:r>
       <w:r>
         <w:rPr/>
@@ -538,45 +510,21 @@
         <w:rPr>
           <w:lang w:val="uk-UA"/>
         </w:rPr>
-        <w:t xml:space="preserve">Вивчити архітектуру нейромереж </w:t>
-      </w:r>
-      <w:r>
-        <w:rPr>
-          <w:lang w:val="uk-UA"/>
-        </w:rPr>
-        <w:t>з латеральними зв’язками</w:t>
-      </w:r>
-      <w:r>
-        <w:rPr>
-          <w:lang w:val="uk-UA"/>
-        </w:rPr>
-        <w:t>, а також методи їхнього навчання.</w:t>
-      </w:r>
-    </w:p>
-    <w:p>
-      <w:pPr>
-        <w:pStyle w:val="p11"/>
-        <w:rPr>
-          <w:lang w:val="uk-UA"/>
-        </w:rPr>
-      </w:pPr>
-      <w:r>
-        <w:rPr>
-          <w:lang w:val="uk-UA"/>
-        </w:rPr>
-        <w:t xml:space="preserve">3. Використовуючи документацію рекомендованого викладачем програмного засобу, вивчити його архітектуру і компоненти, призначені для моделювання і навчання нейромереж з </w:t>
-      </w:r>
-      <w:r>
-        <w:rPr>
-          <w:lang w:val="uk-UA"/>
-        </w:rPr>
-        <w:t>латеральними</w:t>
-      </w:r>
-      <w:r>
-        <w:rPr>
-          <w:lang w:val="uk-UA"/>
-        </w:rPr>
-        <w:t xml:space="preserve"> зв’язками, введення і виведення даних, підготовки звітів (виведення і відображення результатів роботи).</w:t>
+        <w:t>Вивчити архітектуру нейромереж з латеральними зв’язками, а також методи їхнього навчання.</w:t>
+      </w:r>
+    </w:p>
+    <w:p>
+      <w:pPr>
+        <w:pStyle w:val="p11"/>
+        <w:rPr>
+          <w:lang w:val="uk-UA"/>
+        </w:rPr>
+      </w:pPr>
+      <w:r>
+        <w:rPr>
+          <w:lang w:val="uk-UA"/>
+        </w:rPr>
+        <w:t>3. Використовуючи документацію рекомендованого викладачем програмного засобу, вивчити його архітектуру і компоненти, призначені для моделювання і навчання нейромереж з латеральними зв’язками, введення і виведення даних, підготовки звітів (виведення і відображення результатів роботи).</w:t>
       </w:r>
     </w:p>
     <w:p>
@@ -721,37 +669,7 @@
         <w:rPr>
           <w:lang w:val="uk-UA"/>
         </w:rPr>
-        <w:t>для відповід</w:t>
-      </w:r>
-      <w:r>
-        <w:rPr>
-          <w:lang w:val="uk-UA"/>
-        </w:rPr>
-        <w:t>ного</w:t>
-      </w:r>
-      <w:r>
-        <w:rPr>
-          <w:lang w:val="uk-UA"/>
-        </w:rPr>
-        <w:t xml:space="preserve"> варіант</w:t>
-      </w:r>
-      <w:r>
-        <w:rPr>
-          <w:lang w:val="uk-UA"/>
-        </w:rPr>
-        <w:t>у</w:t>
-      </w:r>
-      <w:r>
-        <w:rPr>
-          <w:lang w:val="uk-UA"/>
-        </w:rPr>
-        <w:t xml:space="preserve"> студента вхідних даних вирішити прикладну задачу на основі нейромереж </w:t>
-      </w:r>
-      <w:r>
-        <w:rPr>
-          <w:lang w:val="uk-UA"/>
-        </w:rPr>
-        <w:t xml:space="preserve">Кохонена </w:t>
+        <w:t xml:space="preserve">для відповідного варіанту студента вхідних даних вирішити прикладну задачу на основі нейромереж Кохонена </w:t>
       </w:r>
       <w:r>
         <w:rPr>
@@ -763,19 +681,7 @@
         <w:rPr>
           <w:lang w:val="uk-UA"/>
         </w:rPr>
-        <w:t>при цьому окремо дослідити властивості різних методів навчання</w:t>
-      </w:r>
-      <w:r>
-        <w:rPr>
-          <w:lang w:val="uk-UA"/>
-        </w:rPr>
-        <w:t xml:space="preserve">. </w:t>
-      </w:r>
-      <w:r>
-        <w:rPr>
-          <w:lang w:val="uk-UA"/>
-        </w:rPr>
-        <w:t>Для тієї ж задачі сформувати кластери на основі карт ознак, що самоорганізуються (</w:t>
+        <w:t>при цьому окремо дослідити властивості різних методів навчання. Для тієї ж задачі сформувати кластери на основі карт ознак, що самоорганізуються (</w:t>
       </w:r>
       <w:r>
         <w:rPr>
@@ -849,17 +755,7 @@
           <w:smallCaps w:val="false"/>
           <w:spacing w:val="0"/>
         </w:rPr>
-        <w:t xml:space="preserve">Проаналізувати отримані результати і дати порівняльну характеристику мереж </w:t>
-      </w:r>
-      <w:r>
-        <w:rPr>
-          <w:b w:val="false"/>
-          <w:i w:val="false"/>
-          <w:caps w:val="false"/>
-          <w:smallCaps w:val="false"/>
-          <w:spacing w:val="0"/>
-        </w:rPr>
-        <w:t xml:space="preserve">з латеральними зв’язками </w:t>
+        <w:t xml:space="preserve">Проаналізувати отримані результати і дати порівняльну характеристику мереж з латеральними зв’язками </w:t>
       </w:r>
       <w:r>
         <w:rPr>
@@ -902,47 +798,7 @@
           <w:smallCaps w:val="false"/>
           <w:spacing w:val="0"/>
         </w:rPr>
-        <w:t xml:space="preserve">. Дати порівняльну характеристику мереж </w:t>
-      </w:r>
-      <w:r>
-        <w:rPr>
-          <w:b w:val="false"/>
-          <w:i w:val="false"/>
-          <w:caps w:val="false"/>
-          <w:smallCaps w:val="false"/>
-          <w:spacing w:val="0"/>
-        </w:rPr>
-        <w:t>з латеральними</w:t>
-      </w:r>
-      <w:r>
-        <w:rPr>
-          <w:b w:val="false"/>
-          <w:i w:val="false"/>
-          <w:caps w:val="false"/>
-          <w:smallCaps w:val="false"/>
-          <w:spacing w:val="0"/>
-        </w:rPr>
-        <w:t xml:space="preserve"> зв’язками, </w:t>
-      </w:r>
-      <w:r>
-        <w:rPr>
-          <w:b w:val="false"/>
-          <w:i w:val="false"/>
-          <w:caps w:val="false"/>
-          <w:smallCaps w:val="false"/>
-          <w:spacing w:val="0"/>
-        </w:rPr>
-        <w:t>мереж зі зворотними зв’язками</w:t>
-      </w:r>
-      <w:r>
-        <w:rPr>
-          <w:b w:val="false"/>
-          <w:i w:val="false"/>
-          <w:caps w:val="false"/>
-          <w:smallCaps w:val="false"/>
-          <w:spacing w:val="0"/>
-        </w:rPr>
-        <w:t xml:space="preserve"> та мереж прямого поширення за швидкістю навчання і точністю класифікації; принципами побудови архітектури.</w:t>
+        <w:t>. Дати порівняльну характеристику мереж з латеральними зв’язками, мереж зі зворотними зв’язками та мереж прямого поширення за швидкістю навчання і точністю класифікації; принципами побудови архітектури.</w:t>
       </w:r>
     </w:p>
     <w:p>
@@ -1006,6 +862,3616 @@
       <w:r>
         <w:rPr/>
         <w:t>Виконання</w:t>
+      </w:r>
+    </w:p>
+    <w:p>
+      <w:pPr>
+        <w:pStyle w:val="H2"/>
+        <w:rPr/>
+      </w:pPr>
+      <w:r>
+        <w:rPr>
+          <w:lang w:val="uk-UA"/>
+        </w:rPr>
+        <w:t xml:space="preserve">1 </w:t>
+      </w:r>
+      <w:r>
+        <w:rPr/>
+        <w:t>SOFM</w:t>
+      </w:r>
+    </w:p>
+    <w:p>
+      <w:pPr>
+        <w:pStyle w:val="H3"/>
+        <w:rPr/>
+      </w:pPr>
+      <w:r>
+        <w:rPr/>
+        <w:t>Код</w:t>
+      </w:r>
+    </w:p>
+    <w:p>
+      <w:pPr>
+        <w:pStyle w:val="p11"/>
+        <w:rPr>
+          <w:lang w:val="uk-UA"/>
+        </w:rPr>
+      </w:pPr>
+      <w:r>
+        <w:rPr>
+          <w:lang w:val="uk-UA"/>
+        </w:rPr>
+      </w:r>
+    </w:p>
+    <w:p>
+      <w:pPr>
+        <w:pStyle w:val="Code"/>
+        <w:rPr>
+          <w:rFonts w:ascii="Consolas" w:hAnsi="Consolas"/>
+        </w:rPr>
+      </w:pPr>
+      <w:r>
+        <w:rPr>
+          <w:rFonts w:ascii="Consolas" w:hAnsi="Consolas"/>
+        </w:rPr>
+        <w:t>from sklearn.model_selection import train_test_split</w:t>
+      </w:r>
+    </w:p>
+    <w:p>
+      <w:pPr>
+        <w:pStyle w:val="Code"/>
+        <w:rPr>
+          <w:rFonts w:ascii="Consolas" w:hAnsi="Consolas"/>
+        </w:rPr>
+      </w:pPr>
+      <w:r>
+        <w:rPr>
+          <w:rFonts w:ascii="Consolas" w:hAnsi="Consolas"/>
+        </w:rPr>
+        <w:t>from sklearn.metrics import accuracy_score</w:t>
+      </w:r>
+    </w:p>
+    <w:p>
+      <w:pPr>
+        <w:pStyle w:val="Code"/>
+        <w:rPr>
+          <w:rFonts w:ascii="Consolas" w:hAnsi="Consolas"/>
+        </w:rPr>
+      </w:pPr>
+      <w:r>
+        <w:rPr>
+          <w:rFonts w:ascii="Consolas" w:hAnsi="Consolas"/>
+        </w:rPr>
+        <w:t>import matplotlib.pyplot as plt</w:t>
+      </w:r>
+    </w:p>
+    <w:p>
+      <w:pPr>
+        <w:pStyle w:val="Code"/>
+        <w:rPr>
+          <w:rFonts w:ascii="Consolas" w:hAnsi="Consolas"/>
+        </w:rPr>
+      </w:pPr>
+      <w:r>
+        <w:rPr>
+          <w:rFonts w:ascii="Consolas" w:hAnsi="Consolas"/>
+        </w:rPr>
+        <w:t>from minisom import MiniSom</w:t>
+      </w:r>
+    </w:p>
+    <w:p>
+      <w:pPr>
+        <w:pStyle w:val="Code"/>
+        <w:rPr>
+          <w:rFonts w:ascii="Consolas" w:hAnsi="Consolas"/>
+        </w:rPr>
+      </w:pPr>
+      <w:r>
+        <w:rPr>
+          <w:rFonts w:ascii="Consolas" w:hAnsi="Consolas"/>
+        </w:rPr>
+        <w:t>import numpy as np</w:t>
+      </w:r>
+    </w:p>
+    <w:p>
+      <w:pPr>
+        <w:pStyle w:val="Code"/>
+        <w:rPr>
+          <w:rFonts w:ascii="Consolas" w:hAnsi="Consolas"/>
+        </w:rPr>
+      </w:pPr>
+      <w:r>
+        <w:rPr>
+          <w:rFonts w:ascii="Consolas" w:hAnsi="Consolas"/>
+        </w:rPr>
+      </w:r>
+    </w:p>
+    <w:p>
+      <w:pPr>
+        <w:pStyle w:val="Code"/>
+        <w:rPr>
+          <w:rFonts w:ascii="Consolas" w:hAnsi="Consolas"/>
+        </w:rPr>
+      </w:pPr>
+      <w:r>
+        <w:rPr>
+          <w:rFonts w:ascii="Consolas" w:hAnsi="Consolas"/>
+        </w:rPr>
+        <w:t># Генерація даних</w:t>
+      </w:r>
+    </w:p>
+    <w:p>
+      <w:pPr>
+        <w:pStyle w:val="Code"/>
+        <w:rPr>
+          <w:rFonts w:ascii="Consolas" w:hAnsi="Consolas"/>
+        </w:rPr>
+      </w:pPr>
+      <w:r>
+        <w:rPr>
+          <w:rFonts w:ascii="Consolas" w:hAnsi="Consolas"/>
+        </w:rPr>
+        <w:t>N = 500</w:t>
+      </w:r>
+    </w:p>
+    <w:p>
+      <w:pPr>
+        <w:pStyle w:val="Code"/>
+        <w:rPr>
+          <w:rFonts w:ascii="Consolas" w:hAnsi="Consolas"/>
+        </w:rPr>
+      </w:pPr>
+      <w:r>
+        <w:rPr>
+          <w:rFonts w:ascii="Consolas" w:hAnsi="Consolas"/>
+        </w:rPr>
+      </w:r>
+    </w:p>
+    <w:p>
+      <w:pPr>
+        <w:pStyle w:val="Code"/>
+        <w:rPr>
+          <w:rFonts w:ascii="Consolas" w:hAnsi="Consolas"/>
+        </w:rPr>
+      </w:pPr>
+      <w:r>
+        <w:rPr>
+          <w:rFonts w:ascii="Consolas" w:hAnsi="Consolas"/>
+        </w:rPr>
+        <w:t>X = np.random.rand(N, 18)</w:t>
+      </w:r>
+    </w:p>
+    <w:p>
+      <w:pPr>
+        <w:pStyle w:val="Code"/>
+        <w:rPr>
+          <w:rFonts w:ascii="Consolas" w:hAnsi="Consolas"/>
+        </w:rPr>
+      </w:pPr>
+      <w:r>
+        <w:rPr>
+          <w:rFonts w:ascii="Consolas" w:hAnsi="Consolas"/>
+        </w:rPr>
+        <w:t>y = np.random.randint(0, 2, N)</w:t>
+      </w:r>
+    </w:p>
+    <w:p>
+      <w:pPr>
+        <w:pStyle w:val="Code"/>
+        <w:rPr>
+          <w:rFonts w:ascii="Consolas" w:hAnsi="Consolas"/>
+        </w:rPr>
+      </w:pPr>
+      <w:r>
+        <w:rPr>
+          <w:rFonts w:ascii="Consolas" w:hAnsi="Consolas"/>
+        </w:rPr>
+      </w:r>
+    </w:p>
+    <w:p>
+      <w:pPr>
+        <w:pStyle w:val="Code"/>
+        <w:rPr>
+          <w:rFonts w:ascii="Consolas" w:hAnsi="Consolas"/>
+        </w:rPr>
+      </w:pPr>
+      <w:r>
+        <w:rPr>
+          <w:rFonts w:ascii="Consolas" w:hAnsi="Consolas"/>
+        </w:rPr>
+        <w:t># Розділення на навчальну та тестову вибірки</w:t>
+      </w:r>
+    </w:p>
+    <w:p>
+      <w:pPr>
+        <w:pStyle w:val="Code"/>
+        <w:rPr>
+          <w:rFonts w:ascii="Consolas" w:hAnsi="Consolas"/>
+        </w:rPr>
+      </w:pPr>
+      <w:r>
+        <w:rPr>
+          <w:rFonts w:ascii="Consolas" w:hAnsi="Consolas"/>
+        </w:rPr>
+        <w:t>X_train, X_test, y_train, y_test = train_test_split(</w:t>
+      </w:r>
+    </w:p>
+    <w:p>
+      <w:pPr>
+        <w:pStyle w:val="Code"/>
+        <w:rPr>
+          <w:rFonts w:ascii="Consolas" w:hAnsi="Consolas"/>
+        </w:rPr>
+      </w:pPr>
+      <w:r>
+        <w:rPr>
+          <w:rFonts w:ascii="Consolas" w:hAnsi="Consolas"/>
+        </w:rPr>
+        <w:t xml:space="preserve">    </w:t>
+      </w:r>
+      <w:r>
+        <w:rPr>
+          <w:rFonts w:ascii="Consolas" w:hAnsi="Consolas"/>
+        </w:rPr>
+        <w:t>X, y, test_size=0.8, random_state=42</w:t>
+      </w:r>
+    </w:p>
+    <w:p>
+      <w:pPr>
+        <w:pStyle w:val="Code"/>
+        <w:rPr>
+          <w:rFonts w:ascii="Consolas" w:hAnsi="Consolas"/>
+        </w:rPr>
+      </w:pPr>
+      <w:r>
+        <w:rPr>
+          <w:rFonts w:ascii="Consolas" w:hAnsi="Consolas"/>
+        </w:rPr>
+        <w:t>)</w:t>
+      </w:r>
+    </w:p>
+    <w:p>
+      <w:pPr>
+        <w:pStyle w:val="Code"/>
+        <w:rPr>
+          <w:rFonts w:ascii="Consolas" w:hAnsi="Consolas"/>
+        </w:rPr>
+      </w:pPr>
+      <w:r>
+        <w:rPr>
+          <w:rFonts w:ascii="Consolas" w:hAnsi="Consolas"/>
+        </w:rPr>
+      </w:r>
+    </w:p>
+    <w:p>
+      <w:pPr>
+        <w:pStyle w:val="Code"/>
+        <w:rPr>
+          <w:rFonts w:ascii="Consolas" w:hAnsi="Consolas"/>
+        </w:rPr>
+      </w:pPr>
+      <w:r>
+        <w:rPr>
+          <w:rFonts w:ascii="Consolas" w:hAnsi="Consolas"/>
+        </w:rPr>
+        <w:t># --- Навчання SOFM ---</w:t>
+      </w:r>
+    </w:p>
+    <w:p>
+      <w:pPr>
+        <w:pStyle w:val="Code"/>
+        <w:rPr>
+          <w:rFonts w:ascii="Consolas" w:hAnsi="Consolas"/>
+        </w:rPr>
+      </w:pPr>
+      <w:r>
+        <w:rPr>
+          <w:rFonts w:ascii="Consolas" w:hAnsi="Consolas"/>
+        </w:rPr>
+        <w:t># Створюємо карту 8×8 нейронів</w:t>
+      </w:r>
+    </w:p>
+    <w:p>
+      <w:pPr>
+        <w:pStyle w:val="Code"/>
+        <w:rPr>
+          <w:rFonts w:ascii="Consolas" w:hAnsi="Consolas"/>
+        </w:rPr>
+      </w:pPr>
+      <w:r>
+        <w:rPr>
+          <w:rFonts w:ascii="Consolas" w:hAnsi="Consolas"/>
+        </w:rPr>
+        <w:t>map_size = (8, 8)</w:t>
+      </w:r>
+    </w:p>
+    <w:p>
+      <w:pPr>
+        <w:pStyle w:val="Code"/>
+        <w:rPr>
+          <w:rFonts w:ascii="Consolas" w:hAnsi="Consolas"/>
+        </w:rPr>
+      </w:pPr>
+      <w:r>
+        <w:rPr>
+          <w:rFonts w:ascii="Consolas" w:hAnsi="Consolas"/>
+        </w:rPr>
+        <w:t>som = MiniSom(</w:t>
+      </w:r>
+    </w:p>
+    <w:p>
+      <w:pPr>
+        <w:pStyle w:val="Code"/>
+        <w:rPr>
+          <w:rFonts w:ascii="Consolas" w:hAnsi="Consolas"/>
+        </w:rPr>
+      </w:pPr>
+      <w:r>
+        <w:rPr>
+          <w:rFonts w:ascii="Consolas" w:hAnsi="Consolas"/>
+        </w:rPr>
+        <w:t xml:space="preserve">    </w:t>
+      </w:r>
+      <w:r>
+        <w:rPr>
+          <w:rFonts w:ascii="Consolas" w:hAnsi="Consolas"/>
+        </w:rPr>
+        <w:t>x=map_size[0],</w:t>
+      </w:r>
+    </w:p>
+    <w:p>
+      <w:pPr>
+        <w:pStyle w:val="Code"/>
+        <w:rPr>
+          <w:rFonts w:ascii="Consolas" w:hAnsi="Consolas"/>
+        </w:rPr>
+      </w:pPr>
+      <w:r>
+        <w:rPr>
+          <w:rFonts w:ascii="Consolas" w:hAnsi="Consolas"/>
+        </w:rPr>
+        <w:t xml:space="preserve">    </w:t>
+      </w:r>
+      <w:r>
+        <w:rPr>
+          <w:rFonts w:ascii="Consolas" w:hAnsi="Consolas"/>
+        </w:rPr>
+        <w:t>y=map_size[1],</w:t>
+      </w:r>
+    </w:p>
+    <w:p>
+      <w:pPr>
+        <w:pStyle w:val="Code"/>
+        <w:rPr>
+          <w:rFonts w:ascii="Consolas" w:hAnsi="Consolas"/>
+        </w:rPr>
+      </w:pPr>
+      <w:r>
+        <w:rPr>
+          <w:rFonts w:ascii="Consolas" w:hAnsi="Consolas"/>
+        </w:rPr>
+        <w:t xml:space="preserve">    </w:t>
+      </w:r>
+      <w:r>
+        <w:rPr>
+          <w:rFonts w:ascii="Consolas" w:hAnsi="Consolas"/>
+        </w:rPr>
+        <w:t>input_len=18,</w:t>
+      </w:r>
+    </w:p>
+    <w:p>
+      <w:pPr>
+        <w:pStyle w:val="Code"/>
+        <w:rPr>
+          <w:rFonts w:ascii="Consolas" w:hAnsi="Consolas"/>
+        </w:rPr>
+      </w:pPr>
+      <w:r>
+        <w:rPr>
+          <w:rFonts w:ascii="Consolas" w:hAnsi="Consolas"/>
+        </w:rPr>
+        <w:t xml:space="preserve">    </w:t>
+      </w:r>
+      <w:r>
+        <w:rPr>
+          <w:rFonts w:ascii="Consolas" w:hAnsi="Consolas"/>
+        </w:rPr>
+        <w:t>sigma=1.0,  # радіус сусідства</w:t>
+      </w:r>
+    </w:p>
+    <w:p>
+      <w:pPr>
+        <w:pStyle w:val="Code"/>
+        <w:rPr>
+          <w:rFonts w:ascii="Consolas" w:hAnsi="Consolas"/>
+        </w:rPr>
+      </w:pPr>
+      <w:r>
+        <w:rPr>
+          <w:rFonts w:ascii="Consolas" w:hAnsi="Consolas"/>
+        </w:rPr>
+        <w:t xml:space="preserve">    </w:t>
+      </w:r>
+      <w:r>
+        <w:rPr>
+          <w:rFonts w:ascii="Consolas" w:hAnsi="Consolas"/>
+        </w:rPr>
+        <w:t>learning_rate=0.5,</w:t>
+      </w:r>
+    </w:p>
+    <w:p>
+      <w:pPr>
+        <w:pStyle w:val="Code"/>
+        <w:rPr>
+          <w:rFonts w:ascii="Consolas" w:hAnsi="Consolas"/>
+        </w:rPr>
+      </w:pPr>
+      <w:r>
+        <w:rPr>
+          <w:rFonts w:ascii="Consolas" w:hAnsi="Consolas"/>
+        </w:rPr>
+        <w:t xml:space="preserve">    </w:t>
+      </w:r>
+      <w:r>
+        <w:rPr>
+          <w:rFonts w:ascii="Consolas" w:hAnsi="Consolas"/>
+        </w:rPr>
+        <w:t>random_seed=42,</w:t>
+      </w:r>
+    </w:p>
+    <w:p>
+      <w:pPr>
+        <w:pStyle w:val="Code"/>
+        <w:rPr>
+          <w:rFonts w:ascii="Consolas" w:hAnsi="Consolas"/>
+        </w:rPr>
+      </w:pPr>
+      <w:r>
+        <w:rPr>
+          <w:rFonts w:ascii="Consolas" w:hAnsi="Consolas"/>
+        </w:rPr>
+        <w:t>)</w:t>
+      </w:r>
+    </w:p>
+    <w:p>
+      <w:pPr>
+        <w:pStyle w:val="Code"/>
+        <w:rPr>
+          <w:rFonts w:ascii="Consolas" w:hAnsi="Consolas"/>
+        </w:rPr>
+      </w:pPr>
+      <w:r>
+        <w:rPr>
+          <w:rFonts w:ascii="Consolas" w:hAnsi="Consolas"/>
+        </w:rPr>
+      </w:r>
+    </w:p>
+    <w:p>
+      <w:pPr>
+        <w:pStyle w:val="Code"/>
+        <w:rPr>
+          <w:rFonts w:ascii="Consolas" w:hAnsi="Consolas"/>
+        </w:rPr>
+      </w:pPr>
+      <w:r>
+        <w:rPr>
+          <w:rFonts w:ascii="Consolas" w:hAnsi="Consolas"/>
+        </w:rPr>
+        <w:t># Ініціалізація ваг</w:t>
+      </w:r>
+    </w:p>
+    <w:p>
+      <w:pPr>
+        <w:pStyle w:val="Code"/>
+        <w:rPr>
+          <w:rFonts w:ascii="Consolas" w:hAnsi="Consolas"/>
+        </w:rPr>
+      </w:pPr>
+      <w:r>
+        <w:rPr>
+          <w:rFonts w:ascii="Consolas" w:hAnsi="Consolas"/>
+        </w:rPr>
+        <w:t>som.random_weights_init(X_train)</w:t>
+      </w:r>
+    </w:p>
+    <w:p>
+      <w:pPr>
+        <w:pStyle w:val="Code"/>
+        <w:rPr>
+          <w:rFonts w:ascii="Consolas" w:hAnsi="Consolas"/>
+        </w:rPr>
+      </w:pPr>
+      <w:r>
+        <w:rPr>
+          <w:rFonts w:ascii="Consolas" w:hAnsi="Consolas"/>
+        </w:rPr>
+      </w:r>
+    </w:p>
+    <w:p>
+      <w:pPr>
+        <w:pStyle w:val="Code"/>
+        <w:rPr>
+          <w:rFonts w:ascii="Consolas" w:hAnsi="Consolas"/>
+        </w:rPr>
+      </w:pPr>
+      <w:r>
+        <w:rPr>
+          <w:rFonts w:ascii="Consolas" w:hAnsi="Consolas"/>
+        </w:rPr>
+        <w:t># --- Маркування нейронів ---</w:t>
+      </w:r>
+    </w:p>
+    <w:p>
+      <w:pPr>
+        <w:pStyle w:val="Code"/>
+        <w:rPr>
+          <w:rFonts w:ascii="Consolas" w:hAnsi="Consolas"/>
+        </w:rPr>
+      </w:pPr>
+      <w:r>
+        <w:rPr>
+          <w:rFonts w:ascii="Consolas" w:hAnsi="Consolas"/>
+        </w:rPr>
+        <w:t># Кожен нейрон отримує мітку за більшістю зразків, які до нього потрапили</w:t>
+      </w:r>
+    </w:p>
+    <w:p>
+      <w:pPr>
+        <w:pStyle w:val="Code"/>
+        <w:rPr>
+          <w:rFonts w:ascii="Consolas" w:hAnsi="Consolas"/>
+        </w:rPr>
+      </w:pPr>
+      <w:r>
+        <w:rPr>
+          <w:rFonts w:ascii="Consolas" w:hAnsi="Consolas"/>
+        </w:rPr>
+      </w:r>
+    </w:p>
+    <w:p>
+      <w:pPr>
+        <w:pStyle w:val="Code"/>
+        <w:rPr>
+          <w:rFonts w:ascii="Consolas" w:hAnsi="Consolas"/>
+        </w:rPr>
+      </w:pPr>
+      <w:r>
+        <w:rPr>
+          <w:rFonts w:ascii="Consolas" w:hAnsi="Consolas"/>
+        </w:rPr>
+        <w:t>neuron_labels = np.zeros(map_size)</w:t>
+      </w:r>
+    </w:p>
+    <w:p>
+      <w:pPr>
+        <w:pStyle w:val="Code"/>
+        <w:rPr>
+          <w:rFonts w:ascii="Consolas" w:hAnsi="Consolas"/>
+        </w:rPr>
+      </w:pPr>
+      <w:r>
+        <w:rPr>
+          <w:rFonts w:ascii="Consolas" w:hAnsi="Consolas"/>
+        </w:rPr>
+        <w:t>neuron_counts = np.zeros(map_size)</w:t>
+      </w:r>
+    </w:p>
+    <w:p>
+      <w:pPr>
+        <w:pStyle w:val="Code"/>
+        <w:rPr>
+          <w:rFonts w:ascii="Consolas" w:hAnsi="Consolas"/>
+        </w:rPr>
+      </w:pPr>
+      <w:r>
+        <w:rPr>
+          <w:rFonts w:ascii="Consolas" w:hAnsi="Consolas"/>
+        </w:rPr>
+      </w:r>
+    </w:p>
+    <w:p>
+      <w:pPr>
+        <w:pStyle w:val="Code"/>
+        <w:rPr>
+          <w:rFonts w:ascii="Consolas" w:hAnsi="Consolas"/>
+        </w:rPr>
+      </w:pPr>
+      <w:r>
+        <w:rPr>
+          <w:rFonts w:ascii="Consolas" w:hAnsi="Consolas"/>
+        </w:rPr>
+        <w:t>for i, sample in enumerate(X_train):</w:t>
+      </w:r>
+    </w:p>
+    <w:p>
+      <w:pPr>
+        <w:pStyle w:val="Code"/>
+        <w:rPr>
+          <w:rFonts w:ascii="Consolas" w:hAnsi="Consolas"/>
+        </w:rPr>
+      </w:pPr>
+      <w:r>
+        <w:rPr>
+          <w:rFonts w:ascii="Consolas" w:hAnsi="Consolas"/>
+        </w:rPr>
+        <w:t xml:space="preserve">    </w:t>
+      </w:r>
+      <w:r>
+        <w:rPr>
+          <w:rFonts w:ascii="Consolas" w:hAnsi="Consolas"/>
+        </w:rPr>
+        <w:t>winner = som.winner(sample)  # координати нейрона-переможця</w:t>
+      </w:r>
+    </w:p>
+    <w:p>
+      <w:pPr>
+        <w:pStyle w:val="Code"/>
+        <w:rPr>
+          <w:rFonts w:ascii="Consolas" w:hAnsi="Consolas"/>
+        </w:rPr>
+      </w:pPr>
+      <w:r>
+        <w:rPr>
+          <w:rFonts w:ascii="Consolas" w:hAnsi="Consolas"/>
+        </w:rPr>
+        <w:t xml:space="preserve">    </w:t>
+      </w:r>
+      <w:r>
+        <w:rPr>
+          <w:rFonts w:ascii="Consolas" w:hAnsi="Consolas"/>
+        </w:rPr>
+        <w:t>neuron_labels[winner] += y_train[i]</w:t>
+      </w:r>
+    </w:p>
+    <w:p>
+      <w:pPr>
+        <w:pStyle w:val="Code"/>
+        <w:rPr>
+          <w:rFonts w:ascii="Consolas" w:hAnsi="Consolas"/>
+        </w:rPr>
+      </w:pPr>
+      <w:r>
+        <w:rPr>
+          <w:rFonts w:ascii="Consolas" w:hAnsi="Consolas"/>
+        </w:rPr>
+        <w:t xml:space="preserve">    </w:t>
+      </w:r>
+      <w:r>
+        <w:rPr>
+          <w:rFonts w:ascii="Consolas" w:hAnsi="Consolas"/>
+        </w:rPr>
+        <w:t>neuron_counts[winner] += 1</w:t>
+      </w:r>
+    </w:p>
+    <w:p>
+      <w:pPr>
+        <w:pStyle w:val="Code"/>
+        <w:rPr>
+          <w:rFonts w:ascii="Consolas" w:hAnsi="Consolas"/>
+        </w:rPr>
+      </w:pPr>
+      <w:r>
+        <w:rPr>
+          <w:rFonts w:ascii="Consolas" w:hAnsi="Consolas"/>
+        </w:rPr>
+      </w:r>
+    </w:p>
+    <w:p>
+      <w:pPr>
+        <w:pStyle w:val="Code"/>
+        <w:rPr>
+          <w:rFonts w:ascii="Consolas" w:hAnsi="Consolas"/>
+        </w:rPr>
+      </w:pPr>
+      <w:r>
+        <w:rPr>
+          <w:rFonts w:ascii="Consolas" w:hAnsi="Consolas"/>
+        </w:rPr>
+        <w:t># Перетворюємо в мітку класу (0 або 1) на основі більшості</w:t>
+      </w:r>
+    </w:p>
+    <w:p>
+      <w:pPr>
+        <w:pStyle w:val="Code"/>
+        <w:rPr>
+          <w:rFonts w:ascii="Consolas" w:hAnsi="Consolas"/>
+        </w:rPr>
+      </w:pPr>
+      <w:r>
+        <w:rPr>
+          <w:rFonts w:ascii="Consolas" w:hAnsi="Consolas"/>
+        </w:rPr>
+        <w:t>for i in range(map_size[0]):</w:t>
+      </w:r>
+    </w:p>
+    <w:p>
+      <w:pPr>
+        <w:pStyle w:val="Code"/>
+        <w:rPr>
+          <w:rFonts w:ascii="Consolas" w:hAnsi="Consolas"/>
+        </w:rPr>
+      </w:pPr>
+      <w:r>
+        <w:rPr>
+          <w:rFonts w:ascii="Consolas" w:hAnsi="Consolas"/>
+        </w:rPr>
+        <w:t xml:space="preserve">    </w:t>
+      </w:r>
+      <w:r>
+        <w:rPr>
+          <w:rFonts w:ascii="Consolas" w:hAnsi="Consolas"/>
+        </w:rPr>
+        <w:t>for j in range(map_size[1]):</w:t>
+      </w:r>
+    </w:p>
+    <w:p>
+      <w:pPr>
+        <w:pStyle w:val="Code"/>
+        <w:rPr>
+          <w:rFonts w:ascii="Consolas" w:hAnsi="Consolas"/>
+        </w:rPr>
+      </w:pPr>
+      <w:r>
+        <w:rPr>
+          <w:rFonts w:ascii="Consolas" w:hAnsi="Consolas"/>
+        </w:rPr>
+        <w:t xml:space="preserve">        </w:t>
+      </w:r>
+      <w:r>
+        <w:rPr>
+          <w:rFonts w:ascii="Consolas" w:hAnsi="Consolas"/>
+        </w:rPr>
+        <w:t>if neuron_counts[i, j] &gt; 0:</w:t>
+      </w:r>
+    </w:p>
+    <w:p>
+      <w:pPr>
+        <w:pStyle w:val="Code"/>
+        <w:rPr>
+          <w:rFonts w:ascii="Consolas" w:hAnsi="Consolas"/>
+        </w:rPr>
+      </w:pPr>
+      <w:r>
+        <w:rPr>
+          <w:rFonts w:ascii="Consolas" w:hAnsi="Consolas"/>
+        </w:rPr>
+        <w:t xml:space="preserve">            </w:t>
+      </w:r>
+      <w:r>
+        <w:rPr>
+          <w:rFonts w:ascii="Consolas" w:hAnsi="Consolas"/>
+        </w:rPr>
+        <w:t># Якщо більшість зразків класу 1</w:t>
+      </w:r>
+    </w:p>
+    <w:p>
+      <w:pPr>
+        <w:pStyle w:val="Code"/>
+        <w:rPr>
+          <w:rFonts w:ascii="Consolas" w:hAnsi="Consolas"/>
+        </w:rPr>
+      </w:pPr>
+      <w:r>
+        <w:rPr>
+          <w:rFonts w:ascii="Consolas" w:hAnsi="Consolas"/>
+        </w:rPr>
+        <w:t xml:space="preserve">            </w:t>
+      </w:r>
+      <w:r>
+        <w:rPr>
+          <w:rFonts w:ascii="Consolas" w:hAnsi="Consolas"/>
+        </w:rPr>
+        <w:t>if neuron_labels[i, j] / neuron_counts[i, j] &gt;= 0.5:</w:t>
+      </w:r>
+    </w:p>
+    <w:p>
+      <w:pPr>
+        <w:pStyle w:val="Code"/>
+        <w:rPr>
+          <w:rFonts w:ascii="Consolas" w:hAnsi="Consolas"/>
+        </w:rPr>
+      </w:pPr>
+      <w:r>
+        <w:rPr>
+          <w:rFonts w:ascii="Consolas" w:hAnsi="Consolas"/>
+        </w:rPr>
+        <w:t xml:space="preserve">                </w:t>
+      </w:r>
+      <w:r>
+        <w:rPr>
+          <w:rFonts w:ascii="Consolas" w:hAnsi="Consolas"/>
+        </w:rPr>
+        <w:t>neuron_labels[i, j] = 1</w:t>
+      </w:r>
+    </w:p>
+    <w:p>
+      <w:pPr>
+        <w:pStyle w:val="Code"/>
+        <w:rPr>
+          <w:rFonts w:ascii="Consolas" w:hAnsi="Consolas"/>
+        </w:rPr>
+      </w:pPr>
+      <w:r>
+        <w:rPr>
+          <w:rFonts w:ascii="Consolas" w:hAnsi="Consolas"/>
+        </w:rPr>
+        <w:t xml:space="preserve">            </w:t>
+      </w:r>
+      <w:r>
+        <w:rPr>
+          <w:rFonts w:ascii="Consolas" w:hAnsi="Consolas"/>
+        </w:rPr>
+        <w:t>else:</w:t>
+      </w:r>
+    </w:p>
+    <w:p>
+      <w:pPr>
+        <w:pStyle w:val="Code"/>
+        <w:rPr>
+          <w:rFonts w:ascii="Consolas" w:hAnsi="Consolas"/>
+        </w:rPr>
+      </w:pPr>
+      <w:r>
+        <w:rPr>
+          <w:rFonts w:ascii="Consolas" w:hAnsi="Consolas"/>
+        </w:rPr>
+        <w:t xml:space="preserve">                </w:t>
+      </w:r>
+      <w:r>
+        <w:rPr>
+          <w:rFonts w:ascii="Consolas" w:hAnsi="Consolas"/>
+        </w:rPr>
+        <w:t>neuron_labels[i, j] = 0</w:t>
+      </w:r>
+    </w:p>
+    <w:p>
+      <w:pPr>
+        <w:pStyle w:val="Code"/>
+        <w:rPr>
+          <w:rFonts w:ascii="Consolas" w:hAnsi="Consolas"/>
+        </w:rPr>
+      </w:pPr>
+      <w:r>
+        <w:rPr>
+          <w:rFonts w:ascii="Consolas" w:hAnsi="Consolas"/>
+        </w:rPr>
+        <w:t xml:space="preserve">        </w:t>
+      </w:r>
+      <w:r>
+        <w:rPr>
+          <w:rFonts w:ascii="Consolas" w:hAnsi="Consolas"/>
+        </w:rPr>
+        <w:t>else:</w:t>
+      </w:r>
+    </w:p>
+    <w:p>
+      <w:pPr>
+        <w:pStyle w:val="Code"/>
+        <w:rPr>
+          <w:rFonts w:ascii="Consolas" w:hAnsi="Consolas"/>
+        </w:rPr>
+      </w:pPr>
+      <w:r>
+        <w:rPr>
+          <w:rFonts w:ascii="Consolas" w:hAnsi="Consolas"/>
+        </w:rPr>
+        <w:t xml:space="preserve">            </w:t>
+      </w:r>
+      <w:r>
+        <w:rPr>
+          <w:rFonts w:ascii="Consolas" w:hAnsi="Consolas"/>
+        </w:rPr>
+        <w:t>neuron_labels[i, j] = -1  # нейрон без зразків</w:t>
+      </w:r>
+    </w:p>
+    <w:p>
+      <w:pPr>
+        <w:pStyle w:val="Code"/>
+        <w:rPr>
+          <w:rFonts w:ascii="Consolas" w:hAnsi="Consolas"/>
+        </w:rPr>
+      </w:pPr>
+      <w:r>
+        <w:rPr>
+          <w:rFonts w:ascii="Consolas" w:hAnsi="Consolas"/>
+        </w:rPr>
+      </w:r>
+    </w:p>
+    <w:p>
+      <w:pPr>
+        <w:pStyle w:val="Code"/>
+        <w:rPr>
+          <w:rFonts w:ascii="Consolas" w:hAnsi="Consolas"/>
+        </w:rPr>
+      </w:pPr>
+      <w:r>
+        <w:rPr>
+          <w:rFonts w:ascii="Consolas" w:hAnsi="Consolas"/>
+        </w:rPr>
+        <w:t>print("\nКарта міток нейронів (8×8):")</w:t>
+      </w:r>
+    </w:p>
+    <w:p>
+      <w:pPr>
+        <w:pStyle w:val="Code"/>
+        <w:rPr>
+          <w:rFonts w:ascii="Consolas" w:hAnsi="Consolas"/>
+        </w:rPr>
+      </w:pPr>
+      <w:r>
+        <w:rPr>
+          <w:rFonts w:ascii="Consolas" w:hAnsi="Consolas"/>
+        </w:rPr>
+        <w:t>print(neuron_labels.astype(int))</w:t>
+      </w:r>
+    </w:p>
+    <w:p>
+      <w:pPr>
+        <w:pStyle w:val="Code"/>
+        <w:rPr>
+          <w:rFonts w:ascii="Consolas" w:hAnsi="Consolas"/>
+        </w:rPr>
+      </w:pPr>
+      <w:r>
+        <w:rPr>
+          <w:rFonts w:ascii="Consolas" w:hAnsi="Consolas"/>
+        </w:rPr>
+      </w:r>
+    </w:p>
+    <w:p>
+      <w:pPr>
+        <w:pStyle w:val="Code"/>
+        <w:rPr>
+          <w:rFonts w:ascii="Consolas" w:hAnsi="Consolas"/>
+        </w:rPr>
+      </w:pPr>
+      <w:r>
+        <w:rPr>
+          <w:rFonts w:ascii="Consolas" w:hAnsi="Consolas"/>
+        </w:rPr>
+      </w:r>
+    </w:p>
+    <w:p>
+      <w:pPr>
+        <w:pStyle w:val="Code"/>
+        <w:rPr>
+          <w:rFonts w:ascii="Consolas" w:hAnsi="Consolas"/>
+        </w:rPr>
+      </w:pPr>
+      <w:r>
+        <w:rPr>
+          <w:rFonts w:ascii="Consolas" w:hAnsi="Consolas"/>
+        </w:rPr>
+        <w:t># --- Класифікація ---</w:t>
+      </w:r>
+    </w:p>
+    <w:p>
+      <w:pPr>
+        <w:pStyle w:val="Code"/>
+        <w:rPr>
+          <w:rFonts w:ascii="Consolas" w:hAnsi="Consolas"/>
+        </w:rPr>
+      </w:pPr>
+      <w:r>
+        <w:rPr>
+          <w:rFonts w:ascii="Consolas" w:hAnsi="Consolas"/>
+        </w:rPr>
+        <w:t>def classify(sample):</w:t>
+      </w:r>
+    </w:p>
+    <w:p>
+      <w:pPr>
+        <w:pStyle w:val="Code"/>
+        <w:rPr>
+          <w:rFonts w:ascii="Consolas" w:hAnsi="Consolas"/>
+        </w:rPr>
+      </w:pPr>
+      <w:r>
+        <w:rPr>
+          <w:rFonts w:ascii="Consolas" w:hAnsi="Consolas"/>
+        </w:rPr>
+        <w:t xml:space="preserve">    </w:t>
+      </w:r>
+      <w:r>
+        <w:rPr>
+          <w:rFonts w:ascii="Consolas" w:hAnsi="Consolas"/>
+        </w:rPr>
+        <w:t>"""Класифікує новий зразок"""</w:t>
+      </w:r>
+    </w:p>
+    <w:p>
+      <w:pPr>
+        <w:pStyle w:val="Code"/>
+        <w:rPr>
+          <w:rFonts w:ascii="Consolas" w:hAnsi="Consolas"/>
+        </w:rPr>
+      </w:pPr>
+      <w:r>
+        <w:rPr>
+          <w:rFonts w:ascii="Consolas" w:hAnsi="Consolas"/>
+        </w:rPr>
+        <w:t xml:space="preserve">    </w:t>
+      </w:r>
+      <w:r>
+        <w:rPr>
+          <w:rFonts w:ascii="Consolas" w:hAnsi="Consolas"/>
+        </w:rPr>
+        <w:t>winner = som.winner(sample)</w:t>
+      </w:r>
+    </w:p>
+    <w:p>
+      <w:pPr>
+        <w:pStyle w:val="Code"/>
+        <w:rPr>
+          <w:rFonts w:ascii="Consolas" w:hAnsi="Consolas"/>
+        </w:rPr>
+      </w:pPr>
+      <w:r>
+        <w:rPr>
+          <w:rFonts w:ascii="Consolas" w:hAnsi="Consolas"/>
+        </w:rPr>
+        <w:t xml:space="preserve">    </w:t>
+      </w:r>
+      <w:r>
+        <w:rPr>
+          <w:rFonts w:ascii="Consolas" w:hAnsi="Consolas"/>
+        </w:rPr>
+        <w:t>return int(neuron_labels[winner])</w:t>
+      </w:r>
+    </w:p>
+    <w:p>
+      <w:pPr>
+        <w:pStyle w:val="Code"/>
+        <w:rPr>
+          <w:rFonts w:ascii="Consolas" w:hAnsi="Consolas"/>
+        </w:rPr>
+      </w:pPr>
+      <w:r>
+        <w:rPr>
+          <w:rFonts w:ascii="Consolas" w:hAnsi="Consolas"/>
+        </w:rPr>
+      </w:r>
+    </w:p>
+    <w:p>
+      <w:pPr>
+        <w:pStyle w:val="Code"/>
+        <w:rPr>
+          <w:rFonts w:ascii="Consolas" w:hAnsi="Consolas"/>
+        </w:rPr>
+      </w:pPr>
+      <w:r>
+        <w:rPr>
+          <w:rFonts w:ascii="Consolas" w:hAnsi="Consolas"/>
+        </w:rPr>
+      </w:r>
+    </w:p>
+    <w:p>
+      <w:pPr>
+        <w:pStyle w:val="Code"/>
+        <w:rPr>
+          <w:rFonts w:ascii="Consolas" w:hAnsi="Consolas"/>
+        </w:rPr>
+      </w:pPr>
+      <w:r>
+        <w:rPr>
+          <w:rFonts w:ascii="Consolas" w:hAnsi="Consolas"/>
+        </w:rPr>
+        <w:t># Передбачення на тренувальних даних</w:t>
+      </w:r>
+    </w:p>
+    <w:p>
+      <w:pPr>
+        <w:pStyle w:val="Code"/>
+        <w:rPr>
+          <w:rFonts w:ascii="Consolas" w:hAnsi="Consolas"/>
+        </w:rPr>
+      </w:pPr>
+      <w:r>
+        <w:rPr>
+          <w:rFonts w:ascii="Consolas" w:hAnsi="Consolas"/>
+        </w:rPr>
+        <w:t>train_pred = [classify(sample) for sample in X_train]</w:t>
+      </w:r>
+    </w:p>
+    <w:p>
+      <w:pPr>
+        <w:pStyle w:val="Code"/>
+        <w:rPr>
+          <w:rFonts w:ascii="Consolas" w:hAnsi="Consolas"/>
+        </w:rPr>
+      </w:pPr>
+      <w:r>
+        <w:rPr>
+          <w:rFonts w:ascii="Consolas" w:hAnsi="Consolas"/>
+        </w:rPr>
+        <w:t>train_acc = accuracy_score(y_train, train_pred)</w:t>
+      </w:r>
+    </w:p>
+    <w:p>
+      <w:pPr>
+        <w:pStyle w:val="Code"/>
+        <w:rPr>
+          <w:rFonts w:ascii="Consolas" w:hAnsi="Consolas"/>
+        </w:rPr>
+      </w:pPr>
+      <w:r>
+        <w:rPr>
+          <w:rFonts w:ascii="Consolas" w:hAnsi="Consolas"/>
+        </w:rPr>
+      </w:r>
+    </w:p>
+    <w:p>
+      <w:pPr>
+        <w:pStyle w:val="Code"/>
+        <w:rPr>
+          <w:rFonts w:ascii="Consolas" w:hAnsi="Consolas"/>
+        </w:rPr>
+      </w:pPr>
+      <w:r>
+        <w:rPr>
+          <w:rFonts w:ascii="Consolas" w:hAnsi="Consolas"/>
+        </w:rPr>
+        <w:t># Передбачення на тестових даних</w:t>
+      </w:r>
+    </w:p>
+    <w:p>
+      <w:pPr>
+        <w:pStyle w:val="Code"/>
+        <w:rPr>
+          <w:rFonts w:ascii="Consolas" w:hAnsi="Consolas"/>
+        </w:rPr>
+      </w:pPr>
+      <w:r>
+        <w:rPr>
+          <w:rFonts w:ascii="Consolas" w:hAnsi="Consolas"/>
+        </w:rPr>
+        <w:t>test_pred = [classify(sample) for sample in X_test]</w:t>
+      </w:r>
+    </w:p>
+    <w:p>
+      <w:pPr>
+        <w:pStyle w:val="Code"/>
+        <w:rPr>
+          <w:rFonts w:ascii="Consolas" w:hAnsi="Consolas"/>
+        </w:rPr>
+      </w:pPr>
+      <w:r>
+        <w:rPr>
+          <w:rFonts w:ascii="Consolas" w:hAnsi="Consolas"/>
+        </w:rPr>
+        <w:t>test_acc = accuracy_score(y_test, test_pred)</w:t>
+      </w:r>
+    </w:p>
+    <w:p>
+      <w:pPr>
+        <w:pStyle w:val="Code"/>
+        <w:rPr>
+          <w:rFonts w:ascii="Consolas" w:hAnsi="Consolas"/>
+        </w:rPr>
+      </w:pPr>
+      <w:r>
+        <w:rPr>
+          <w:rFonts w:ascii="Consolas" w:hAnsi="Consolas"/>
+        </w:rPr>
+      </w:r>
+    </w:p>
+    <w:p>
+      <w:pPr>
+        <w:pStyle w:val="Code"/>
+        <w:rPr>
+          <w:rFonts w:ascii="Consolas" w:hAnsi="Consolas"/>
+        </w:rPr>
+      </w:pPr>
+      <w:r>
+        <w:rPr>
+          <w:rFonts w:ascii="Consolas" w:hAnsi="Consolas"/>
+        </w:rPr>
+        <w:t>print(f"\nТочність на тренувальних даних: {train_acc * 100:.2f}%")</w:t>
+      </w:r>
+    </w:p>
+    <w:p>
+      <w:pPr>
+        <w:pStyle w:val="Code"/>
+        <w:rPr>
+          <w:rFonts w:ascii="Consolas" w:hAnsi="Consolas"/>
+        </w:rPr>
+      </w:pPr>
+      <w:r>
+        <w:rPr>
+          <w:rFonts w:ascii="Consolas" w:hAnsi="Consolas"/>
+        </w:rPr>
+        <w:t>print(f"Точність на тестових даних: {test_acc * 100:.2f}%")</w:t>
+      </w:r>
+    </w:p>
+    <w:p>
+      <w:pPr>
+        <w:pStyle w:val="Code"/>
+        <w:rPr>
+          <w:rFonts w:ascii="Consolas" w:hAnsi="Consolas"/>
+        </w:rPr>
+      </w:pPr>
+      <w:r>
+        <w:rPr>
+          <w:rFonts w:ascii="Consolas" w:hAnsi="Consolas"/>
+        </w:rPr>
+      </w:r>
+    </w:p>
+    <w:p>
+      <w:pPr>
+        <w:pStyle w:val="Code"/>
+        <w:rPr>
+          <w:rFonts w:ascii="Consolas" w:hAnsi="Consolas"/>
+        </w:rPr>
+      </w:pPr>
+      <w:r>
+        <w:rPr>
+          <w:rFonts w:ascii="Consolas" w:hAnsi="Consolas"/>
+        </w:rPr>
+        <w:t># --- Візуалізація ---</w:t>
+      </w:r>
+    </w:p>
+    <w:p>
+      <w:pPr>
+        <w:pStyle w:val="Code"/>
+        <w:rPr>
+          <w:rFonts w:ascii="Consolas" w:hAnsi="Consolas"/>
+        </w:rPr>
+      </w:pPr>
+      <w:r>
+        <w:rPr>
+          <w:rFonts w:ascii="Consolas" w:hAnsi="Consolas"/>
+        </w:rPr>
+        <w:t># Візуалізація карти нейронів з кольорами класів</w:t>
+      </w:r>
+    </w:p>
+    <w:p>
+      <w:pPr>
+        <w:pStyle w:val="Code"/>
+        <w:rPr>
+          <w:rFonts w:ascii="Consolas" w:hAnsi="Consolas"/>
+        </w:rPr>
+      </w:pPr>
+      <w:r>
+        <w:rPr>
+          <w:rFonts w:ascii="Consolas" w:hAnsi="Consolas"/>
+        </w:rPr>
+        <w:t>plt.figure(figsize=(10, 8))</w:t>
+      </w:r>
+    </w:p>
+    <w:p>
+      <w:pPr>
+        <w:pStyle w:val="Code"/>
+        <w:rPr>
+          <w:rFonts w:ascii="Consolas" w:hAnsi="Consolas"/>
+        </w:rPr>
+      </w:pPr>
+      <w:r>
+        <w:rPr>
+          <w:rFonts w:ascii="Consolas" w:hAnsi="Consolas"/>
+        </w:rPr>
+        <w:t>plt.imshow(neuron_labels, cmap="RdBu", origin="lower", vmin=-1, vmax=1)</w:t>
+      </w:r>
+    </w:p>
+    <w:p>
+      <w:pPr>
+        <w:pStyle w:val="Code"/>
+        <w:rPr>
+          <w:rFonts w:ascii="Consolas" w:hAnsi="Consolas"/>
+        </w:rPr>
+      </w:pPr>
+      <w:r>
+        <w:rPr>
+          <w:rFonts w:ascii="Consolas" w:hAnsi="Consolas"/>
+        </w:rPr>
+        <w:t>plt.colorbar(label="Клас (0=синій, 1=червоний)")</w:t>
+      </w:r>
+    </w:p>
+    <w:p>
+      <w:pPr>
+        <w:pStyle w:val="Code"/>
+        <w:rPr>
+          <w:rFonts w:ascii="Consolas" w:hAnsi="Consolas"/>
+        </w:rPr>
+      </w:pPr>
+      <w:r>
+        <w:rPr>
+          <w:rFonts w:ascii="Consolas" w:hAnsi="Consolas"/>
+        </w:rPr>
+        <w:t>plt.title("Карта SOFM з маркуванням нейронів")</w:t>
+      </w:r>
+    </w:p>
+    <w:p>
+      <w:pPr>
+        <w:pStyle w:val="Code"/>
+        <w:rPr>
+          <w:rFonts w:ascii="Consolas" w:hAnsi="Consolas"/>
+        </w:rPr>
+      </w:pPr>
+      <w:r>
+        <w:rPr>
+          <w:rFonts w:ascii="Consolas" w:hAnsi="Consolas"/>
+        </w:rPr>
+        <w:t>plt.xlabel("X координата")</w:t>
+      </w:r>
+    </w:p>
+    <w:p>
+      <w:pPr>
+        <w:pStyle w:val="Code"/>
+        <w:rPr>
+          <w:rFonts w:ascii="Consolas" w:hAnsi="Consolas"/>
+        </w:rPr>
+      </w:pPr>
+      <w:r>
+        <w:rPr>
+          <w:rFonts w:ascii="Consolas" w:hAnsi="Consolas"/>
+        </w:rPr>
+        <w:t>plt.ylabel("Y координата")</w:t>
+      </w:r>
+    </w:p>
+    <w:p>
+      <w:pPr>
+        <w:pStyle w:val="Code"/>
+        <w:rPr>
+          <w:rFonts w:ascii="Consolas" w:hAnsi="Consolas"/>
+        </w:rPr>
+      </w:pPr>
+      <w:r>
+        <w:rPr>
+          <w:rFonts w:ascii="Consolas" w:hAnsi="Consolas"/>
+        </w:rPr>
+      </w:r>
+    </w:p>
+    <w:p>
+      <w:pPr>
+        <w:pStyle w:val="Code"/>
+        <w:rPr>
+          <w:rFonts w:ascii="Consolas" w:hAnsi="Consolas"/>
+        </w:rPr>
+      </w:pPr>
+      <w:r>
+        <w:rPr>
+          <w:rFonts w:ascii="Consolas" w:hAnsi="Consolas"/>
+        </w:rPr>
+        <w:t># Додаємо текстові мітки</w:t>
+      </w:r>
+    </w:p>
+    <w:p>
+      <w:pPr>
+        <w:pStyle w:val="Code"/>
+        <w:rPr>
+          <w:rFonts w:ascii="Consolas" w:hAnsi="Consolas"/>
+        </w:rPr>
+      </w:pPr>
+      <w:r>
+        <w:rPr>
+          <w:rFonts w:ascii="Consolas" w:hAnsi="Consolas"/>
+        </w:rPr>
+        <w:t>for i in range(map_size[0]):</w:t>
+      </w:r>
+    </w:p>
+    <w:p>
+      <w:pPr>
+        <w:pStyle w:val="Code"/>
+        <w:rPr>
+          <w:rFonts w:ascii="Consolas" w:hAnsi="Consolas"/>
+        </w:rPr>
+      </w:pPr>
+      <w:r>
+        <w:rPr>
+          <w:rFonts w:ascii="Consolas" w:hAnsi="Consolas"/>
+        </w:rPr>
+        <w:t xml:space="preserve">    </w:t>
+      </w:r>
+      <w:r>
+        <w:rPr>
+          <w:rFonts w:ascii="Consolas" w:hAnsi="Consolas"/>
+        </w:rPr>
+        <w:t>for j in range(map_size[1]):</w:t>
+      </w:r>
+    </w:p>
+    <w:p>
+      <w:pPr>
+        <w:pStyle w:val="Code"/>
+        <w:rPr>
+          <w:rFonts w:ascii="Consolas" w:hAnsi="Consolas"/>
+        </w:rPr>
+      </w:pPr>
+      <w:r>
+        <w:rPr>
+          <w:rFonts w:ascii="Consolas" w:hAnsi="Consolas"/>
+        </w:rPr>
+        <w:t xml:space="preserve">        </w:t>
+      </w:r>
+      <w:r>
+        <w:rPr>
+          <w:rFonts w:ascii="Consolas" w:hAnsi="Consolas"/>
+        </w:rPr>
+        <w:t>if neuron_counts[i, j] &gt; 0:</w:t>
+      </w:r>
+    </w:p>
+    <w:p>
+      <w:pPr>
+        <w:pStyle w:val="Code"/>
+        <w:rPr>
+          <w:rFonts w:ascii="Consolas" w:hAnsi="Consolas"/>
+        </w:rPr>
+      </w:pPr>
+      <w:r>
+        <w:rPr>
+          <w:rFonts w:ascii="Consolas" w:hAnsi="Consolas"/>
+        </w:rPr>
+        <w:t xml:space="preserve">            </w:t>
+      </w:r>
+      <w:r>
+        <w:rPr>
+          <w:rFonts w:ascii="Consolas" w:hAnsi="Consolas"/>
+        </w:rPr>
+        <w:t>color = "white" if neuron_labels[i, j] == 1 else "black"</w:t>
+      </w:r>
+    </w:p>
+    <w:p>
+      <w:pPr>
+        <w:pStyle w:val="Code"/>
+        <w:rPr>
+          <w:rFonts w:ascii="Consolas" w:hAnsi="Consolas"/>
+        </w:rPr>
+      </w:pPr>
+      <w:r>
+        <w:rPr>
+          <w:rFonts w:ascii="Consolas" w:hAnsi="Consolas"/>
+        </w:rPr>
+        <w:t xml:space="preserve">            </w:t>
+      </w:r>
+      <w:r>
+        <w:rPr>
+          <w:rFonts w:ascii="Consolas" w:hAnsi="Consolas"/>
+        </w:rPr>
+        <w:t>plt.text(</w:t>
+      </w:r>
+    </w:p>
+    <w:p>
+      <w:pPr>
+        <w:pStyle w:val="Code"/>
+        <w:rPr>
+          <w:rFonts w:ascii="Consolas" w:hAnsi="Consolas"/>
+        </w:rPr>
+      </w:pPr>
+      <w:r>
+        <w:rPr>
+          <w:rFonts w:ascii="Consolas" w:hAnsi="Consolas"/>
+        </w:rPr>
+        <w:t xml:space="preserve">                </w:t>
+      </w:r>
+      <w:r>
+        <w:rPr>
+          <w:rFonts w:ascii="Consolas" w:hAnsi="Consolas"/>
+        </w:rPr>
+        <w:t>j,</w:t>
+      </w:r>
+    </w:p>
+    <w:p>
+      <w:pPr>
+        <w:pStyle w:val="Code"/>
+        <w:rPr>
+          <w:rFonts w:ascii="Consolas" w:hAnsi="Consolas"/>
+        </w:rPr>
+      </w:pPr>
+      <w:r>
+        <w:rPr>
+          <w:rFonts w:ascii="Consolas" w:hAnsi="Consolas"/>
+        </w:rPr>
+        <w:t xml:space="preserve">                </w:t>
+      </w:r>
+      <w:r>
+        <w:rPr>
+          <w:rFonts w:ascii="Consolas" w:hAnsi="Consolas"/>
+        </w:rPr>
+        <w:t>i,</w:t>
+      </w:r>
+    </w:p>
+    <w:p>
+      <w:pPr>
+        <w:pStyle w:val="Code"/>
+        <w:rPr>
+          <w:rFonts w:ascii="Consolas" w:hAnsi="Consolas"/>
+        </w:rPr>
+      </w:pPr>
+      <w:r>
+        <w:rPr>
+          <w:rFonts w:ascii="Consolas" w:hAnsi="Consolas"/>
+        </w:rPr>
+        <w:t xml:space="preserve">                </w:t>
+      </w:r>
+      <w:r>
+        <w:rPr>
+          <w:rFonts w:ascii="Consolas" w:hAnsi="Consolas"/>
+        </w:rPr>
+        <w:t>str(int(neuron_labels[i, j])),</w:t>
+      </w:r>
+    </w:p>
+    <w:p>
+      <w:pPr>
+        <w:pStyle w:val="Code"/>
+        <w:rPr>
+          <w:rFonts w:ascii="Consolas" w:hAnsi="Consolas"/>
+        </w:rPr>
+      </w:pPr>
+      <w:r>
+        <w:rPr>
+          <w:rFonts w:ascii="Consolas" w:hAnsi="Consolas"/>
+        </w:rPr>
+        <w:t xml:space="preserve">                </w:t>
+      </w:r>
+      <w:r>
+        <w:rPr>
+          <w:rFonts w:ascii="Consolas" w:hAnsi="Consolas"/>
+        </w:rPr>
+        <w:t>ha="center",</w:t>
+      </w:r>
+    </w:p>
+    <w:p>
+      <w:pPr>
+        <w:pStyle w:val="Code"/>
+        <w:rPr>
+          <w:rFonts w:ascii="Consolas" w:hAnsi="Consolas"/>
+        </w:rPr>
+      </w:pPr>
+      <w:r>
+        <w:rPr>
+          <w:rFonts w:ascii="Consolas" w:hAnsi="Consolas"/>
+        </w:rPr>
+        <w:t xml:space="preserve">                </w:t>
+      </w:r>
+      <w:r>
+        <w:rPr>
+          <w:rFonts w:ascii="Consolas" w:hAnsi="Consolas"/>
+        </w:rPr>
+        <w:t>va="center",</w:t>
+      </w:r>
+    </w:p>
+    <w:p>
+      <w:pPr>
+        <w:pStyle w:val="Code"/>
+        <w:rPr>
+          <w:rFonts w:ascii="Consolas" w:hAnsi="Consolas"/>
+        </w:rPr>
+      </w:pPr>
+      <w:r>
+        <w:rPr>
+          <w:rFonts w:ascii="Consolas" w:hAnsi="Consolas"/>
+        </w:rPr>
+        <w:t xml:space="preserve">                </w:t>
+      </w:r>
+      <w:r>
+        <w:rPr>
+          <w:rFonts w:ascii="Consolas" w:hAnsi="Consolas"/>
+        </w:rPr>
+        <w:t>color=color,</w:t>
+      </w:r>
+    </w:p>
+    <w:p>
+      <w:pPr>
+        <w:pStyle w:val="Code"/>
+        <w:rPr>
+          <w:rFonts w:ascii="Consolas" w:hAnsi="Consolas"/>
+        </w:rPr>
+      </w:pPr>
+      <w:r>
+        <w:rPr>
+          <w:rFonts w:ascii="Consolas" w:hAnsi="Consolas"/>
+        </w:rPr>
+        <w:t xml:space="preserve">                </w:t>
+      </w:r>
+      <w:r>
+        <w:rPr>
+          <w:rFonts w:ascii="Consolas" w:hAnsi="Consolas"/>
+        </w:rPr>
+        <w:t>fontsize=8,</w:t>
+      </w:r>
+    </w:p>
+    <w:p>
+      <w:pPr>
+        <w:pStyle w:val="Code"/>
+        <w:rPr>
+          <w:rFonts w:ascii="Consolas" w:hAnsi="Consolas"/>
+        </w:rPr>
+      </w:pPr>
+      <w:r>
+        <w:rPr>
+          <w:rFonts w:ascii="Consolas" w:hAnsi="Consolas"/>
+        </w:rPr>
+        <w:t xml:space="preserve">            </w:t>
+      </w:r>
+      <w:r>
+        <w:rPr>
+          <w:rFonts w:ascii="Consolas" w:hAnsi="Consolas"/>
+        </w:rPr>
+        <w:t>)</w:t>
+      </w:r>
+    </w:p>
+    <w:p>
+      <w:pPr>
+        <w:pStyle w:val="Code"/>
+        <w:rPr>
+          <w:rFonts w:ascii="Consolas" w:hAnsi="Consolas"/>
+        </w:rPr>
+      </w:pPr>
+      <w:r>
+        <w:rPr>
+          <w:rFonts w:ascii="Consolas" w:hAnsi="Consolas"/>
+        </w:rPr>
+        <w:t xml:space="preserve">        </w:t>
+      </w:r>
+      <w:r>
+        <w:rPr>
+          <w:rFonts w:ascii="Consolas" w:hAnsi="Consolas"/>
+        </w:rPr>
+        <w:t>else:</w:t>
+      </w:r>
+    </w:p>
+    <w:p>
+      <w:pPr>
+        <w:pStyle w:val="Code"/>
+        <w:rPr>
+          <w:rFonts w:ascii="Consolas" w:hAnsi="Consolas"/>
+        </w:rPr>
+      </w:pPr>
+      <w:r>
+        <w:rPr>
+          <w:rFonts w:ascii="Consolas" w:hAnsi="Consolas"/>
+        </w:rPr>
+        <w:t xml:space="preserve">            </w:t>
+      </w:r>
+      <w:r>
+        <w:rPr>
+          <w:rFonts w:ascii="Consolas" w:hAnsi="Consolas"/>
+        </w:rPr>
+        <w:t>plt.text(j, i, "?", ha="center", va="center", color="gray", fontsize=8)</w:t>
+      </w:r>
+    </w:p>
+    <w:p>
+      <w:pPr>
+        <w:pStyle w:val="Code"/>
+        <w:rPr>
+          <w:rFonts w:ascii="Consolas" w:hAnsi="Consolas"/>
+        </w:rPr>
+      </w:pPr>
+      <w:r>
+        <w:rPr>
+          <w:rFonts w:ascii="Consolas" w:hAnsi="Consolas"/>
+        </w:rPr>
+      </w:r>
+    </w:p>
+    <w:p>
+      <w:pPr>
+        <w:pStyle w:val="Code"/>
+        <w:rPr>
+          <w:rFonts w:ascii="Consolas" w:hAnsi="Consolas"/>
+        </w:rPr>
+      </w:pPr>
+      <w:r>
+        <w:rPr>
+          <w:rFonts w:ascii="Consolas" w:hAnsi="Consolas"/>
+        </w:rPr>
+        <w:t>plt.show()</w:t>
+      </w:r>
+    </w:p>
+    <w:p>
+      <w:pPr>
+        <w:pStyle w:val="Code"/>
+        <w:rPr>
+          <w:rFonts w:ascii="Consolas" w:hAnsi="Consolas"/>
+        </w:rPr>
+      </w:pPr>
+      <w:r>
+        <w:rPr>
+          <w:rFonts w:ascii="Consolas" w:hAnsi="Consolas"/>
+        </w:rPr>
+      </w:r>
+    </w:p>
+    <w:p>
+      <w:pPr>
+        <w:pStyle w:val="Code"/>
+        <w:rPr>
+          <w:rFonts w:ascii="Consolas" w:hAnsi="Consolas"/>
+        </w:rPr>
+      </w:pPr>
+      <w:r>
+        <w:rPr>
+          <w:rFonts w:ascii="Consolas" w:hAnsi="Consolas"/>
+        </w:rPr>
+        <w:t>"""</w:t>
+      </w:r>
+    </w:p>
+    <w:p>
+      <w:pPr>
+        <w:pStyle w:val="Code"/>
+        <w:rPr>
+          <w:rFonts w:ascii="Consolas" w:hAnsi="Consolas"/>
+        </w:rPr>
+      </w:pPr>
+      <w:r>
+        <w:rPr>
+          <w:rFonts w:ascii="Consolas" w:hAnsi="Consolas"/>
+        </w:rPr>
+        <w:t>Червоні зі знаком питання на графіку це нейрони, які жодного разу не стали переможцями.</w:t>
+      </w:r>
+    </w:p>
+    <w:p>
+      <w:pPr>
+        <w:pStyle w:val="Code"/>
+        <w:rPr>
+          <w:rFonts w:ascii="Consolas" w:hAnsi="Consolas"/>
+        </w:rPr>
+      </w:pPr>
+      <w:r>
+        <w:rPr>
+          <w:rFonts w:ascii="Consolas" w:hAnsi="Consolas"/>
+        </w:rPr>
+        <w:t>"""</w:t>
+      </w:r>
+    </w:p>
+    <w:p>
+      <w:pPr>
+        <w:pStyle w:val="p11"/>
+        <w:rPr>
+          <w:lang w:val="uk-UA"/>
+        </w:rPr>
+      </w:pPr>
+      <w:r>
+        <w:rPr>
+          <w:lang w:val="uk-UA"/>
+        </w:rPr>
+      </w:r>
+    </w:p>
+    <w:p>
+      <w:pPr>
+        <w:pStyle w:val="H3"/>
+        <w:rPr/>
+      </w:pPr>
+      <w:r>
+        <w:rPr/>
+        <w:t>Результати на графіку</w:t>
+      </w:r>
+    </w:p>
+    <w:p>
+      <w:pPr>
+        <w:pStyle w:val="p11"/>
+        <w:rPr>
+          <w:lang w:val="uk-UA"/>
+        </w:rPr>
+      </w:pPr>
+      <w:r>
+        <w:rPr>
+          <w:lang w:val="uk-UA"/>
+        </w:rPr>
+      </w:r>
+    </w:p>
+    <w:p>
+      <w:pPr>
+        <w:pStyle w:val="img1"/>
+        <w:rPr/>
+      </w:pPr>
+      <w:r>
+        <w:rPr/>
+        <w:drawing>
+          <wp:inline distT="0" distB="0" distL="0" distR="0">
+            <wp:extent cx="5731510" cy="4584700"/>
+            <wp:effectExtent l="0" t="0" r="0" b="0"/>
+            <wp:docPr id="1" name="Зображення1"/>
+            <wp:cNvGraphicFramePr>
+              <a:graphicFrameLocks xmlns:a="http://schemas.openxmlformats.org/drawingml/2006/main" noChangeAspect="1"/>
+            </wp:cNvGraphicFramePr>
+            <a:graphic xmlns:a="http://schemas.openxmlformats.org/drawingml/2006/main">
+              <a:graphicData uri="http://schemas.openxmlformats.org/drawingml/2006/picture">
+                <pic:pic xmlns:pic="http://schemas.openxmlformats.org/drawingml/2006/picture">
+                  <pic:nvPicPr>
+                    <pic:cNvPr id="1" name="Зображення1"/>
+                    <pic:cNvPicPr>
+                      <a:picLocks noChangeAspect="1" noChangeArrowheads="1"/>
+                    </pic:cNvPicPr>
+                  </pic:nvPicPr>
+                  <pic:blipFill>
+                    <a:blip r:embed="rId2"/>
+                    <a:stretch>
+                      <a:fillRect/>
+                    </a:stretch>
+                  </pic:blipFill>
+                  <pic:spPr bwMode="auto">
+                    <a:xfrm>
+                      <a:off x="0" y="0"/>
+                      <a:ext cx="5731510" cy="4584700"/>
+                    </a:xfrm>
+                    <a:prstGeom prst="rect">
+                      <a:avLst/>
+                    </a:prstGeom>
+                    <a:noFill/>
+                  </pic:spPr>
+                </pic:pic>
+              </a:graphicData>
+            </a:graphic>
+          </wp:inline>
+        </w:drawing>
+      </w:r>
+    </w:p>
+    <w:p>
+      <w:pPr>
+        <w:pStyle w:val="img1"/>
+        <w:rPr/>
+      </w:pPr>
+      <w:r>
+        <w:rPr/>
+        <w:t>Рисунок 1.1 — Результати виконання</w:t>
+      </w:r>
+    </w:p>
+    <w:p>
+      <w:pPr>
+        <w:pStyle w:val="p11"/>
+        <w:rPr>
+          <w:lang w:val="uk-UA"/>
+        </w:rPr>
+      </w:pPr>
+      <w:r>
+        <w:rPr>
+          <w:lang w:val="uk-UA"/>
+        </w:rPr>
+      </w:r>
+    </w:p>
+    <w:p>
+      <w:pPr>
+        <w:pStyle w:val="H3"/>
+        <w:rPr/>
+      </w:pPr>
+      <w:r>
+        <w:rPr/>
+        <w:t>Результати в консолі</w:t>
+      </w:r>
+    </w:p>
+    <w:p>
+      <w:pPr>
+        <w:pStyle w:val="p11"/>
+        <w:rPr>
+          <w:lang w:val="uk-UA"/>
+        </w:rPr>
+      </w:pPr>
+      <w:r>
+        <w:rPr>
+          <w:lang w:val="uk-UA"/>
+        </w:rPr>
+      </w:r>
+    </w:p>
+    <w:p>
+      <w:pPr>
+        <w:pStyle w:val="Code"/>
+        <w:rPr/>
+      </w:pPr>
+      <w:r>
+        <w:rPr/>
+        <w:t>Карта міток нейронів (8×8):</w:t>
+      </w:r>
+    </w:p>
+    <w:p>
+      <w:pPr>
+        <w:pStyle w:val="Code"/>
+        <w:rPr/>
+      </w:pPr>
+      <w:r>
+        <w:rPr/>
+        <w:t>[[ 0  1  0  0  0  0  0  0]</w:t>
+      </w:r>
+    </w:p>
+    <w:p>
+      <w:pPr>
+        <w:pStyle w:val="Code"/>
+        <w:rPr/>
+      </w:pPr>
+      <w:r>
+        <w:rPr/>
+        <w:t xml:space="preserve"> </w:t>
+      </w:r>
+      <w:r>
+        <w:rPr/>
+        <w:t>[ 1  0  1  1  0  1 -1  1]</w:t>
+      </w:r>
+    </w:p>
+    <w:p>
+      <w:pPr>
+        <w:pStyle w:val="Code"/>
+        <w:rPr/>
+      </w:pPr>
+      <w:r>
+        <w:rPr/>
+        <w:t xml:space="preserve"> </w:t>
+      </w:r>
+      <w:r>
+        <w:rPr/>
+        <w:t>[ 1 -1  1  0 -1  0 -1  1]</w:t>
+      </w:r>
+    </w:p>
+    <w:p>
+      <w:pPr>
+        <w:pStyle w:val="Code"/>
+        <w:rPr/>
+      </w:pPr>
+      <w:r>
+        <w:rPr/>
+        <w:t xml:space="preserve"> </w:t>
+      </w:r>
+      <w:r>
+        <w:rPr/>
+        <w:t>[ 1  0  0  0 -1  1  1  1]</w:t>
+      </w:r>
+    </w:p>
+    <w:p>
+      <w:pPr>
+        <w:pStyle w:val="Code"/>
+        <w:rPr/>
+      </w:pPr>
+      <w:r>
+        <w:rPr/>
+        <w:t xml:space="preserve"> </w:t>
+      </w:r>
+      <w:r>
+        <w:rPr/>
+        <w:t>[ 1 -1  0  1  0 -1  1  0]</w:t>
+      </w:r>
+    </w:p>
+    <w:p>
+      <w:pPr>
+        <w:pStyle w:val="Code"/>
+        <w:rPr/>
+      </w:pPr>
+      <w:r>
+        <w:rPr/>
+        <w:t xml:space="preserve"> </w:t>
+      </w:r>
+      <w:r>
+        <w:rPr/>
+        <w:t>[ 0  0  0 -1  0  0 -1 -1]</w:t>
+      </w:r>
+    </w:p>
+    <w:p>
+      <w:pPr>
+        <w:pStyle w:val="Code"/>
+        <w:rPr/>
+      </w:pPr>
+      <w:r>
+        <w:rPr/>
+        <w:t xml:space="preserve"> </w:t>
+      </w:r>
+      <w:r>
+        <w:rPr/>
+        <w:t>[-1  1 -1  1  1  0 -1  1]</w:t>
+      </w:r>
+    </w:p>
+    <w:p>
+      <w:pPr>
+        <w:pStyle w:val="Code"/>
+        <w:rPr/>
+      </w:pPr>
+      <w:r>
+        <w:rPr/>
+        <w:t xml:space="preserve"> </w:t>
+      </w:r>
+      <w:r>
+        <w:rPr/>
+        <w:t>[ 1  0 -1 -1 -1  1 -1 -1]]</w:t>
+      </w:r>
+    </w:p>
+    <w:p>
+      <w:pPr>
+        <w:pStyle w:val="Code"/>
+        <w:rPr/>
+      </w:pPr>
+      <w:r>
+        <w:rPr/>
+      </w:r>
+    </w:p>
+    <w:p>
+      <w:pPr>
+        <w:pStyle w:val="Code"/>
+        <w:rPr/>
+      </w:pPr>
+      <w:r>
+        <w:rPr/>
+        <w:t>Точність на тренувальних даних: 74.00%</w:t>
+      </w:r>
+    </w:p>
+    <w:p>
+      <w:pPr>
+        <w:pStyle w:val="Code"/>
+        <w:rPr/>
+      </w:pPr>
+      <w:r>
+        <w:rPr/>
+        <w:t>Точність на тестових даних: 47.75%</w:t>
+      </w:r>
+    </w:p>
+    <w:p>
+      <w:pPr>
+        <w:pStyle w:val="p11"/>
+        <w:rPr>
+          <w:lang w:val="uk-UA"/>
+        </w:rPr>
+      </w:pPr>
+      <w:r>
+        <w:rPr>
+          <w:lang w:val="uk-UA"/>
+        </w:rPr>
+      </w:r>
+    </w:p>
+    <w:p>
+      <w:pPr>
+        <w:pStyle w:val="p11"/>
+        <w:rPr>
+          <w:lang w:val="uk-UA"/>
+        </w:rPr>
+      </w:pPr>
+      <w:r>
+        <w:rPr>
+          <w:lang w:val="uk-UA"/>
+        </w:rPr>
+        <w:t>Порівняння результатів</w:t>
+      </w:r>
+    </w:p>
+    <w:p>
+      <w:pPr>
+        <w:pStyle w:val="p11"/>
+        <w:rPr>
+          <w:lang w:val="uk-UA"/>
+        </w:rPr>
+      </w:pPr>
+      <w:r>
+        <w:rPr>
+          <w:lang w:val="uk-UA"/>
+        </w:rPr>
+      </w:r>
+    </w:p>
+    <w:p>
+      <w:pPr>
+        <w:pStyle w:val="p11"/>
+        <w:rPr>
+          <w:lang w:val="uk-UA"/>
+        </w:rPr>
+      </w:pPr>
+      <w:r>
+        <w:rPr>
+          <w:lang w:val="uk-UA"/>
+        </w:rPr>
+        <w:t>Під час виконання було проведено кілька експериментів з різними вхідними даними. Деталі нижче:</w:t>
+      </w:r>
+    </w:p>
+    <w:p>
+      <w:pPr>
+        <w:pStyle w:val="p11"/>
+        <w:rPr>
+          <w:lang w:val="uk-UA"/>
+        </w:rPr>
+      </w:pPr>
+      <w:r>
+        <w:rPr>
+          <w:lang w:val="uk-UA"/>
+        </w:rPr>
+      </w:r>
+    </w:p>
+    <w:tbl>
+      <w:tblPr>
+        <w:tblW w:w="5000" w:type="pct"/>
+        <w:jc w:val="left"/>
+        <w:tblInd w:w="55" w:type="dxa"/>
+        <w:tblLayout w:type="fixed"/>
+        <w:tblCellMar>
+          <w:top w:w="55" w:type="dxa"/>
+          <w:left w:w="55" w:type="dxa"/>
+          <w:bottom w:w="55" w:type="dxa"/>
+          <w:right w:w="55" w:type="dxa"/>
+        </w:tblCellMar>
+      </w:tblPr>
+      <w:tblGrid>
+        <w:gridCol w:w="1565"/>
+        <w:gridCol w:w="2046"/>
+        <w:gridCol w:w="1805"/>
+        <w:gridCol w:w="1805"/>
+        <w:gridCol w:w="1805"/>
+      </w:tblGrid>
+      <w:tr>
+        <w:trPr/>
+        <w:tc>
+          <w:tcPr>
+            <w:tcW w:w="1565" w:type="dxa"/>
+            <w:tcBorders>
+              <w:top w:val="single" w:sz="4" w:space="0" w:color="000000"/>
+              <w:left w:val="single" w:sz="4" w:space="0" w:color="000000"/>
+              <w:bottom w:val="single" w:sz="4" w:space="0" w:color="000000"/>
+            </w:tcBorders>
+          </w:tcPr>
+          <w:p>
+            <w:pPr>
+              <w:pStyle w:val="Style14"/>
+              <w:ind w:hanging="0" w:left="0"/>
+              <w:rPr>
+                <w:b/>
+                <w:bCs/>
+                <w:sz w:val="24"/>
+                <w:szCs w:val="24"/>
+              </w:rPr>
+            </w:pPr>
+            <w:r>
+              <w:rPr>
+                <w:b/>
+                <w:bCs/>
+                <w:sz w:val="24"/>
+                <w:szCs w:val="24"/>
+              </w:rPr>
+              <w:t>Розмір карти</w:t>
+            </w:r>
+          </w:p>
+        </w:tc>
+        <w:tc>
+          <w:tcPr>
+            <w:tcW w:w="2046" w:type="dxa"/>
+            <w:tcBorders>
+              <w:top w:val="single" w:sz="4" w:space="0" w:color="000000"/>
+              <w:left w:val="single" w:sz="4" w:space="0" w:color="000000"/>
+              <w:bottom w:val="single" w:sz="4" w:space="0" w:color="000000"/>
+            </w:tcBorders>
+          </w:tcPr>
+          <w:p>
+            <w:pPr>
+              <w:pStyle w:val="Style14"/>
+              <w:ind w:hanging="0" w:left="0"/>
+              <w:rPr>
+                <w:b/>
+                <w:bCs/>
+                <w:sz w:val="24"/>
+                <w:szCs w:val="24"/>
+              </w:rPr>
+            </w:pPr>
+            <w:r>
+              <w:rPr>
+                <w:b/>
+                <w:bCs/>
+                <w:sz w:val="24"/>
+                <w:szCs w:val="24"/>
+              </w:rPr>
+              <w:t>Кількість зразків у вибірці</w:t>
+            </w:r>
+          </w:p>
+        </w:tc>
+        <w:tc>
+          <w:tcPr>
+            <w:tcW w:w="1805" w:type="dxa"/>
+            <w:tcBorders>
+              <w:top w:val="single" w:sz="4" w:space="0" w:color="000000"/>
+              <w:left w:val="single" w:sz="4" w:space="0" w:color="000000"/>
+              <w:bottom w:val="single" w:sz="4" w:space="0" w:color="000000"/>
+            </w:tcBorders>
+          </w:tcPr>
+          <w:p>
+            <w:pPr>
+              <w:pStyle w:val="Style14"/>
+              <w:ind w:hanging="0" w:left="0"/>
+              <w:rPr>
+                <w:b/>
+                <w:bCs/>
+                <w:sz w:val="24"/>
+                <w:szCs w:val="24"/>
+              </w:rPr>
+            </w:pPr>
+            <w:r>
+              <w:rPr>
+                <w:b/>
+                <w:bCs/>
+                <w:sz w:val="24"/>
+                <w:szCs w:val="24"/>
+              </w:rPr>
+              <w:t>Розбиття вибірки на тестову та навчальну</w:t>
+            </w:r>
+          </w:p>
+        </w:tc>
+        <w:tc>
+          <w:tcPr>
+            <w:tcW w:w="1805" w:type="dxa"/>
+            <w:tcBorders>
+              <w:top w:val="single" w:sz="4" w:space="0" w:color="000000"/>
+              <w:left w:val="single" w:sz="4" w:space="0" w:color="000000"/>
+              <w:bottom w:val="single" w:sz="4" w:space="0" w:color="000000"/>
+            </w:tcBorders>
+          </w:tcPr>
+          <w:p>
+            <w:pPr>
+              <w:pStyle w:val="Style14"/>
+              <w:ind w:hanging="0" w:left="0"/>
+              <w:rPr>
+                <w:b/>
+                <w:bCs/>
+                <w:sz w:val="24"/>
+                <w:szCs w:val="24"/>
+              </w:rPr>
+            </w:pPr>
+            <w:r>
+              <w:rPr>
+                <w:b/>
+                <w:bCs/>
+                <w:sz w:val="24"/>
+                <w:szCs w:val="24"/>
+              </w:rPr>
+              <w:t xml:space="preserve">Точність на тренувальних даних, </w:t>
+            </w:r>
+            <w:r>
+              <w:rPr>
+                <w:b/>
+                <w:bCs/>
+                <w:sz w:val="24"/>
+                <w:szCs w:val="24"/>
+                <w:lang w:val="en-US"/>
+              </w:rPr>
+              <w:t>%</w:t>
+            </w:r>
+          </w:p>
+        </w:tc>
+        <w:tc>
+          <w:tcPr>
+            <w:tcW w:w="1805" w:type="dxa"/>
+            <w:tcBorders>
+              <w:top w:val="single" w:sz="4" w:space="0" w:color="000000"/>
+              <w:left w:val="single" w:sz="4" w:space="0" w:color="000000"/>
+              <w:bottom w:val="single" w:sz="4" w:space="0" w:color="000000"/>
+              <w:right w:val="single" w:sz="4" w:space="0" w:color="000000"/>
+            </w:tcBorders>
+          </w:tcPr>
+          <w:p>
+            <w:pPr>
+              <w:pStyle w:val="Style14"/>
+              <w:ind w:hanging="0" w:left="0"/>
+              <w:rPr>
+                <w:b/>
+                <w:bCs/>
+                <w:sz w:val="24"/>
+                <w:szCs w:val="24"/>
+              </w:rPr>
+            </w:pPr>
+            <w:r>
+              <w:rPr>
+                <w:b/>
+                <w:bCs/>
+                <w:sz w:val="24"/>
+                <w:szCs w:val="24"/>
+              </w:rPr>
+              <w:t>Точність на тестових даних, %</w:t>
+            </w:r>
+          </w:p>
+        </w:tc>
+      </w:tr>
+      <w:tr>
+        <w:trPr/>
+        <w:tc>
+          <w:tcPr>
+            <w:tcW w:w="1565" w:type="dxa"/>
+            <w:tcBorders>
+              <w:left w:val="single" w:sz="4" w:space="0" w:color="000000"/>
+              <w:bottom w:val="single" w:sz="4" w:space="0" w:color="000000"/>
+            </w:tcBorders>
+          </w:tcPr>
+          <w:p>
+            <w:pPr>
+              <w:pStyle w:val="Style14"/>
+              <w:ind w:hanging="0" w:left="0"/>
+              <w:rPr>
+                <w:sz w:val="24"/>
+                <w:szCs w:val="24"/>
+              </w:rPr>
+            </w:pPr>
+            <w:r>
+              <w:rPr>
+                <w:sz w:val="24"/>
+                <w:szCs w:val="24"/>
+              </w:rPr>
+              <w:t>4 на 4</w:t>
+            </w:r>
+          </w:p>
+        </w:tc>
+        <w:tc>
+          <w:tcPr>
+            <w:tcW w:w="2046" w:type="dxa"/>
+            <w:tcBorders>
+              <w:left w:val="single" w:sz="4" w:space="0" w:color="000000"/>
+              <w:bottom w:val="single" w:sz="4" w:space="0" w:color="000000"/>
+            </w:tcBorders>
+          </w:tcPr>
+          <w:p>
+            <w:pPr>
+              <w:pStyle w:val="Style14"/>
+              <w:ind w:hanging="0" w:left="0"/>
+              <w:rPr>
+                <w:sz w:val="24"/>
+                <w:szCs w:val="24"/>
+              </w:rPr>
+            </w:pPr>
+            <w:r>
+              <w:rPr>
+                <w:sz w:val="24"/>
+                <w:szCs w:val="24"/>
+              </w:rPr>
+              <w:t>500</w:t>
+            </w:r>
+          </w:p>
+        </w:tc>
+        <w:tc>
+          <w:tcPr>
+            <w:tcW w:w="1805" w:type="dxa"/>
+            <w:tcBorders>
+              <w:left w:val="single" w:sz="4" w:space="0" w:color="000000"/>
+              <w:bottom w:val="single" w:sz="4" w:space="0" w:color="000000"/>
+            </w:tcBorders>
+          </w:tcPr>
+          <w:p>
+            <w:pPr>
+              <w:pStyle w:val="Style14"/>
+              <w:ind w:hanging="0" w:left="0"/>
+              <w:rPr>
+                <w:sz w:val="24"/>
+                <w:szCs w:val="24"/>
+              </w:rPr>
+            </w:pPr>
+            <w:r>
+              <w:rPr>
+                <w:sz w:val="24"/>
+                <w:szCs w:val="24"/>
+              </w:rPr>
+              <w:t>80 на 20</w:t>
+            </w:r>
+          </w:p>
+        </w:tc>
+        <w:tc>
+          <w:tcPr>
+            <w:tcW w:w="1805" w:type="dxa"/>
+            <w:tcBorders>
+              <w:left w:val="single" w:sz="4" w:space="0" w:color="000000"/>
+              <w:bottom w:val="single" w:sz="4" w:space="0" w:color="000000"/>
+            </w:tcBorders>
+          </w:tcPr>
+          <w:p>
+            <w:pPr>
+              <w:pStyle w:val="Style14"/>
+              <w:ind w:hanging="0" w:left="0"/>
+              <w:rPr>
+                <w:sz w:val="24"/>
+                <w:szCs w:val="24"/>
+              </w:rPr>
+            </w:pPr>
+            <w:r>
+              <w:rPr>
+                <w:sz w:val="24"/>
+                <w:szCs w:val="24"/>
+              </w:rPr>
+              <w:t>65</w:t>
+            </w:r>
+          </w:p>
+        </w:tc>
+        <w:tc>
+          <w:tcPr>
+            <w:tcW w:w="1805" w:type="dxa"/>
+            <w:tcBorders>
+              <w:left w:val="single" w:sz="4" w:space="0" w:color="000000"/>
+              <w:bottom w:val="single" w:sz="4" w:space="0" w:color="000000"/>
+              <w:right w:val="single" w:sz="4" w:space="0" w:color="000000"/>
+            </w:tcBorders>
+          </w:tcPr>
+          <w:p>
+            <w:pPr>
+              <w:pStyle w:val="Style14"/>
+              <w:ind w:hanging="0" w:left="0"/>
+              <w:rPr>
+                <w:sz w:val="24"/>
+                <w:szCs w:val="24"/>
+              </w:rPr>
+            </w:pPr>
+            <w:r>
+              <w:rPr>
+                <w:sz w:val="24"/>
+                <w:szCs w:val="24"/>
+              </w:rPr>
+              <w:t>51.75</w:t>
+            </w:r>
+          </w:p>
+        </w:tc>
+      </w:tr>
+      <w:tr>
+        <w:trPr/>
+        <w:tc>
+          <w:tcPr>
+            <w:tcW w:w="1565" w:type="dxa"/>
+            <w:tcBorders>
+              <w:left w:val="single" w:sz="4" w:space="0" w:color="000000"/>
+              <w:bottom w:val="single" w:sz="4" w:space="0" w:color="000000"/>
+            </w:tcBorders>
+          </w:tcPr>
+          <w:p>
+            <w:pPr>
+              <w:pStyle w:val="Style14"/>
+              <w:ind w:hanging="0" w:left="0"/>
+              <w:rPr>
+                <w:sz w:val="24"/>
+                <w:szCs w:val="24"/>
+                <w:lang w:val="en-US"/>
+              </w:rPr>
+            </w:pPr>
+            <w:r>
+              <w:rPr>
+                <w:sz w:val="24"/>
+                <w:szCs w:val="24"/>
+                <w:lang w:val="en-US"/>
+              </w:rPr>
+              <w:t xml:space="preserve">5 </w:t>
+            </w:r>
+            <w:r>
+              <w:rPr>
+                <w:sz w:val="24"/>
+                <w:szCs w:val="24"/>
+                <w:lang w:val="uk-UA"/>
+              </w:rPr>
+              <w:t>на 5</w:t>
+            </w:r>
+          </w:p>
+        </w:tc>
+        <w:tc>
+          <w:tcPr>
+            <w:tcW w:w="2046" w:type="dxa"/>
+            <w:tcBorders>
+              <w:left w:val="single" w:sz="4" w:space="0" w:color="000000"/>
+              <w:bottom w:val="single" w:sz="4" w:space="0" w:color="000000"/>
+            </w:tcBorders>
+          </w:tcPr>
+          <w:p>
+            <w:pPr>
+              <w:pStyle w:val="Style14"/>
+              <w:ind w:hanging="0" w:left="0"/>
+              <w:rPr>
+                <w:sz w:val="24"/>
+                <w:szCs w:val="24"/>
+              </w:rPr>
+            </w:pPr>
+            <w:r>
+              <w:rPr>
+                <w:sz w:val="24"/>
+                <w:szCs w:val="24"/>
+              </w:rPr>
+              <w:t>500</w:t>
+            </w:r>
+          </w:p>
+        </w:tc>
+        <w:tc>
+          <w:tcPr>
+            <w:tcW w:w="1805" w:type="dxa"/>
+            <w:tcBorders>
+              <w:left w:val="single" w:sz="4" w:space="0" w:color="000000"/>
+              <w:bottom w:val="single" w:sz="4" w:space="0" w:color="000000"/>
+            </w:tcBorders>
+          </w:tcPr>
+          <w:p>
+            <w:pPr>
+              <w:pStyle w:val="Style14"/>
+              <w:ind w:hanging="0" w:left="0"/>
+              <w:rPr>
+                <w:sz w:val="24"/>
+                <w:szCs w:val="24"/>
+              </w:rPr>
+            </w:pPr>
+            <w:r>
+              <w:rPr>
+                <w:sz w:val="24"/>
+                <w:szCs w:val="24"/>
+              </w:rPr>
+              <w:t>80 на 20</w:t>
+            </w:r>
+          </w:p>
+        </w:tc>
+        <w:tc>
+          <w:tcPr>
+            <w:tcW w:w="1805" w:type="dxa"/>
+            <w:tcBorders>
+              <w:left w:val="single" w:sz="4" w:space="0" w:color="000000"/>
+              <w:bottom w:val="single" w:sz="4" w:space="0" w:color="000000"/>
+            </w:tcBorders>
+          </w:tcPr>
+          <w:p>
+            <w:pPr>
+              <w:pStyle w:val="Style14"/>
+              <w:ind w:hanging="0" w:left="0"/>
+              <w:rPr>
+                <w:sz w:val="24"/>
+                <w:szCs w:val="24"/>
+              </w:rPr>
+            </w:pPr>
+            <w:r>
+              <w:rPr>
+                <w:sz w:val="24"/>
+                <w:szCs w:val="24"/>
+              </w:rPr>
+              <w:t>66</w:t>
+            </w:r>
+          </w:p>
+        </w:tc>
+        <w:tc>
+          <w:tcPr>
+            <w:tcW w:w="1805" w:type="dxa"/>
+            <w:tcBorders>
+              <w:left w:val="single" w:sz="4" w:space="0" w:color="000000"/>
+              <w:bottom w:val="single" w:sz="4" w:space="0" w:color="000000"/>
+              <w:right w:val="single" w:sz="4" w:space="0" w:color="000000"/>
+            </w:tcBorders>
+          </w:tcPr>
+          <w:p>
+            <w:pPr>
+              <w:pStyle w:val="Style14"/>
+              <w:ind w:hanging="0" w:left="0"/>
+              <w:rPr>
+                <w:sz w:val="24"/>
+                <w:szCs w:val="24"/>
+              </w:rPr>
+            </w:pPr>
+            <w:r>
+              <w:rPr>
+                <w:sz w:val="24"/>
+                <w:szCs w:val="24"/>
+              </w:rPr>
+              <w:t>46.50</w:t>
+            </w:r>
+          </w:p>
+        </w:tc>
+      </w:tr>
+      <w:tr>
+        <w:trPr/>
+        <w:tc>
+          <w:tcPr>
+            <w:tcW w:w="1565" w:type="dxa"/>
+            <w:tcBorders>
+              <w:left w:val="single" w:sz="4" w:space="0" w:color="000000"/>
+              <w:bottom w:val="single" w:sz="4" w:space="0" w:color="000000"/>
+            </w:tcBorders>
+          </w:tcPr>
+          <w:p>
+            <w:pPr>
+              <w:pStyle w:val="Style14"/>
+              <w:ind w:hanging="0" w:left="0"/>
+              <w:rPr>
+                <w:sz w:val="24"/>
+                <w:szCs w:val="24"/>
+                <w:lang w:val="uk-UA"/>
+              </w:rPr>
+            </w:pPr>
+            <w:r>
+              <w:rPr>
+                <w:sz w:val="24"/>
+                <w:szCs w:val="24"/>
+                <w:lang w:val="uk-UA"/>
+              </w:rPr>
+              <w:t>6 на 6</w:t>
+            </w:r>
+          </w:p>
+        </w:tc>
+        <w:tc>
+          <w:tcPr>
+            <w:tcW w:w="2046" w:type="dxa"/>
+            <w:tcBorders>
+              <w:left w:val="single" w:sz="4" w:space="0" w:color="000000"/>
+              <w:bottom w:val="single" w:sz="4" w:space="0" w:color="000000"/>
+            </w:tcBorders>
+          </w:tcPr>
+          <w:p>
+            <w:pPr>
+              <w:pStyle w:val="Style14"/>
+              <w:ind w:hanging="0" w:left="0"/>
+              <w:rPr>
+                <w:sz w:val="24"/>
+                <w:szCs w:val="24"/>
+              </w:rPr>
+            </w:pPr>
+            <w:r>
+              <w:rPr>
+                <w:sz w:val="24"/>
+                <w:szCs w:val="24"/>
+              </w:rPr>
+              <w:t>500</w:t>
+            </w:r>
+          </w:p>
+        </w:tc>
+        <w:tc>
+          <w:tcPr>
+            <w:tcW w:w="1805" w:type="dxa"/>
+            <w:tcBorders>
+              <w:left w:val="single" w:sz="4" w:space="0" w:color="000000"/>
+              <w:bottom w:val="single" w:sz="4" w:space="0" w:color="000000"/>
+            </w:tcBorders>
+          </w:tcPr>
+          <w:p>
+            <w:pPr>
+              <w:pStyle w:val="Style14"/>
+              <w:ind w:hanging="0" w:left="0"/>
+              <w:rPr>
+                <w:sz w:val="24"/>
+                <w:szCs w:val="24"/>
+              </w:rPr>
+            </w:pPr>
+            <w:r>
+              <w:rPr>
+                <w:sz w:val="24"/>
+                <w:szCs w:val="24"/>
+              </w:rPr>
+              <w:t>80 на 20</w:t>
+            </w:r>
+          </w:p>
+        </w:tc>
+        <w:tc>
+          <w:tcPr>
+            <w:tcW w:w="1805" w:type="dxa"/>
+            <w:tcBorders>
+              <w:left w:val="single" w:sz="4" w:space="0" w:color="000000"/>
+              <w:bottom w:val="single" w:sz="4" w:space="0" w:color="000000"/>
+            </w:tcBorders>
+          </w:tcPr>
+          <w:p>
+            <w:pPr>
+              <w:pStyle w:val="Style14"/>
+              <w:ind w:hanging="0" w:left="0"/>
+              <w:rPr>
+                <w:sz w:val="24"/>
+                <w:szCs w:val="24"/>
+              </w:rPr>
+            </w:pPr>
+            <w:r>
+              <w:rPr>
+                <w:sz w:val="24"/>
+                <w:szCs w:val="24"/>
+              </w:rPr>
+              <w:t>73</w:t>
+            </w:r>
+          </w:p>
+        </w:tc>
+        <w:tc>
+          <w:tcPr>
+            <w:tcW w:w="1805" w:type="dxa"/>
+            <w:tcBorders>
+              <w:left w:val="single" w:sz="4" w:space="0" w:color="000000"/>
+              <w:bottom w:val="single" w:sz="4" w:space="0" w:color="000000"/>
+              <w:right w:val="single" w:sz="4" w:space="0" w:color="000000"/>
+            </w:tcBorders>
+          </w:tcPr>
+          <w:p>
+            <w:pPr>
+              <w:pStyle w:val="Style14"/>
+              <w:ind w:hanging="0" w:left="0"/>
+              <w:rPr>
+                <w:sz w:val="24"/>
+                <w:szCs w:val="24"/>
+              </w:rPr>
+            </w:pPr>
+            <w:r>
+              <w:rPr>
+                <w:sz w:val="24"/>
+                <w:szCs w:val="24"/>
+              </w:rPr>
+              <w:t>48.25</w:t>
+            </w:r>
+          </w:p>
+        </w:tc>
+      </w:tr>
+      <w:tr>
+        <w:trPr/>
+        <w:tc>
+          <w:tcPr>
+            <w:tcW w:w="1565" w:type="dxa"/>
+            <w:tcBorders>
+              <w:left w:val="single" w:sz="4" w:space="0" w:color="000000"/>
+              <w:bottom w:val="single" w:sz="4" w:space="0" w:color="000000"/>
+            </w:tcBorders>
+          </w:tcPr>
+          <w:p>
+            <w:pPr>
+              <w:pStyle w:val="Style14"/>
+              <w:ind w:hanging="0" w:left="0"/>
+              <w:rPr>
+                <w:sz w:val="24"/>
+                <w:szCs w:val="24"/>
+                <w:lang w:val="uk-UA"/>
+              </w:rPr>
+            </w:pPr>
+            <w:r>
+              <w:rPr>
+                <w:sz w:val="24"/>
+                <w:szCs w:val="24"/>
+                <w:lang w:val="uk-UA"/>
+              </w:rPr>
+              <w:t>7 на 7</w:t>
+            </w:r>
+          </w:p>
+        </w:tc>
+        <w:tc>
+          <w:tcPr>
+            <w:tcW w:w="2046" w:type="dxa"/>
+            <w:tcBorders>
+              <w:left w:val="single" w:sz="4" w:space="0" w:color="000000"/>
+              <w:bottom w:val="single" w:sz="4" w:space="0" w:color="000000"/>
+            </w:tcBorders>
+          </w:tcPr>
+          <w:p>
+            <w:pPr>
+              <w:pStyle w:val="Style14"/>
+              <w:ind w:hanging="0" w:left="0"/>
+              <w:rPr>
+                <w:sz w:val="24"/>
+                <w:szCs w:val="24"/>
+              </w:rPr>
+            </w:pPr>
+            <w:r>
+              <w:rPr>
+                <w:sz w:val="24"/>
+                <w:szCs w:val="24"/>
+              </w:rPr>
+              <w:t>500</w:t>
+            </w:r>
+          </w:p>
+        </w:tc>
+        <w:tc>
+          <w:tcPr>
+            <w:tcW w:w="1805" w:type="dxa"/>
+            <w:tcBorders>
+              <w:left w:val="single" w:sz="4" w:space="0" w:color="000000"/>
+              <w:bottom w:val="single" w:sz="4" w:space="0" w:color="000000"/>
+            </w:tcBorders>
+          </w:tcPr>
+          <w:p>
+            <w:pPr>
+              <w:pStyle w:val="Style14"/>
+              <w:ind w:hanging="0" w:left="0"/>
+              <w:rPr>
+                <w:sz w:val="24"/>
+                <w:szCs w:val="24"/>
+              </w:rPr>
+            </w:pPr>
+            <w:r>
+              <w:rPr>
+                <w:sz w:val="24"/>
+                <w:szCs w:val="24"/>
+              </w:rPr>
+              <w:t>80 на 20</w:t>
+            </w:r>
+          </w:p>
+        </w:tc>
+        <w:tc>
+          <w:tcPr>
+            <w:tcW w:w="1805" w:type="dxa"/>
+            <w:tcBorders>
+              <w:left w:val="single" w:sz="4" w:space="0" w:color="000000"/>
+              <w:bottom w:val="single" w:sz="4" w:space="0" w:color="000000"/>
+            </w:tcBorders>
+          </w:tcPr>
+          <w:p>
+            <w:pPr>
+              <w:pStyle w:val="Style14"/>
+              <w:ind w:hanging="0" w:left="0"/>
+              <w:rPr>
+                <w:sz w:val="24"/>
+                <w:szCs w:val="24"/>
+              </w:rPr>
+            </w:pPr>
+            <w:r>
+              <w:rPr>
+                <w:sz w:val="24"/>
+                <w:szCs w:val="24"/>
+              </w:rPr>
+              <w:t>71</w:t>
+            </w:r>
+          </w:p>
+        </w:tc>
+        <w:tc>
+          <w:tcPr>
+            <w:tcW w:w="1805" w:type="dxa"/>
+            <w:tcBorders>
+              <w:left w:val="single" w:sz="4" w:space="0" w:color="000000"/>
+              <w:bottom w:val="single" w:sz="4" w:space="0" w:color="000000"/>
+              <w:right w:val="single" w:sz="4" w:space="0" w:color="000000"/>
+            </w:tcBorders>
+          </w:tcPr>
+          <w:p>
+            <w:pPr>
+              <w:pStyle w:val="Style14"/>
+              <w:ind w:hanging="0" w:left="0"/>
+              <w:rPr>
+                <w:sz w:val="24"/>
+                <w:szCs w:val="24"/>
+              </w:rPr>
+            </w:pPr>
+            <w:r>
+              <w:rPr>
+                <w:sz w:val="24"/>
+                <w:szCs w:val="24"/>
+              </w:rPr>
+              <w:t>46</w:t>
+            </w:r>
+          </w:p>
+        </w:tc>
+      </w:tr>
+      <w:tr>
+        <w:trPr/>
+        <w:tc>
+          <w:tcPr>
+            <w:tcW w:w="1565" w:type="dxa"/>
+            <w:vMerge w:val="restart"/>
+            <w:tcBorders>
+              <w:left w:val="single" w:sz="4" w:space="0" w:color="000000"/>
+              <w:bottom w:val="single" w:sz="4" w:space="0" w:color="000000"/>
+            </w:tcBorders>
+          </w:tcPr>
+          <w:p>
+            <w:pPr>
+              <w:pStyle w:val="Style14"/>
+              <w:ind w:hanging="0" w:left="0"/>
+              <w:rPr>
+                <w:sz w:val="24"/>
+                <w:szCs w:val="24"/>
+                <w:lang w:val="uk-UA"/>
+              </w:rPr>
+            </w:pPr>
+            <w:r>
+              <w:rPr>
+                <w:sz w:val="24"/>
+                <w:szCs w:val="24"/>
+                <w:lang w:val="uk-UA"/>
+              </w:rPr>
+              <w:t>8 на 8</w:t>
+            </w:r>
+          </w:p>
+        </w:tc>
+        <w:tc>
+          <w:tcPr>
+            <w:tcW w:w="2046" w:type="dxa"/>
+            <w:vMerge w:val="restart"/>
+            <w:tcBorders>
+              <w:left w:val="single" w:sz="4" w:space="0" w:color="000000"/>
+              <w:bottom w:val="single" w:sz="4" w:space="0" w:color="000000"/>
+            </w:tcBorders>
+          </w:tcPr>
+          <w:p>
+            <w:pPr>
+              <w:pStyle w:val="Style14"/>
+              <w:ind w:hanging="0" w:left="0"/>
+              <w:rPr>
+                <w:sz w:val="24"/>
+                <w:szCs w:val="24"/>
+              </w:rPr>
+            </w:pPr>
+            <w:r>
+              <w:rPr>
+                <w:sz w:val="24"/>
+                <w:szCs w:val="24"/>
+              </w:rPr>
+              <w:t>500</w:t>
+            </w:r>
+          </w:p>
+        </w:tc>
+        <w:tc>
+          <w:tcPr>
+            <w:tcW w:w="1805" w:type="dxa"/>
+            <w:tcBorders>
+              <w:left w:val="single" w:sz="4" w:space="0" w:color="000000"/>
+              <w:bottom w:val="single" w:sz="4" w:space="0" w:color="000000"/>
+            </w:tcBorders>
+          </w:tcPr>
+          <w:p>
+            <w:pPr>
+              <w:pStyle w:val="Style14"/>
+              <w:ind w:hanging="0" w:left="0"/>
+              <w:rPr>
+                <w:sz w:val="24"/>
+                <w:szCs w:val="24"/>
+              </w:rPr>
+            </w:pPr>
+            <w:r>
+              <w:rPr>
+                <w:sz w:val="24"/>
+                <w:szCs w:val="24"/>
+              </w:rPr>
+              <w:t>80 на 20</w:t>
+            </w:r>
+          </w:p>
+        </w:tc>
+        <w:tc>
+          <w:tcPr>
+            <w:tcW w:w="1805" w:type="dxa"/>
+            <w:tcBorders>
+              <w:left w:val="single" w:sz="4" w:space="0" w:color="000000"/>
+              <w:bottom w:val="single" w:sz="4" w:space="0" w:color="000000"/>
+            </w:tcBorders>
+          </w:tcPr>
+          <w:p>
+            <w:pPr>
+              <w:pStyle w:val="Style14"/>
+              <w:ind w:hanging="0" w:left="0"/>
+              <w:rPr>
+                <w:sz w:val="24"/>
+                <w:szCs w:val="24"/>
+              </w:rPr>
+            </w:pPr>
+            <w:r>
+              <w:rPr>
+                <w:sz w:val="24"/>
+                <w:szCs w:val="24"/>
+              </w:rPr>
+              <w:t>79</w:t>
+            </w:r>
+          </w:p>
+        </w:tc>
+        <w:tc>
+          <w:tcPr>
+            <w:tcW w:w="1805" w:type="dxa"/>
+            <w:tcBorders>
+              <w:left w:val="single" w:sz="4" w:space="0" w:color="000000"/>
+              <w:bottom w:val="single" w:sz="4" w:space="0" w:color="000000"/>
+              <w:right w:val="single" w:sz="4" w:space="0" w:color="000000"/>
+            </w:tcBorders>
+          </w:tcPr>
+          <w:p>
+            <w:pPr>
+              <w:pStyle w:val="Style14"/>
+              <w:ind w:hanging="0" w:left="0"/>
+              <w:rPr>
+                <w:sz w:val="24"/>
+                <w:szCs w:val="24"/>
+              </w:rPr>
+            </w:pPr>
+            <w:r>
+              <w:rPr>
+                <w:sz w:val="24"/>
+                <w:szCs w:val="24"/>
+              </w:rPr>
+              <w:t>52</w:t>
+            </w:r>
+          </w:p>
+        </w:tc>
+      </w:tr>
+      <w:tr>
+        <w:trPr/>
+        <w:tc>
+          <w:tcPr>
+            <w:tcW w:w="1565" w:type="dxa"/>
+            <w:vMerge w:val="continue"/>
+            <w:tcBorders>
+              <w:left w:val="single" w:sz="4" w:space="0" w:color="000000"/>
+              <w:bottom w:val="single" w:sz="4" w:space="0" w:color="000000"/>
+            </w:tcBorders>
+          </w:tcPr>
+          <w:p>
+            <w:pPr>
+              <w:pStyle w:val="Style14"/>
+              <w:ind w:hanging="0" w:left="0"/>
+              <w:rPr>
+                <w:sz w:val="24"/>
+                <w:szCs w:val="24"/>
+                <w:lang w:val="uk-UA"/>
+              </w:rPr>
+            </w:pPr>
+            <w:r>
+              <w:rPr>
+                <w:sz w:val="24"/>
+                <w:szCs w:val="24"/>
+                <w:lang w:val="uk-UA"/>
+              </w:rPr>
+            </w:r>
+          </w:p>
+        </w:tc>
+        <w:tc>
+          <w:tcPr>
+            <w:tcW w:w="2046" w:type="dxa"/>
+            <w:vMerge w:val="continue"/>
+            <w:tcBorders>
+              <w:left w:val="single" w:sz="4" w:space="0" w:color="000000"/>
+              <w:bottom w:val="single" w:sz="4" w:space="0" w:color="000000"/>
+            </w:tcBorders>
+          </w:tcPr>
+          <w:p>
+            <w:pPr>
+              <w:pStyle w:val="Style14"/>
+              <w:ind w:hanging="0" w:left="0"/>
+              <w:rPr>
+                <w:sz w:val="24"/>
+                <w:szCs w:val="24"/>
+              </w:rPr>
+            </w:pPr>
+            <w:r>
+              <w:rPr>
+                <w:sz w:val="24"/>
+                <w:szCs w:val="24"/>
+              </w:rPr>
+            </w:r>
+          </w:p>
+        </w:tc>
+        <w:tc>
+          <w:tcPr>
+            <w:tcW w:w="1805" w:type="dxa"/>
+            <w:tcBorders>
+              <w:left w:val="single" w:sz="4" w:space="0" w:color="000000"/>
+              <w:bottom w:val="single" w:sz="4" w:space="0" w:color="000000"/>
+            </w:tcBorders>
+          </w:tcPr>
+          <w:p>
+            <w:pPr>
+              <w:pStyle w:val="Style14"/>
+              <w:ind w:hanging="0" w:left="0"/>
+              <w:rPr>
+                <w:sz w:val="24"/>
+                <w:szCs w:val="24"/>
+              </w:rPr>
+            </w:pPr>
+            <w:r>
+              <w:rPr>
+                <w:sz w:val="24"/>
+                <w:szCs w:val="24"/>
+              </w:rPr>
+              <w:t>70 на 30</w:t>
+            </w:r>
+          </w:p>
+        </w:tc>
+        <w:tc>
+          <w:tcPr>
+            <w:tcW w:w="1805" w:type="dxa"/>
+            <w:tcBorders>
+              <w:left w:val="single" w:sz="4" w:space="0" w:color="000000"/>
+              <w:bottom w:val="single" w:sz="4" w:space="0" w:color="000000"/>
+            </w:tcBorders>
+          </w:tcPr>
+          <w:p>
+            <w:pPr>
+              <w:pStyle w:val="Style14"/>
+              <w:ind w:hanging="0" w:left="0"/>
+              <w:rPr>
+                <w:sz w:val="24"/>
+                <w:szCs w:val="24"/>
+              </w:rPr>
+            </w:pPr>
+            <w:r>
+              <w:rPr>
+                <w:sz w:val="24"/>
+                <w:szCs w:val="24"/>
+              </w:rPr>
+              <w:t>72.67</w:t>
+            </w:r>
+          </w:p>
+        </w:tc>
+        <w:tc>
+          <w:tcPr>
+            <w:tcW w:w="1805" w:type="dxa"/>
+            <w:tcBorders>
+              <w:left w:val="single" w:sz="4" w:space="0" w:color="000000"/>
+              <w:bottom w:val="single" w:sz="4" w:space="0" w:color="000000"/>
+              <w:right w:val="single" w:sz="4" w:space="0" w:color="000000"/>
+            </w:tcBorders>
+          </w:tcPr>
+          <w:p>
+            <w:pPr>
+              <w:pStyle w:val="Style14"/>
+              <w:ind w:hanging="0" w:left="0"/>
+              <w:rPr>
+                <w:sz w:val="24"/>
+                <w:szCs w:val="24"/>
+              </w:rPr>
+            </w:pPr>
+            <w:r>
+              <w:rPr>
+                <w:sz w:val="24"/>
+                <w:szCs w:val="24"/>
+              </w:rPr>
+              <w:t>53.14</w:t>
+            </w:r>
+          </w:p>
+        </w:tc>
+      </w:tr>
+      <w:tr>
+        <w:trPr/>
+        <w:tc>
+          <w:tcPr>
+            <w:tcW w:w="1565" w:type="dxa"/>
+            <w:vMerge w:val="continue"/>
+            <w:tcBorders>
+              <w:left w:val="single" w:sz="4" w:space="0" w:color="000000"/>
+              <w:bottom w:val="single" w:sz="4" w:space="0" w:color="000000"/>
+            </w:tcBorders>
+          </w:tcPr>
+          <w:p>
+            <w:pPr>
+              <w:pStyle w:val="Style14"/>
+              <w:ind w:hanging="0" w:left="0"/>
+              <w:rPr>
+                <w:sz w:val="24"/>
+                <w:szCs w:val="24"/>
+                <w:lang w:val="uk-UA"/>
+              </w:rPr>
+            </w:pPr>
+            <w:r>
+              <w:rPr>
+                <w:sz w:val="24"/>
+                <w:szCs w:val="24"/>
+                <w:lang w:val="uk-UA"/>
+              </w:rPr>
+            </w:r>
+          </w:p>
+        </w:tc>
+        <w:tc>
+          <w:tcPr>
+            <w:tcW w:w="2046" w:type="dxa"/>
+            <w:tcBorders>
+              <w:left w:val="single" w:sz="4" w:space="0" w:color="000000"/>
+              <w:bottom w:val="single" w:sz="4" w:space="0" w:color="000000"/>
+            </w:tcBorders>
+          </w:tcPr>
+          <w:p>
+            <w:pPr>
+              <w:pStyle w:val="Style14"/>
+              <w:ind w:hanging="0" w:left="0"/>
+              <w:rPr>
+                <w:sz w:val="24"/>
+                <w:szCs w:val="24"/>
+              </w:rPr>
+            </w:pPr>
+            <w:r>
+              <w:rPr>
+                <w:sz w:val="24"/>
+                <w:szCs w:val="24"/>
+              </w:rPr>
+              <w:t>1000</w:t>
+            </w:r>
+          </w:p>
+        </w:tc>
+        <w:tc>
+          <w:tcPr>
+            <w:tcW w:w="1805" w:type="dxa"/>
+            <w:tcBorders>
+              <w:left w:val="single" w:sz="4" w:space="0" w:color="000000"/>
+              <w:bottom w:val="single" w:sz="4" w:space="0" w:color="000000"/>
+            </w:tcBorders>
+          </w:tcPr>
+          <w:p>
+            <w:pPr>
+              <w:pStyle w:val="Style14"/>
+              <w:ind w:hanging="0" w:left="0"/>
+              <w:rPr>
+                <w:sz w:val="24"/>
+                <w:szCs w:val="24"/>
+              </w:rPr>
+            </w:pPr>
+            <w:r>
+              <w:rPr>
+                <w:sz w:val="24"/>
+                <w:szCs w:val="24"/>
+              </w:rPr>
+              <w:t>80 на 20</w:t>
+            </w:r>
+          </w:p>
+        </w:tc>
+        <w:tc>
+          <w:tcPr>
+            <w:tcW w:w="1805" w:type="dxa"/>
+            <w:tcBorders>
+              <w:left w:val="single" w:sz="4" w:space="0" w:color="000000"/>
+              <w:bottom w:val="single" w:sz="4" w:space="0" w:color="000000"/>
+            </w:tcBorders>
+          </w:tcPr>
+          <w:p>
+            <w:pPr>
+              <w:pStyle w:val="Style14"/>
+              <w:ind w:hanging="0" w:left="0"/>
+              <w:rPr>
+                <w:sz w:val="24"/>
+                <w:szCs w:val="24"/>
+              </w:rPr>
+            </w:pPr>
+            <w:r>
+              <w:rPr>
+                <w:sz w:val="24"/>
+                <w:szCs w:val="24"/>
+              </w:rPr>
+              <w:t>69</w:t>
+            </w:r>
+          </w:p>
+        </w:tc>
+        <w:tc>
+          <w:tcPr>
+            <w:tcW w:w="1805" w:type="dxa"/>
+            <w:tcBorders>
+              <w:left w:val="single" w:sz="4" w:space="0" w:color="000000"/>
+              <w:bottom w:val="single" w:sz="4" w:space="0" w:color="000000"/>
+              <w:right w:val="single" w:sz="4" w:space="0" w:color="000000"/>
+            </w:tcBorders>
+          </w:tcPr>
+          <w:p>
+            <w:pPr>
+              <w:pStyle w:val="Style14"/>
+              <w:ind w:hanging="0" w:left="0"/>
+              <w:rPr>
+                <w:sz w:val="24"/>
+                <w:szCs w:val="24"/>
+              </w:rPr>
+            </w:pPr>
+            <w:r>
+              <w:rPr>
+                <w:sz w:val="24"/>
+                <w:szCs w:val="24"/>
+              </w:rPr>
+              <w:t>50.62</w:t>
+            </w:r>
+          </w:p>
+        </w:tc>
+      </w:tr>
+      <w:tr>
+        <w:trPr/>
+        <w:tc>
+          <w:tcPr>
+            <w:tcW w:w="1565" w:type="dxa"/>
+            <w:vMerge w:val="continue"/>
+            <w:tcBorders>
+              <w:left w:val="single" w:sz="4" w:space="0" w:color="000000"/>
+              <w:bottom w:val="single" w:sz="4" w:space="0" w:color="000000"/>
+            </w:tcBorders>
+          </w:tcPr>
+          <w:p>
+            <w:pPr>
+              <w:pStyle w:val="Style14"/>
+              <w:ind w:hanging="0" w:left="0"/>
+              <w:rPr>
+                <w:sz w:val="24"/>
+                <w:szCs w:val="24"/>
+                <w:lang w:val="uk-UA"/>
+              </w:rPr>
+            </w:pPr>
+            <w:r>
+              <w:rPr>
+                <w:sz w:val="24"/>
+                <w:szCs w:val="24"/>
+                <w:lang w:val="uk-UA"/>
+              </w:rPr>
+            </w:r>
+          </w:p>
+        </w:tc>
+        <w:tc>
+          <w:tcPr>
+            <w:tcW w:w="2046" w:type="dxa"/>
+            <w:tcBorders>
+              <w:left w:val="single" w:sz="4" w:space="0" w:color="000000"/>
+              <w:bottom w:val="single" w:sz="4" w:space="0" w:color="000000"/>
+            </w:tcBorders>
+          </w:tcPr>
+          <w:p>
+            <w:pPr>
+              <w:pStyle w:val="Style14"/>
+              <w:ind w:hanging="0" w:left="0"/>
+              <w:rPr>
+                <w:sz w:val="24"/>
+                <w:szCs w:val="24"/>
+              </w:rPr>
+            </w:pPr>
+            <w:r>
+              <w:rPr>
+                <w:sz w:val="24"/>
+                <w:szCs w:val="24"/>
+              </w:rPr>
+              <w:t>5000</w:t>
+            </w:r>
+          </w:p>
+        </w:tc>
+        <w:tc>
+          <w:tcPr>
+            <w:tcW w:w="1805" w:type="dxa"/>
+            <w:tcBorders>
+              <w:left w:val="single" w:sz="4" w:space="0" w:color="000000"/>
+              <w:bottom w:val="single" w:sz="4" w:space="0" w:color="000000"/>
+            </w:tcBorders>
+          </w:tcPr>
+          <w:p>
+            <w:pPr>
+              <w:pStyle w:val="Style14"/>
+              <w:ind w:hanging="0" w:left="0"/>
+              <w:rPr>
+                <w:sz w:val="24"/>
+                <w:szCs w:val="24"/>
+              </w:rPr>
+            </w:pPr>
+            <w:r>
+              <w:rPr>
+                <w:sz w:val="24"/>
+                <w:szCs w:val="24"/>
+              </w:rPr>
+              <w:t>80 на 20</w:t>
+            </w:r>
+          </w:p>
+        </w:tc>
+        <w:tc>
+          <w:tcPr>
+            <w:tcW w:w="1805" w:type="dxa"/>
+            <w:tcBorders>
+              <w:left w:val="single" w:sz="4" w:space="0" w:color="000000"/>
+              <w:bottom w:val="single" w:sz="4" w:space="0" w:color="000000"/>
+            </w:tcBorders>
+          </w:tcPr>
+          <w:p>
+            <w:pPr>
+              <w:pStyle w:val="Style14"/>
+              <w:ind w:hanging="0" w:left="0"/>
+              <w:rPr>
+                <w:sz w:val="24"/>
+                <w:szCs w:val="24"/>
+              </w:rPr>
+            </w:pPr>
+            <w:r>
+              <w:rPr>
+                <w:sz w:val="24"/>
+                <w:szCs w:val="24"/>
+              </w:rPr>
+              <w:t>57.30</w:t>
+            </w:r>
+          </w:p>
+        </w:tc>
+        <w:tc>
+          <w:tcPr>
+            <w:tcW w:w="1805" w:type="dxa"/>
+            <w:tcBorders>
+              <w:left w:val="single" w:sz="4" w:space="0" w:color="000000"/>
+              <w:bottom w:val="single" w:sz="4" w:space="0" w:color="000000"/>
+              <w:right w:val="single" w:sz="4" w:space="0" w:color="000000"/>
+            </w:tcBorders>
+          </w:tcPr>
+          <w:p>
+            <w:pPr>
+              <w:pStyle w:val="Style14"/>
+              <w:ind w:hanging="0" w:left="0"/>
+              <w:rPr>
+                <w:sz w:val="24"/>
+                <w:szCs w:val="24"/>
+              </w:rPr>
+            </w:pPr>
+            <w:r>
+              <w:rPr>
+                <w:sz w:val="24"/>
+                <w:szCs w:val="24"/>
+              </w:rPr>
+              <w:t>51.38</w:t>
+            </w:r>
+          </w:p>
+        </w:tc>
+      </w:tr>
+    </w:tbl>
+    <w:p>
+      <w:pPr>
+        <w:pStyle w:val="p11"/>
+        <w:rPr>
+          <w:lang w:val="uk-UA"/>
+        </w:rPr>
+      </w:pPr>
+      <w:r>
+        <w:rPr>
+          <w:lang w:val="uk-UA"/>
+        </w:rPr>
+      </w:r>
+    </w:p>
+    <w:p>
+      <w:pPr>
+        <w:pStyle w:val="p11"/>
+        <w:rPr>
+          <w:lang w:val="uk-UA"/>
+        </w:rPr>
+      </w:pPr>
+      <w:r>
+        <w:rPr>
+          <w:lang w:val="uk-UA"/>
+        </w:rPr>
+      </w:r>
+    </w:p>
+    <w:p>
+      <w:pPr>
+        <w:pStyle w:val="p11"/>
+        <w:rPr>
+          <w:lang w:val="uk-UA"/>
+        </w:rPr>
+      </w:pPr>
+      <w:r>
+        <w:rPr>
+          <w:lang w:val="uk-UA"/>
+        </w:rPr>
+        <w:t>- При карті розмірами 4х4:</w:t>
+      </w:r>
+    </w:p>
+    <w:p>
+      <w:pPr>
+        <w:pStyle w:val="p11"/>
+        <w:rPr>
+          <w:lang w:val="uk-UA"/>
+        </w:rPr>
+      </w:pPr>
+      <w:r>
+        <w:rPr>
+          <w:lang w:val="uk-UA"/>
+        </w:rPr>
+        <w:t xml:space="preserve">  </w:t>
+      </w:r>
+      <w:r>
+        <w:rPr>
+          <w:lang w:val="uk-UA"/>
+        </w:rPr>
+        <w:t>- При 500 зразках та розбитті вибірки 80/20: точність тренувальних 65%, на тестових 51.75%</w:t>
+      </w:r>
+    </w:p>
+    <w:p>
+      <w:pPr>
+        <w:pStyle w:val="p11"/>
+        <w:rPr>
+          <w:lang w:val="uk-UA"/>
+        </w:rPr>
+      </w:pPr>
+      <w:r>
+        <w:rPr>
+          <w:lang w:val="uk-UA"/>
+        </w:rPr>
+        <w:t>- При карті розмірами 5х5:</w:t>
+      </w:r>
+    </w:p>
+    <w:p>
+      <w:pPr>
+        <w:pStyle w:val="p11"/>
+        <w:rPr>
+          <w:lang w:val="uk-UA"/>
+        </w:rPr>
+      </w:pPr>
+      <w:r>
+        <w:rPr>
+          <w:lang w:val="uk-UA"/>
+        </w:rPr>
+        <w:t xml:space="preserve">  </w:t>
+      </w:r>
+      <w:r>
+        <w:rPr>
+          <w:lang w:val="uk-UA"/>
+        </w:rPr>
+        <w:t>- При 500 зразках та розбитті вибірки 80/20: точність тренувальних 66%, на тестових 46.50%</w:t>
+      </w:r>
+    </w:p>
+    <w:p>
+      <w:pPr>
+        <w:pStyle w:val="p11"/>
+        <w:rPr>
+          <w:lang w:val="uk-UA"/>
+        </w:rPr>
+      </w:pPr>
+      <w:r>
+        <w:rPr>
+          <w:lang w:val="uk-UA"/>
+        </w:rPr>
+        <w:t>- При карті розмірами 6х6:</w:t>
+      </w:r>
+    </w:p>
+    <w:p>
+      <w:pPr>
+        <w:pStyle w:val="p11"/>
+        <w:rPr>
+          <w:lang w:val="uk-UA"/>
+        </w:rPr>
+      </w:pPr>
+      <w:r>
+        <w:rPr>
+          <w:lang w:val="uk-UA"/>
+        </w:rPr>
+        <w:t xml:space="preserve">  </w:t>
+      </w:r>
+      <w:r>
+        <w:rPr>
+          <w:lang w:val="uk-UA"/>
+        </w:rPr>
+        <w:t>- При 500 зразках та розбитті вибірки 80/20: точність тренувальних 73%, на тестових 48.25%</w:t>
+      </w:r>
+    </w:p>
+    <w:p>
+      <w:pPr>
+        <w:pStyle w:val="p11"/>
+        <w:rPr>
+          <w:lang w:val="uk-UA"/>
+        </w:rPr>
+      </w:pPr>
+      <w:r>
+        <w:rPr>
+          <w:lang w:val="uk-UA"/>
+        </w:rPr>
+        <w:t>- При карті розмірами 7х7:</w:t>
+      </w:r>
+    </w:p>
+    <w:p>
+      <w:pPr>
+        <w:pStyle w:val="p11"/>
+        <w:rPr>
+          <w:lang w:val="uk-UA"/>
+        </w:rPr>
+      </w:pPr>
+      <w:r>
+        <w:rPr>
+          <w:lang w:val="uk-UA"/>
+        </w:rPr>
+        <w:t xml:space="preserve">  </w:t>
+      </w:r>
+      <w:r>
+        <w:rPr>
+          <w:lang w:val="uk-UA"/>
+        </w:rPr>
+        <w:t>- При 500 зразках та розбитті вибірки 80/20: точність тренувальних 71%, на тестових 46%</w:t>
+      </w:r>
+    </w:p>
+    <w:p>
+      <w:pPr>
+        <w:pStyle w:val="p11"/>
+        <w:rPr>
+          <w:lang w:val="uk-UA"/>
+        </w:rPr>
+      </w:pPr>
+      <w:r>
+        <w:rPr>
+          <w:lang w:val="uk-UA"/>
+        </w:rPr>
+        <w:t>- При карті розмірами 8х8:</w:t>
+      </w:r>
+    </w:p>
+    <w:p>
+      <w:pPr>
+        <w:pStyle w:val="p11"/>
+        <w:rPr>
+          <w:lang w:val="uk-UA"/>
+        </w:rPr>
+      </w:pPr>
+      <w:r>
+        <w:rPr>
+          <w:lang w:val="uk-UA"/>
+        </w:rPr>
+        <w:t xml:space="preserve">  </w:t>
+      </w:r>
+      <w:r>
+        <w:rPr>
+          <w:lang w:val="uk-UA"/>
+        </w:rPr>
+        <w:t xml:space="preserve">- При 500 зразках та розбитті 80/20: </w:t>
+      </w:r>
+    </w:p>
+    <w:p>
+      <w:pPr>
+        <w:pStyle w:val="p11"/>
+        <w:rPr>
+          <w:lang w:val="uk-UA"/>
+        </w:rPr>
+      </w:pPr>
+      <w:r>
+        <w:rPr>
+          <w:lang w:val="uk-UA"/>
+        </w:rPr>
+      </w:r>
+    </w:p>
+    <w:p>
+      <w:pPr>
+        <w:pStyle w:val="p11"/>
+        <w:rPr>
+          <w:lang w:val="uk-UA"/>
+        </w:rPr>
+      </w:pPr>
+      <w:r>
+        <w:rPr>
+          <w:lang w:val="uk-UA"/>
+        </w:rPr>
+        <w:tab/>
+        <w:tab/>
+      </w:r>
+    </w:p>
+    <w:p>
+      <w:pPr>
+        <w:pStyle w:val="H2"/>
+        <w:rPr/>
+      </w:pPr>
+      <w:r>
+        <w:rPr/>
+        <w:t>2 LVQ1</w:t>
       </w:r>
     </w:p>
     <w:sectPr>
@@ -1806,12 +5272,12 @@
       <w:lang w:val="en-US" w:eastAsia="uk-UA"/>
     </w:rPr>
   </w:style>
-  <w:style w:type="character" w:styleId="Style12">
-    <w:name w:val="Символ нумерації"/>
+  <w:style w:type="character" w:styleId="user">
+    <w:name w:val="Символ нумерації (user)"/>
     <w:qFormat/>
     <w:rPr/>
   </w:style>
-  <w:style w:type="paragraph" w:styleId="Style13">
+  <w:style w:type="paragraph" w:styleId="Style12">
     <w:name w:val="Заголовок"/>
     <w:basedOn w:val="Normal"/>
     <w:next w:val="BodyText"/>
@@ -1821,7 +5287,7 @@
       <w:spacing w:before="240" w:after="120"/>
     </w:pPr>
     <w:rPr>
-      <w:rFonts w:ascii="Liberation Sans" w:hAnsi="Liberation Sans" w:eastAsia="Microsoft YaHei" w:cs="Lucida Sans"/>
+      <w:rFonts w:ascii="Liberation Sans" w:hAnsi="Liberation Sans" w:eastAsia="Microsoft YaHei" w:cs="Arial Unicode MS"/>
       <w:sz w:val="28"/>
       <w:szCs w:val="28"/>
     </w:rPr>
@@ -1858,8 +5324,34 @@
       <w:szCs w:val="24"/>
     </w:rPr>
   </w:style>
-  <w:style w:type="paragraph" w:styleId="Style14">
+  <w:style w:type="paragraph" w:styleId="Style13">
     <w:name w:val="Покажчик"/>
+    <w:basedOn w:val="Normal"/>
+    <w:qFormat/>
+    <w:pPr>
+      <w:suppressLineNumbers/>
+    </w:pPr>
+    <w:rPr>
+      <w:rFonts w:cs="Arial Unicode MS"/>
+    </w:rPr>
+  </w:style>
+  <w:style w:type="paragraph" w:styleId="user1">
+    <w:name w:val="Заголовок (user)"/>
+    <w:basedOn w:val="Normal"/>
+    <w:next w:val="BodyText"/>
+    <w:qFormat/>
+    <w:pPr>
+      <w:keepNext w:val="true"/>
+      <w:spacing w:before="240" w:after="120"/>
+    </w:pPr>
+    <w:rPr>
+      <w:rFonts w:ascii="Liberation Sans" w:hAnsi="Liberation Sans" w:eastAsia="Microsoft YaHei" w:cs="Lucida Sans"/>
+      <w:sz w:val="28"/>
+      <w:szCs w:val="28"/>
+    </w:rPr>
+  </w:style>
+  <w:style w:type="paragraph" w:styleId="user2">
+    <w:name w:val="Покажчик (user)"/>
     <w:basedOn w:val="Normal"/>
     <w:qFormat/>
     <w:pPr>
@@ -1869,35 +5361,9 @@
       <w:rFonts w:cs="Lucida Sans"/>
     </w:rPr>
   </w:style>
-  <w:style w:type="paragraph" w:styleId="user">
-    <w:name w:val="Заголовок (user)"/>
-    <w:basedOn w:val="Normal"/>
-    <w:next w:val="BodyText"/>
-    <w:qFormat/>
-    <w:pPr>
-      <w:keepNext w:val="true"/>
-      <w:spacing w:before="240" w:after="120"/>
-    </w:pPr>
-    <w:rPr>
-      <w:rFonts w:ascii="Liberation Sans" w:hAnsi="Liberation Sans" w:eastAsia="Microsoft YaHei" w:cs="Arial Unicode MS"/>
-      <w:sz w:val="28"/>
-      <w:szCs w:val="28"/>
-    </w:rPr>
-  </w:style>
-  <w:style w:type="paragraph" w:styleId="user1">
-    <w:name w:val="Покажчик (user)"/>
-    <w:basedOn w:val="Normal"/>
-    <w:qFormat/>
-    <w:pPr>
-      <w:suppressLineNumbers/>
-    </w:pPr>
-    <w:rPr>
-      <w:rFonts w:cs="Arial Unicode MS"/>
-    </w:rPr>
-  </w:style>
   <w:style w:type="paragraph" w:styleId="IndexHeading">
     <w:name w:val="index heading"/>
-    <w:basedOn w:val="user"/>
+    <w:basedOn w:val="Style12"/>
     <w:pPr/>
     <w:rPr/>
   </w:style>
@@ -2004,7 +5470,9 @@
     <w:link w:val="H3Char"/>
     <w:qFormat/>
     <w:rsid w:val="00dc3221"/>
-    <w:pPr/>
+    <w:pPr>
+      <w:spacing w:before="0" w:after="0"/>
+    </w:pPr>
     <w:rPr>
       <w:rFonts w:ascii="Times New Roman" w:hAnsi="Times New Roman" w:cs="Times New Roman"/>
       <w:b/>
@@ -2172,8 +5640,8 @@
     </w:pPr>
     <w:rPr/>
   </w:style>
-  <w:style w:type="paragraph" w:styleId="Style15">
-    <w:name w:val="Вміст таблиці"/>
+  <w:style w:type="paragraph" w:styleId="user3">
+    <w:name w:val="Вміст таблиці (user)"/>
     <w:basedOn w:val="Normal"/>
     <w:qFormat/>
     <w:pPr>
@@ -2182,9 +5650,9 @@
     </w:pPr>
     <w:rPr/>
   </w:style>
-  <w:style w:type="paragraph" w:styleId="Style16">
-    <w:name w:val="Заголовок таблиці"/>
-    <w:basedOn w:val="Style15"/>
+  <w:style w:type="paragraph" w:styleId="user4">
+    <w:name w:val="Заголовок таблиці (user)"/>
+    <w:basedOn w:val="user3"/>
     <w:qFormat/>
     <w:pPr>
       <w:suppressLineNumbers/>
@@ -2195,8 +5663,8 @@
       <w:bCs/>
     </w:rPr>
   </w:style>
-  <w:style w:type="paragraph" w:styleId="user2">
-    <w:name w:val="Вміст таблиці (user)"/>
+  <w:style w:type="paragraph" w:styleId="Style14">
+    <w:name w:val="Вміст таблиці"/>
     <w:basedOn w:val="Normal"/>
     <w:qFormat/>
     <w:pPr>
@@ -2205,8 +5673,8 @@
     </w:pPr>
     <w:rPr/>
   </w:style>
-  <w:style w:type="numbering" w:styleId="user3" w:default="1">
-    <w:name w:val="Без маркерів (user)"/>
+  <w:style w:type="numbering" w:styleId="Style15" w:default="1">
+    <w:name w:val="Без маркерів"/>
     <w:uiPriority w:val="99"/>
     <w:semiHidden/>
     <w:unhideWhenUsed/>

</xml_diff>

<commit_message>
docs -- NI: adding the 3rd lab code
</commit_message>
<xml_diff>
--- a/42NI Nejroiformatyka/3/NI_KNT-122_Onyshchenko_19_PR3.docx
+++ b/42NI Nejroiformatyka/3/NI_KNT-122_Onyshchenko_19_PR3.docx
@@ -1426,19 +1426,6 @@
         <w:rPr>
           <w:rFonts w:ascii="Consolas" w:hAnsi="Consolas"/>
         </w:rPr>
-      </w:r>
-    </w:p>
-    <w:p>
-      <w:pPr>
-        <w:pStyle w:val="Code"/>
-        <w:rPr>
-          <w:rFonts w:ascii="Consolas" w:hAnsi="Consolas"/>
-        </w:rPr>
-      </w:pPr>
-      <w:r>
-        <w:rPr>
-          <w:rFonts w:ascii="Consolas" w:hAnsi="Consolas"/>
-        </w:rPr>
         <w:t>neuron_labels = np.zeros(map_size)</w:t>
       </w:r>
     </w:p>
@@ -2902,15 +2889,11 @@
     </w:p>
     <w:p>
       <w:pPr>
-        <w:pStyle w:val="p11"/>
-        <w:rPr>
-          <w:lang w:val="uk-UA"/>
-        </w:rPr>
-      </w:pPr>
-      <w:r>
-        <w:rPr>
-          <w:lang w:val="uk-UA"/>
-        </w:rPr>
+        <w:pStyle w:val="H3"/>
+        <w:rPr/>
+      </w:pPr>
+      <w:r>
+        <w:rPr/>
         <w:t>Порівняння результатів</w:t>
       </w:r>
     </w:p>
@@ -2956,9 +2939,9 @@
     </w:p>
     <w:tbl>
       <w:tblPr>
-        <w:tblW w:w="5000" w:type="pct"/>
+        <w:tblW w:w="11782" w:type="dxa"/>
         <w:jc w:val="left"/>
-        <w:tblInd w:w="55" w:type="dxa"/>
+        <w:tblInd w:w="-1321" w:type="dxa"/>
         <w:tblLayout w:type="fixed"/>
         <w:tblCellMar>
           <w:top w:w="55" w:type="dxa"/>
@@ -2968,27 +2951,29 @@
         </w:tblCellMar>
       </w:tblPr>
       <w:tblGrid>
-        <w:gridCol w:w="1565"/>
-        <w:gridCol w:w="2046"/>
-        <w:gridCol w:w="1805"/>
-        <w:gridCol w:w="1805"/>
-        <w:gridCol w:w="1805"/>
+        <w:gridCol w:w="1300"/>
+        <w:gridCol w:w="1818"/>
+        <w:gridCol w:w="3509"/>
+        <w:gridCol w:w="2837"/>
+        <w:gridCol w:w="2318"/>
       </w:tblGrid>
       <w:tr>
         <w:trPr/>
         <w:tc>
           <w:tcPr>
-            <w:tcW w:w="1565" w:type="dxa"/>
+            <w:tcW w:w="1300" w:type="dxa"/>
             <w:tcBorders>
               <w:top w:val="single" w:sz="4" w:space="0" w:color="000000"/>
               <w:left w:val="single" w:sz="4" w:space="0" w:color="000000"/>
               <w:bottom w:val="single" w:sz="4" w:space="0" w:color="000000"/>
             </w:tcBorders>
+            <w:vAlign w:val="center"/>
           </w:tcPr>
           <w:p>
             <w:pPr>
               <w:pStyle w:val="Style14"/>
               <w:ind w:hanging="0" w:left="0"/>
+              <w:jc w:val="center"/>
               <w:rPr>
                 <w:b/>
                 <w:bCs/>
@@ -3009,17 +2994,19 @@
         </w:tc>
         <w:tc>
           <w:tcPr>
-            <w:tcW w:w="2046" w:type="dxa"/>
+            <w:tcW w:w="1818" w:type="dxa"/>
             <w:tcBorders>
               <w:top w:val="single" w:sz="4" w:space="0" w:color="000000"/>
               <w:left w:val="single" w:sz="4" w:space="0" w:color="000000"/>
               <w:bottom w:val="single" w:sz="4" w:space="0" w:color="000000"/>
             </w:tcBorders>
+            <w:vAlign w:val="center"/>
           </w:tcPr>
           <w:p>
             <w:pPr>
               <w:pStyle w:val="Style14"/>
               <w:ind w:hanging="0" w:left="0"/>
+              <w:jc w:val="center"/>
               <w:rPr>
                 <w:b/>
                 <w:bCs/>
@@ -3040,17 +3027,19 @@
         </w:tc>
         <w:tc>
           <w:tcPr>
-            <w:tcW w:w="1805" w:type="dxa"/>
+            <w:tcW w:w="3509" w:type="dxa"/>
             <w:tcBorders>
               <w:top w:val="single" w:sz="4" w:space="0" w:color="000000"/>
               <w:left w:val="single" w:sz="4" w:space="0" w:color="000000"/>
               <w:bottom w:val="single" w:sz="4" w:space="0" w:color="000000"/>
             </w:tcBorders>
+            <w:vAlign w:val="center"/>
           </w:tcPr>
           <w:p>
             <w:pPr>
               <w:pStyle w:val="Style14"/>
               <w:ind w:hanging="0" w:left="0"/>
+              <w:jc w:val="center"/>
               <w:rPr>
                 <w:b/>
                 <w:bCs/>
@@ -3071,17 +3060,19 @@
         </w:tc>
         <w:tc>
           <w:tcPr>
-            <w:tcW w:w="1805" w:type="dxa"/>
+            <w:tcW w:w="2837" w:type="dxa"/>
             <w:tcBorders>
               <w:top w:val="single" w:sz="4" w:space="0" w:color="000000"/>
               <w:left w:val="single" w:sz="4" w:space="0" w:color="000000"/>
               <w:bottom w:val="single" w:sz="4" w:space="0" w:color="000000"/>
             </w:tcBorders>
+            <w:vAlign w:val="center"/>
           </w:tcPr>
           <w:p>
             <w:pPr>
               <w:pStyle w:val="Style14"/>
               <w:ind w:hanging="0" w:left="0"/>
+              <w:jc w:val="center"/>
               <w:rPr>
                 <w:b/>
                 <w:bCs/>
@@ -3112,18 +3103,20 @@
         </w:tc>
         <w:tc>
           <w:tcPr>
-            <w:tcW w:w="1805" w:type="dxa"/>
+            <w:tcW w:w="2318" w:type="dxa"/>
             <w:tcBorders>
               <w:top w:val="single" w:sz="4" w:space="0" w:color="000000"/>
               <w:left w:val="single" w:sz="4" w:space="0" w:color="000000"/>
               <w:bottom w:val="single" w:sz="4" w:space="0" w:color="000000"/>
               <w:right w:val="single" w:sz="4" w:space="0" w:color="000000"/>
             </w:tcBorders>
+            <w:vAlign w:val="center"/>
           </w:tcPr>
           <w:p>
             <w:pPr>
               <w:pStyle w:val="Style14"/>
               <w:ind w:hanging="0" w:left="0"/>
+              <w:jc w:val="center"/>
               <w:rPr>
                 <w:b/>
                 <w:bCs/>
@@ -3147,11 +3140,12 @@
         <w:trPr/>
         <w:tc>
           <w:tcPr>
-            <w:tcW w:w="1565" w:type="dxa"/>
+            <w:tcW w:w="1300" w:type="dxa"/>
             <w:tcBorders>
               <w:left w:val="single" w:sz="4" w:space="0" w:color="000000"/>
               <w:bottom w:val="single" w:sz="4" w:space="0" w:color="000000"/>
             </w:tcBorders>
+            <w:vAlign w:val="center"/>
           </w:tcPr>
           <w:p>
             <w:pPr>
@@ -3173,11 +3167,12 @@
         </w:tc>
         <w:tc>
           <w:tcPr>
-            <w:tcW w:w="2046" w:type="dxa"/>
+            <w:tcW w:w="1818" w:type="dxa"/>
             <w:tcBorders>
               <w:left w:val="single" w:sz="4" w:space="0" w:color="000000"/>
               <w:bottom w:val="single" w:sz="4" w:space="0" w:color="000000"/>
             </w:tcBorders>
+            <w:vAlign w:val="center"/>
           </w:tcPr>
           <w:p>
             <w:pPr>
@@ -3199,11 +3194,12 @@
         </w:tc>
         <w:tc>
           <w:tcPr>
-            <w:tcW w:w="1805" w:type="dxa"/>
+            <w:tcW w:w="3509" w:type="dxa"/>
             <w:tcBorders>
               <w:left w:val="single" w:sz="4" w:space="0" w:color="000000"/>
               <w:bottom w:val="single" w:sz="4" w:space="0" w:color="000000"/>
             </w:tcBorders>
+            <w:vAlign w:val="center"/>
           </w:tcPr>
           <w:p>
             <w:pPr>
@@ -3225,11 +3221,12 @@
         </w:tc>
         <w:tc>
           <w:tcPr>
-            <w:tcW w:w="1805" w:type="dxa"/>
+            <w:tcW w:w="2837" w:type="dxa"/>
             <w:tcBorders>
               <w:left w:val="single" w:sz="4" w:space="0" w:color="000000"/>
               <w:bottom w:val="single" w:sz="4" w:space="0" w:color="000000"/>
             </w:tcBorders>
+            <w:vAlign w:val="center"/>
           </w:tcPr>
           <w:p>
             <w:pPr>
@@ -3251,12 +3248,13 @@
         </w:tc>
         <w:tc>
           <w:tcPr>
-            <w:tcW w:w="1805" w:type="dxa"/>
+            <w:tcW w:w="2318" w:type="dxa"/>
             <w:tcBorders>
               <w:left w:val="single" w:sz="4" w:space="0" w:color="000000"/>
               <w:bottom w:val="single" w:sz="4" w:space="0" w:color="000000"/>
               <w:right w:val="single" w:sz="4" w:space="0" w:color="000000"/>
             </w:tcBorders>
+            <w:vAlign w:val="center"/>
           </w:tcPr>
           <w:p>
             <w:pPr>
@@ -3281,11 +3279,12 @@
         <w:trPr/>
         <w:tc>
           <w:tcPr>
-            <w:tcW w:w="1565" w:type="dxa"/>
+            <w:tcW w:w="1300" w:type="dxa"/>
             <w:tcBorders>
               <w:left w:val="single" w:sz="4" w:space="0" w:color="000000"/>
               <w:bottom w:val="single" w:sz="4" w:space="0" w:color="000000"/>
             </w:tcBorders>
+            <w:vAlign w:val="center"/>
           </w:tcPr>
           <w:p>
             <w:pPr>
@@ -3317,11 +3316,12 @@
         </w:tc>
         <w:tc>
           <w:tcPr>
-            <w:tcW w:w="2046" w:type="dxa"/>
+            <w:tcW w:w="1818" w:type="dxa"/>
             <w:tcBorders>
               <w:left w:val="single" w:sz="4" w:space="0" w:color="000000"/>
               <w:bottom w:val="single" w:sz="4" w:space="0" w:color="000000"/>
             </w:tcBorders>
+            <w:vAlign w:val="center"/>
           </w:tcPr>
           <w:p>
             <w:pPr>
@@ -3343,11 +3343,12 @@
         </w:tc>
         <w:tc>
           <w:tcPr>
-            <w:tcW w:w="1805" w:type="dxa"/>
+            <w:tcW w:w="3509" w:type="dxa"/>
             <w:tcBorders>
               <w:left w:val="single" w:sz="4" w:space="0" w:color="000000"/>
               <w:bottom w:val="single" w:sz="4" w:space="0" w:color="000000"/>
             </w:tcBorders>
+            <w:vAlign w:val="center"/>
           </w:tcPr>
           <w:p>
             <w:pPr>
@@ -3369,11 +3370,12 @@
         </w:tc>
         <w:tc>
           <w:tcPr>
-            <w:tcW w:w="1805" w:type="dxa"/>
+            <w:tcW w:w="2837" w:type="dxa"/>
             <w:tcBorders>
               <w:left w:val="single" w:sz="4" w:space="0" w:color="000000"/>
               <w:bottom w:val="single" w:sz="4" w:space="0" w:color="000000"/>
             </w:tcBorders>
+            <w:vAlign w:val="center"/>
           </w:tcPr>
           <w:p>
             <w:pPr>
@@ -3395,12 +3397,13 @@
         </w:tc>
         <w:tc>
           <w:tcPr>
-            <w:tcW w:w="1805" w:type="dxa"/>
+            <w:tcW w:w="2318" w:type="dxa"/>
             <w:tcBorders>
               <w:left w:val="single" w:sz="4" w:space="0" w:color="000000"/>
               <w:bottom w:val="single" w:sz="4" w:space="0" w:color="000000"/>
               <w:right w:val="single" w:sz="4" w:space="0" w:color="000000"/>
             </w:tcBorders>
+            <w:vAlign w:val="center"/>
           </w:tcPr>
           <w:p>
             <w:pPr>
@@ -3425,11 +3428,12 @@
         <w:trPr/>
         <w:tc>
           <w:tcPr>
-            <w:tcW w:w="1565" w:type="dxa"/>
+            <w:tcW w:w="1300" w:type="dxa"/>
             <w:tcBorders>
               <w:left w:val="single" w:sz="4" w:space="0" w:color="000000"/>
               <w:bottom w:val="single" w:sz="4" w:space="0" w:color="000000"/>
             </w:tcBorders>
+            <w:vAlign w:val="center"/>
           </w:tcPr>
           <w:p>
             <w:pPr>
@@ -3453,11 +3457,12 @@
         </w:tc>
         <w:tc>
           <w:tcPr>
-            <w:tcW w:w="2046" w:type="dxa"/>
+            <w:tcW w:w="1818" w:type="dxa"/>
             <w:tcBorders>
               <w:left w:val="single" w:sz="4" w:space="0" w:color="000000"/>
               <w:bottom w:val="single" w:sz="4" w:space="0" w:color="000000"/>
             </w:tcBorders>
+            <w:vAlign w:val="center"/>
           </w:tcPr>
           <w:p>
             <w:pPr>
@@ -3479,11 +3484,12 @@
         </w:tc>
         <w:tc>
           <w:tcPr>
-            <w:tcW w:w="1805" w:type="dxa"/>
+            <w:tcW w:w="3509" w:type="dxa"/>
             <w:tcBorders>
               <w:left w:val="single" w:sz="4" w:space="0" w:color="000000"/>
               <w:bottom w:val="single" w:sz="4" w:space="0" w:color="000000"/>
             </w:tcBorders>
+            <w:vAlign w:val="center"/>
           </w:tcPr>
           <w:p>
             <w:pPr>
@@ -3505,11 +3511,12 @@
         </w:tc>
         <w:tc>
           <w:tcPr>
-            <w:tcW w:w="1805" w:type="dxa"/>
+            <w:tcW w:w="2837" w:type="dxa"/>
             <w:tcBorders>
               <w:left w:val="single" w:sz="4" w:space="0" w:color="000000"/>
               <w:bottom w:val="single" w:sz="4" w:space="0" w:color="000000"/>
             </w:tcBorders>
+            <w:vAlign w:val="center"/>
           </w:tcPr>
           <w:p>
             <w:pPr>
@@ -3531,12 +3538,13 @@
         </w:tc>
         <w:tc>
           <w:tcPr>
-            <w:tcW w:w="1805" w:type="dxa"/>
+            <w:tcW w:w="2318" w:type="dxa"/>
             <w:tcBorders>
               <w:left w:val="single" w:sz="4" w:space="0" w:color="000000"/>
               <w:bottom w:val="single" w:sz="4" w:space="0" w:color="000000"/>
               <w:right w:val="single" w:sz="4" w:space="0" w:color="000000"/>
             </w:tcBorders>
+            <w:vAlign w:val="center"/>
           </w:tcPr>
           <w:p>
             <w:pPr>
@@ -3561,11 +3569,12 @@
         <w:trPr/>
         <w:tc>
           <w:tcPr>
-            <w:tcW w:w="1565" w:type="dxa"/>
+            <w:tcW w:w="1300" w:type="dxa"/>
             <w:tcBorders>
               <w:left w:val="single" w:sz="4" w:space="0" w:color="000000"/>
               <w:bottom w:val="single" w:sz="4" w:space="0" w:color="000000"/>
             </w:tcBorders>
+            <w:vAlign w:val="center"/>
           </w:tcPr>
           <w:p>
             <w:pPr>
@@ -3589,11 +3598,12 @@
         </w:tc>
         <w:tc>
           <w:tcPr>
-            <w:tcW w:w="2046" w:type="dxa"/>
+            <w:tcW w:w="1818" w:type="dxa"/>
             <w:tcBorders>
               <w:left w:val="single" w:sz="4" w:space="0" w:color="000000"/>
               <w:bottom w:val="single" w:sz="4" w:space="0" w:color="000000"/>
             </w:tcBorders>
+            <w:vAlign w:val="center"/>
           </w:tcPr>
           <w:p>
             <w:pPr>
@@ -3615,11 +3625,12 @@
         </w:tc>
         <w:tc>
           <w:tcPr>
-            <w:tcW w:w="1805" w:type="dxa"/>
+            <w:tcW w:w="3509" w:type="dxa"/>
             <w:tcBorders>
               <w:left w:val="single" w:sz="4" w:space="0" w:color="000000"/>
               <w:bottom w:val="single" w:sz="4" w:space="0" w:color="000000"/>
             </w:tcBorders>
+            <w:vAlign w:val="center"/>
           </w:tcPr>
           <w:p>
             <w:pPr>
@@ -3641,11 +3652,12 @@
         </w:tc>
         <w:tc>
           <w:tcPr>
-            <w:tcW w:w="1805" w:type="dxa"/>
+            <w:tcW w:w="2837" w:type="dxa"/>
             <w:tcBorders>
               <w:left w:val="single" w:sz="4" w:space="0" w:color="000000"/>
               <w:bottom w:val="single" w:sz="4" w:space="0" w:color="000000"/>
             </w:tcBorders>
+            <w:vAlign w:val="center"/>
           </w:tcPr>
           <w:p>
             <w:pPr>
@@ -3667,12 +3679,13 @@
         </w:tc>
         <w:tc>
           <w:tcPr>
-            <w:tcW w:w="1805" w:type="dxa"/>
+            <w:tcW w:w="2318" w:type="dxa"/>
             <w:tcBorders>
               <w:left w:val="single" w:sz="4" w:space="0" w:color="000000"/>
               <w:bottom w:val="single" w:sz="4" w:space="0" w:color="000000"/>
               <w:right w:val="single" w:sz="4" w:space="0" w:color="000000"/>
             </w:tcBorders>
+            <w:vAlign w:val="center"/>
           </w:tcPr>
           <w:p>
             <w:pPr>
@@ -3697,12 +3710,13 @@
         <w:trPr/>
         <w:tc>
           <w:tcPr>
-            <w:tcW w:w="1565" w:type="dxa"/>
+            <w:tcW w:w="1300" w:type="dxa"/>
             <w:vMerge w:val="restart"/>
             <w:tcBorders>
               <w:left w:val="single" w:sz="4" w:space="0" w:color="000000"/>
               <w:bottom w:val="single" w:sz="4" w:space="0" w:color="000000"/>
             </w:tcBorders>
+            <w:vAlign w:val="center"/>
           </w:tcPr>
           <w:p>
             <w:pPr>
@@ -3726,12 +3740,13 @@
         </w:tc>
         <w:tc>
           <w:tcPr>
-            <w:tcW w:w="2046" w:type="dxa"/>
+            <w:tcW w:w="1818" w:type="dxa"/>
             <w:vMerge w:val="restart"/>
             <w:tcBorders>
               <w:left w:val="single" w:sz="4" w:space="0" w:color="000000"/>
               <w:bottom w:val="single" w:sz="4" w:space="0" w:color="000000"/>
             </w:tcBorders>
+            <w:vAlign w:val="center"/>
           </w:tcPr>
           <w:p>
             <w:pPr>
@@ -3753,11 +3768,12 @@
         </w:tc>
         <w:tc>
           <w:tcPr>
-            <w:tcW w:w="1805" w:type="dxa"/>
+            <w:tcW w:w="3509" w:type="dxa"/>
             <w:tcBorders>
               <w:left w:val="single" w:sz="4" w:space="0" w:color="000000"/>
               <w:bottom w:val="single" w:sz="4" w:space="0" w:color="000000"/>
             </w:tcBorders>
+            <w:vAlign w:val="center"/>
           </w:tcPr>
           <w:p>
             <w:pPr>
@@ -3779,11 +3795,12 @@
         </w:tc>
         <w:tc>
           <w:tcPr>
-            <w:tcW w:w="1805" w:type="dxa"/>
+            <w:tcW w:w="2837" w:type="dxa"/>
             <w:tcBorders>
               <w:left w:val="single" w:sz="4" w:space="0" w:color="000000"/>
               <w:bottom w:val="single" w:sz="4" w:space="0" w:color="000000"/>
             </w:tcBorders>
+            <w:vAlign w:val="center"/>
           </w:tcPr>
           <w:p>
             <w:pPr>
@@ -3805,12 +3822,13 @@
         </w:tc>
         <w:tc>
           <w:tcPr>
-            <w:tcW w:w="1805" w:type="dxa"/>
+            <w:tcW w:w="2318" w:type="dxa"/>
             <w:tcBorders>
               <w:left w:val="single" w:sz="4" w:space="0" w:color="000000"/>
               <w:bottom w:val="single" w:sz="4" w:space="0" w:color="000000"/>
               <w:right w:val="single" w:sz="4" w:space="0" w:color="000000"/>
             </w:tcBorders>
+            <w:vAlign w:val="center"/>
           </w:tcPr>
           <w:p>
             <w:pPr>
@@ -3835,12 +3853,13 @@
         <w:trPr/>
         <w:tc>
           <w:tcPr>
-            <w:tcW w:w="1565" w:type="dxa"/>
+            <w:tcW w:w="1300" w:type="dxa"/>
             <w:vMerge w:val="continue"/>
             <w:tcBorders>
               <w:left w:val="single" w:sz="4" w:space="0" w:color="000000"/>
               <w:bottom w:val="single" w:sz="4" w:space="0" w:color="000000"/>
             </w:tcBorders>
+            <w:vAlign w:val="center"/>
           </w:tcPr>
           <w:p>
             <w:pPr>
@@ -3863,12 +3882,13 @@
         </w:tc>
         <w:tc>
           <w:tcPr>
-            <w:tcW w:w="2046" w:type="dxa"/>
+            <w:tcW w:w="1818" w:type="dxa"/>
             <w:vMerge w:val="continue"/>
             <w:tcBorders>
               <w:left w:val="single" w:sz="4" w:space="0" w:color="000000"/>
               <w:bottom w:val="single" w:sz="4" w:space="0" w:color="000000"/>
             </w:tcBorders>
+            <w:vAlign w:val="center"/>
           </w:tcPr>
           <w:p>
             <w:pPr>
@@ -3889,11 +3909,12 @@
         </w:tc>
         <w:tc>
           <w:tcPr>
-            <w:tcW w:w="1805" w:type="dxa"/>
+            <w:tcW w:w="3509" w:type="dxa"/>
             <w:tcBorders>
               <w:left w:val="single" w:sz="4" w:space="0" w:color="000000"/>
               <w:bottom w:val="single" w:sz="4" w:space="0" w:color="000000"/>
             </w:tcBorders>
+            <w:vAlign w:val="center"/>
           </w:tcPr>
           <w:p>
             <w:pPr>
@@ -3915,11 +3936,12 @@
         </w:tc>
         <w:tc>
           <w:tcPr>
-            <w:tcW w:w="1805" w:type="dxa"/>
+            <w:tcW w:w="2837" w:type="dxa"/>
             <w:tcBorders>
               <w:left w:val="single" w:sz="4" w:space="0" w:color="000000"/>
               <w:bottom w:val="single" w:sz="4" w:space="0" w:color="000000"/>
             </w:tcBorders>
+            <w:vAlign w:val="center"/>
           </w:tcPr>
           <w:p>
             <w:pPr>
@@ -3941,12 +3963,13 @@
         </w:tc>
         <w:tc>
           <w:tcPr>
-            <w:tcW w:w="1805" w:type="dxa"/>
+            <w:tcW w:w="2318" w:type="dxa"/>
             <w:tcBorders>
               <w:left w:val="single" w:sz="4" w:space="0" w:color="000000"/>
               <w:bottom w:val="single" w:sz="4" w:space="0" w:color="000000"/>
               <w:right w:val="single" w:sz="4" w:space="0" w:color="000000"/>
             </w:tcBorders>
+            <w:vAlign w:val="center"/>
           </w:tcPr>
           <w:p>
             <w:pPr>
@@ -3971,12 +3994,13 @@
         <w:trPr/>
         <w:tc>
           <w:tcPr>
-            <w:tcW w:w="1565" w:type="dxa"/>
+            <w:tcW w:w="1300" w:type="dxa"/>
             <w:vMerge w:val="continue"/>
             <w:tcBorders>
               <w:left w:val="single" w:sz="4" w:space="0" w:color="000000"/>
               <w:bottom w:val="single" w:sz="4" w:space="0" w:color="000000"/>
             </w:tcBorders>
+            <w:vAlign w:val="center"/>
           </w:tcPr>
           <w:p>
             <w:pPr>
@@ -3999,11 +4023,12 @@
         </w:tc>
         <w:tc>
           <w:tcPr>
-            <w:tcW w:w="2046" w:type="dxa"/>
+            <w:tcW w:w="1818" w:type="dxa"/>
             <w:tcBorders>
               <w:left w:val="single" w:sz="4" w:space="0" w:color="000000"/>
               <w:bottom w:val="single" w:sz="4" w:space="0" w:color="000000"/>
             </w:tcBorders>
+            <w:vAlign w:val="center"/>
           </w:tcPr>
           <w:p>
             <w:pPr>
@@ -4025,11 +4050,12 @@
         </w:tc>
         <w:tc>
           <w:tcPr>
-            <w:tcW w:w="1805" w:type="dxa"/>
+            <w:tcW w:w="3509" w:type="dxa"/>
             <w:tcBorders>
               <w:left w:val="single" w:sz="4" w:space="0" w:color="000000"/>
               <w:bottom w:val="single" w:sz="4" w:space="0" w:color="000000"/>
             </w:tcBorders>
+            <w:vAlign w:val="center"/>
           </w:tcPr>
           <w:p>
             <w:pPr>
@@ -4051,11 +4077,12 @@
         </w:tc>
         <w:tc>
           <w:tcPr>
-            <w:tcW w:w="1805" w:type="dxa"/>
+            <w:tcW w:w="2837" w:type="dxa"/>
             <w:tcBorders>
               <w:left w:val="single" w:sz="4" w:space="0" w:color="000000"/>
               <w:bottom w:val="single" w:sz="4" w:space="0" w:color="000000"/>
             </w:tcBorders>
+            <w:vAlign w:val="center"/>
           </w:tcPr>
           <w:p>
             <w:pPr>
@@ -4077,12 +4104,13 @@
         </w:tc>
         <w:tc>
           <w:tcPr>
-            <w:tcW w:w="1805" w:type="dxa"/>
+            <w:tcW w:w="2318" w:type="dxa"/>
             <w:tcBorders>
               <w:left w:val="single" w:sz="4" w:space="0" w:color="000000"/>
               <w:bottom w:val="single" w:sz="4" w:space="0" w:color="000000"/>
               <w:right w:val="single" w:sz="4" w:space="0" w:color="000000"/>
             </w:tcBorders>
+            <w:vAlign w:val="center"/>
           </w:tcPr>
           <w:p>
             <w:pPr>
@@ -4107,12 +4135,13 @@
         <w:trPr/>
         <w:tc>
           <w:tcPr>
-            <w:tcW w:w="1565" w:type="dxa"/>
+            <w:tcW w:w="1300" w:type="dxa"/>
             <w:vMerge w:val="continue"/>
             <w:tcBorders>
               <w:left w:val="single" w:sz="4" w:space="0" w:color="000000"/>
               <w:bottom w:val="single" w:sz="4" w:space="0" w:color="000000"/>
             </w:tcBorders>
+            <w:vAlign w:val="center"/>
           </w:tcPr>
           <w:p>
             <w:pPr>
@@ -4135,11 +4164,12 @@
         </w:tc>
         <w:tc>
           <w:tcPr>
-            <w:tcW w:w="2046" w:type="dxa"/>
+            <w:tcW w:w="1818" w:type="dxa"/>
             <w:tcBorders>
               <w:left w:val="single" w:sz="4" w:space="0" w:color="000000"/>
               <w:bottom w:val="single" w:sz="4" w:space="0" w:color="000000"/>
             </w:tcBorders>
+            <w:vAlign w:val="center"/>
           </w:tcPr>
           <w:p>
             <w:pPr>
@@ -4161,11 +4191,12 @@
         </w:tc>
         <w:tc>
           <w:tcPr>
-            <w:tcW w:w="1805" w:type="dxa"/>
+            <w:tcW w:w="3509" w:type="dxa"/>
             <w:tcBorders>
               <w:left w:val="single" w:sz="4" w:space="0" w:color="000000"/>
               <w:bottom w:val="single" w:sz="4" w:space="0" w:color="000000"/>
             </w:tcBorders>
+            <w:vAlign w:val="center"/>
           </w:tcPr>
           <w:p>
             <w:pPr>
@@ -4187,11 +4218,12 @@
         </w:tc>
         <w:tc>
           <w:tcPr>
-            <w:tcW w:w="1805" w:type="dxa"/>
+            <w:tcW w:w="2837" w:type="dxa"/>
             <w:tcBorders>
               <w:left w:val="single" w:sz="4" w:space="0" w:color="000000"/>
               <w:bottom w:val="single" w:sz="4" w:space="0" w:color="000000"/>
             </w:tcBorders>
+            <w:vAlign w:val="center"/>
           </w:tcPr>
           <w:p>
             <w:pPr>
@@ -4213,12 +4245,13 @@
         </w:tc>
         <w:tc>
           <w:tcPr>
-            <w:tcW w:w="1805" w:type="dxa"/>
+            <w:tcW w:w="2318" w:type="dxa"/>
             <w:tcBorders>
               <w:left w:val="single" w:sz="4" w:space="0" w:color="000000"/>
               <w:bottom w:val="single" w:sz="4" w:space="0" w:color="000000"/>
               <w:right w:val="single" w:sz="4" w:space="0" w:color="000000"/>
             </w:tcBorders>
+            <w:vAlign w:val="center"/>
           </w:tcPr>
           <w:p>
             <w:pPr>
@@ -4240,215 +4273,6 @@
         </w:tc>
       </w:tr>
     </w:tbl>
-    <w:p>
-      <w:pPr>
-        <w:pStyle w:val="p11"/>
-        <w:rPr>
-          <w:lang w:val="uk-UA"/>
-        </w:rPr>
-      </w:pPr>
-      <w:r>
-        <w:rPr>
-          <w:lang w:val="uk-UA"/>
-        </w:rPr>
-      </w:r>
-    </w:p>
-    <w:p>
-      <w:pPr>
-        <w:pStyle w:val="p11"/>
-        <w:rPr>
-          <w:lang w:val="uk-UA"/>
-        </w:rPr>
-      </w:pPr>
-      <w:r>
-        <w:rPr>
-          <w:lang w:val="uk-UA"/>
-        </w:rPr>
-      </w:r>
-    </w:p>
-    <w:p>
-      <w:pPr>
-        <w:pStyle w:val="p11"/>
-        <w:rPr>
-          <w:lang w:val="uk-UA"/>
-        </w:rPr>
-      </w:pPr>
-      <w:r>
-        <w:rPr>
-          <w:lang w:val="uk-UA"/>
-        </w:rPr>
-        <w:t>- При карті розмірами 4х4:</w:t>
-      </w:r>
-    </w:p>
-    <w:p>
-      <w:pPr>
-        <w:pStyle w:val="p11"/>
-        <w:rPr>
-          <w:lang w:val="uk-UA"/>
-        </w:rPr>
-      </w:pPr>
-      <w:r>
-        <w:rPr>
-          <w:lang w:val="uk-UA"/>
-        </w:rPr>
-        <w:t xml:space="preserve">  </w:t>
-      </w:r>
-      <w:r>
-        <w:rPr>
-          <w:lang w:val="uk-UA"/>
-        </w:rPr>
-        <w:t>- При 500 зразках та розбитті вибірки 80/20: точність тренувальних 65%, на тестових 51.75%</w:t>
-      </w:r>
-    </w:p>
-    <w:p>
-      <w:pPr>
-        <w:pStyle w:val="p11"/>
-        <w:rPr>
-          <w:lang w:val="uk-UA"/>
-        </w:rPr>
-      </w:pPr>
-      <w:r>
-        <w:rPr>
-          <w:lang w:val="uk-UA"/>
-        </w:rPr>
-        <w:t>- При карті розмірами 5х5:</w:t>
-      </w:r>
-    </w:p>
-    <w:p>
-      <w:pPr>
-        <w:pStyle w:val="p11"/>
-        <w:rPr>
-          <w:lang w:val="uk-UA"/>
-        </w:rPr>
-      </w:pPr>
-      <w:r>
-        <w:rPr>
-          <w:lang w:val="uk-UA"/>
-        </w:rPr>
-        <w:t xml:space="preserve">  </w:t>
-      </w:r>
-      <w:r>
-        <w:rPr>
-          <w:lang w:val="uk-UA"/>
-        </w:rPr>
-        <w:t>- При 500 зразках та розбитті вибірки 80/20: точність тренувальних 66%, на тестових 46.50%</w:t>
-      </w:r>
-    </w:p>
-    <w:p>
-      <w:pPr>
-        <w:pStyle w:val="p11"/>
-        <w:rPr>
-          <w:lang w:val="uk-UA"/>
-        </w:rPr>
-      </w:pPr>
-      <w:r>
-        <w:rPr>
-          <w:lang w:val="uk-UA"/>
-        </w:rPr>
-        <w:t>- При карті розмірами 6х6:</w:t>
-      </w:r>
-    </w:p>
-    <w:p>
-      <w:pPr>
-        <w:pStyle w:val="p11"/>
-        <w:rPr>
-          <w:lang w:val="uk-UA"/>
-        </w:rPr>
-      </w:pPr>
-      <w:r>
-        <w:rPr>
-          <w:lang w:val="uk-UA"/>
-        </w:rPr>
-        <w:t xml:space="preserve">  </w:t>
-      </w:r>
-      <w:r>
-        <w:rPr>
-          <w:lang w:val="uk-UA"/>
-        </w:rPr>
-        <w:t>- При 500 зразках та розбитті вибірки 80/20: точність тренувальних 73%, на тестових 48.25%</w:t>
-      </w:r>
-    </w:p>
-    <w:p>
-      <w:pPr>
-        <w:pStyle w:val="p11"/>
-        <w:rPr>
-          <w:lang w:val="uk-UA"/>
-        </w:rPr>
-      </w:pPr>
-      <w:r>
-        <w:rPr>
-          <w:lang w:val="uk-UA"/>
-        </w:rPr>
-        <w:t>- При карті розмірами 7х7:</w:t>
-      </w:r>
-    </w:p>
-    <w:p>
-      <w:pPr>
-        <w:pStyle w:val="p11"/>
-        <w:rPr>
-          <w:lang w:val="uk-UA"/>
-        </w:rPr>
-      </w:pPr>
-      <w:r>
-        <w:rPr>
-          <w:lang w:val="uk-UA"/>
-        </w:rPr>
-        <w:t xml:space="preserve">  </w:t>
-      </w:r>
-      <w:r>
-        <w:rPr>
-          <w:lang w:val="uk-UA"/>
-        </w:rPr>
-        <w:t>- При 500 зразках та розбитті вибірки 80/20: точність тренувальних 71%, на тестових 46%</w:t>
-      </w:r>
-    </w:p>
-    <w:p>
-      <w:pPr>
-        <w:pStyle w:val="p11"/>
-        <w:rPr>
-          <w:lang w:val="uk-UA"/>
-        </w:rPr>
-      </w:pPr>
-      <w:r>
-        <w:rPr>
-          <w:lang w:val="uk-UA"/>
-        </w:rPr>
-        <w:t>- При карті розмірами 8х8:</w:t>
-      </w:r>
-    </w:p>
-    <w:p>
-      <w:pPr>
-        <w:pStyle w:val="p11"/>
-        <w:rPr>
-          <w:lang w:val="uk-UA"/>
-        </w:rPr>
-      </w:pPr>
-      <w:r>
-        <w:rPr>
-          <w:lang w:val="uk-UA"/>
-        </w:rPr>
-        <w:t xml:space="preserve">  </w:t>
-      </w:r>
-      <w:r>
-        <w:rPr>
-          <w:lang w:val="uk-UA"/>
-        </w:rPr>
-        <w:t xml:space="preserve">- При 500 зразках та розбитті 80/20: </w:t>
-      </w:r>
-    </w:p>
-    <w:p>
-      <w:pPr>
-        <w:pStyle w:val="p11"/>
-        <w:rPr>
-          <w:lang w:val="uk-UA"/>
-        </w:rPr>
-      </w:pPr>
-      <w:r>
-        <w:rPr>
-          <w:lang w:val="uk-UA"/>
-        </w:rPr>
-      </w:r>
-    </w:p>
     <w:p>
       <w:pPr>
         <w:pStyle w:val="p11"/>

</xml_diff>

<commit_message>
docs -- NI: preparing for the 3rd lab code
</commit_message>
<xml_diff>
--- a/42NI Nejroiformatyka/3/NI_KNT-122_Onyshchenko_19_PR3.docx
+++ b/42NI Nejroiformatyka/3/NI_KNT-122_Onyshchenko_19_PR3.docx
@@ -4295,7 +4295,3031 @@
       </w:pPr>
       <w:r>
         <w:rPr/>
-        <w:t>2 LVQ1</w:t>
+        <w:t>2 LVQ</w:t>
+      </w:r>
+    </w:p>
+    <w:p>
+      <w:pPr>
+        <w:pStyle w:val="H3"/>
+        <w:rPr/>
+      </w:pPr>
+      <w:r>
+        <w:rPr/>
+        <w:t>Код</w:t>
+      </w:r>
+    </w:p>
+    <w:p>
+      <w:pPr>
+        <w:pStyle w:val="P1"/>
+        <w:rPr/>
+      </w:pPr>
+      <w:r>
+        <w:rPr/>
+      </w:r>
+    </w:p>
+    <w:p>
+      <w:pPr>
+        <w:pStyle w:val="Code"/>
+        <w:rPr>
+          <w:rFonts w:ascii="Consolas" w:hAnsi="Consolas"/>
+        </w:rPr>
+      </w:pPr>
+      <w:r>
+        <w:rPr>
+          <w:rFonts w:ascii="Consolas" w:hAnsi="Consolas"/>
+        </w:rPr>
+        <w:t>import numpy as np</w:t>
+      </w:r>
+    </w:p>
+    <w:p>
+      <w:pPr>
+        <w:pStyle w:val="Code"/>
+        <w:rPr>
+          <w:rFonts w:ascii="Consolas" w:hAnsi="Consolas"/>
+        </w:rPr>
+      </w:pPr>
+      <w:r>
+        <w:rPr>
+          <w:rFonts w:ascii="Consolas" w:hAnsi="Consolas"/>
+        </w:rPr>
+        <w:t>from sklearn.model_selection import train_test_split</w:t>
+      </w:r>
+    </w:p>
+    <w:p>
+      <w:pPr>
+        <w:pStyle w:val="Code"/>
+        <w:rPr>
+          <w:rFonts w:ascii="Consolas" w:hAnsi="Consolas"/>
+        </w:rPr>
+      </w:pPr>
+      <w:r>
+        <w:rPr>
+          <w:rFonts w:ascii="Consolas" w:hAnsi="Consolas"/>
+        </w:rPr>
+        <w:t>from sklearn.metrics import accuracy_score</w:t>
+      </w:r>
+    </w:p>
+    <w:p>
+      <w:pPr>
+        <w:pStyle w:val="Code"/>
+        <w:rPr>
+          <w:rFonts w:ascii="Consolas" w:hAnsi="Consolas"/>
+        </w:rPr>
+      </w:pPr>
+      <w:r>
+        <w:rPr>
+          <w:rFonts w:ascii="Consolas" w:hAnsi="Consolas"/>
+        </w:rPr>
+      </w:r>
+    </w:p>
+    <w:p>
+      <w:pPr>
+        <w:pStyle w:val="Code"/>
+        <w:rPr>
+          <w:rFonts w:ascii="Consolas" w:hAnsi="Consolas"/>
+        </w:rPr>
+      </w:pPr>
+      <w:r>
+        <w:rPr>
+          <w:rFonts w:ascii="Consolas" w:hAnsi="Consolas"/>
+        </w:rPr>
+      </w:r>
+    </w:p>
+    <w:p>
+      <w:pPr>
+        <w:pStyle w:val="Code"/>
+        <w:rPr>
+          <w:rFonts w:ascii="Consolas" w:hAnsi="Consolas"/>
+        </w:rPr>
+      </w:pPr>
+      <w:r>
+        <w:rPr>
+          <w:rFonts w:ascii="Consolas" w:hAnsi="Consolas"/>
+        </w:rPr>
+        <w:t>class LVQ:</w:t>
+      </w:r>
+    </w:p>
+    <w:p>
+      <w:pPr>
+        <w:pStyle w:val="Code"/>
+        <w:rPr>
+          <w:rFonts w:ascii="Consolas" w:hAnsi="Consolas"/>
+        </w:rPr>
+      </w:pPr>
+      <w:r>
+        <w:rPr>
+          <w:rFonts w:ascii="Consolas" w:hAnsi="Consolas"/>
+        </w:rPr>
+        <w:t xml:space="preserve">    </w:t>
+      </w:r>
+      <w:r>
+        <w:rPr>
+          <w:rFonts w:ascii="Consolas" w:hAnsi="Consolas"/>
+        </w:rPr>
+        <w:t>"""</w:t>
+      </w:r>
+    </w:p>
+    <w:p>
+      <w:pPr>
+        <w:pStyle w:val="Code"/>
+        <w:rPr>
+          <w:rFonts w:ascii="Consolas" w:hAnsi="Consolas"/>
+        </w:rPr>
+      </w:pPr>
+      <w:r>
+        <w:rPr>
+          <w:rFonts w:ascii="Consolas" w:hAnsi="Consolas"/>
+        </w:rPr>
+        <w:t xml:space="preserve">    </w:t>
+      </w:r>
+      <w:r>
+        <w:rPr>
+          <w:rFonts w:ascii="Consolas" w:hAnsi="Consolas"/>
+        </w:rPr>
+        <w:t>Learning Vector Quantization (LVQ1) - ручна реалізація</w:t>
+      </w:r>
+    </w:p>
+    <w:p>
+      <w:pPr>
+        <w:pStyle w:val="Code"/>
+        <w:rPr>
+          <w:rFonts w:ascii="Consolas" w:hAnsi="Consolas"/>
+        </w:rPr>
+      </w:pPr>
+      <w:r>
+        <w:rPr>
+          <w:rFonts w:ascii="Consolas" w:hAnsi="Consolas"/>
+        </w:rPr>
+        <w:t xml:space="preserve">    </w:t>
+      </w:r>
+      <w:r>
+        <w:rPr>
+          <w:rFonts w:ascii="Consolas" w:hAnsi="Consolas"/>
+        </w:rPr>
+        <w:t>"""</w:t>
+      </w:r>
+    </w:p>
+    <w:p>
+      <w:pPr>
+        <w:pStyle w:val="Code"/>
+        <w:rPr>
+          <w:rFonts w:ascii="Consolas" w:hAnsi="Consolas"/>
+        </w:rPr>
+      </w:pPr>
+      <w:r>
+        <w:rPr>
+          <w:rFonts w:ascii="Consolas" w:hAnsi="Consolas"/>
+        </w:rPr>
+      </w:r>
+    </w:p>
+    <w:p>
+      <w:pPr>
+        <w:pStyle w:val="Code"/>
+        <w:rPr>
+          <w:rFonts w:ascii="Consolas" w:hAnsi="Consolas"/>
+        </w:rPr>
+      </w:pPr>
+      <w:r>
+        <w:rPr>
+          <w:rFonts w:ascii="Consolas" w:hAnsi="Consolas"/>
+        </w:rPr>
+        <w:t xml:space="preserve">    </w:t>
+      </w:r>
+      <w:r>
+        <w:rPr>
+          <w:rFonts w:ascii="Consolas" w:hAnsi="Consolas"/>
+        </w:rPr>
+        <w:t>def __init__(self, n_prototypes_per_class=3, learning_rate=0.1, max_epochs=100):</w:t>
+      </w:r>
+    </w:p>
+    <w:p>
+      <w:pPr>
+        <w:pStyle w:val="Code"/>
+        <w:rPr>
+          <w:rFonts w:ascii="Consolas" w:hAnsi="Consolas"/>
+        </w:rPr>
+      </w:pPr>
+      <w:r>
+        <w:rPr>
+          <w:rFonts w:ascii="Consolas" w:hAnsi="Consolas"/>
+        </w:rPr>
+        <w:t xml:space="preserve">        </w:t>
+      </w:r>
+      <w:r>
+        <w:rPr>
+          <w:rFonts w:ascii="Consolas" w:hAnsi="Consolas"/>
+        </w:rPr>
+        <w:t>"""</w:t>
+      </w:r>
+    </w:p>
+    <w:p>
+      <w:pPr>
+        <w:pStyle w:val="Code"/>
+        <w:rPr>
+          <w:rFonts w:ascii="Consolas" w:hAnsi="Consolas"/>
+        </w:rPr>
+      </w:pPr>
+      <w:r>
+        <w:rPr>
+          <w:rFonts w:ascii="Consolas" w:hAnsi="Consolas"/>
+        </w:rPr>
+        <w:t xml:space="preserve">        </w:t>
+      </w:r>
+      <w:r>
+        <w:rPr>
+          <w:rFonts w:ascii="Consolas" w:hAnsi="Consolas"/>
+        </w:rPr>
+        <w:t>Параметри:</w:t>
+      </w:r>
+    </w:p>
+    <w:p>
+      <w:pPr>
+        <w:pStyle w:val="Code"/>
+        <w:rPr>
+          <w:rFonts w:ascii="Consolas" w:hAnsi="Consolas"/>
+        </w:rPr>
+      </w:pPr>
+      <w:r>
+        <w:rPr>
+          <w:rFonts w:ascii="Consolas" w:hAnsi="Consolas"/>
+        </w:rPr>
+        <w:t xml:space="preserve">        </w:t>
+      </w:r>
+      <w:r>
+        <w:rPr>
+          <w:rFonts w:ascii="Consolas" w:hAnsi="Consolas"/>
+        </w:rPr>
+        <w:t>- n_prototypes_per_class: кількість прототипів на клас</w:t>
+      </w:r>
+    </w:p>
+    <w:p>
+      <w:pPr>
+        <w:pStyle w:val="Code"/>
+        <w:rPr>
+          <w:rFonts w:ascii="Consolas" w:hAnsi="Consolas"/>
+        </w:rPr>
+      </w:pPr>
+      <w:r>
+        <w:rPr>
+          <w:rFonts w:ascii="Consolas" w:hAnsi="Consolas"/>
+        </w:rPr>
+        <w:t xml:space="preserve">        </w:t>
+      </w:r>
+      <w:r>
+        <w:rPr>
+          <w:rFonts w:ascii="Consolas" w:hAnsi="Consolas"/>
+        </w:rPr>
+        <w:t>- learning_rate: швидкість навчання (α)</w:t>
+      </w:r>
+    </w:p>
+    <w:p>
+      <w:pPr>
+        <w:pStyle w:val="Code"/>
+        <w:rPr>
+          <w:rFonts w:ascii="Consolas" w:hAnsi="Consolas"/>
+        </w:rPr>
+      </w:pPr>
+      <w:r>
+        <w:rPr>
+          <w:rFonts w:ascii="Consolas" w:hAnsi="Consolas"/>
+        </w:rPr>
+        <w:t xml:space="preserve">        </w:t>
+      </w:r>
+      <w:r>
+        <w:rPr>
+          <w:rFonts w:ascii="Consolas" w:hAnsi="Consolas"/>
+        </w:rPr>
+        <w:t>- max_epochs: максимальна кількість епох</w:t>
+      </w:r>
+    </w:p>
+    <w:p>
+      <w:pPr>
+        <w:pStyle w:val="Code"/>
+        <w:rPr>
+          <w:rFonts w:ascii="Consolas" w:hAnsi="Consolas"/>
+        </w:rPr>
+      </w:pPr>
+      <w:r>
+        <w:rPr>
+          <w:rFonts w:ascii="Consolas" w:hAnsi="Consolas"/>
+        </w:rPr>
+        <w:t xml:space="preserve">        </w:t>
+      </w:r>
+      <w:r>
+        <w:rPr>
+          <w:rFonts w:ascii="Consolas" w:hAnsi="Consolas"/>
+        </w:rPr>
+        <w:t>"""</w:t>
+      </w:r>
+    </w:p>
+    <w:p>
+      <w:pPr>
+        <w:pStyle w:val="Code"/>
+        <w:rPr>
+          <w:rFonts w:ascii="Consolas" w:hAnsi="Consolas"/>
+        </w:rPr>
+      </w:pPr>
+      <w:r>
+        <w:rPr>
+          <w:rFonts w:ascii="Consolas" w:hAnsi="Consolas"/>
+        </w:rPr>
+        <w:t xml:space="preserve">        </w:t>
+      </w:r>
+      <w:r>
+        <w:rPr>
+          <w:rFonts w:ascii="Consolas" w:hAnsi="Consolas"/>
+        </w:rPr>
+        <w:t>self.n_prototypes_per_class = n_prototypes_per_class</w:t>
+      </w:r>
+    </w:p>
+    <w:p>
+      <w:pPr>
+        <w:pStyle w:val="Code"/>
+        <w:rPr>
+          <w:rFonts w:ascii="Consolas" w:hAnsi="Consolas"/>
+        </w:rPr>
+      </w:pPr>
+      <w:r>
+        <w:rPr>
+          <w:rFonts w:ascii="Consolas" w:hAnsi="Consolas"/>
+        </w:rPr>
+        <w:t xml:space="preserve">        </w:t>
+      </w:r>
+      <w:r>
+        <w:rPr>
+          <w:rFonts w:ascii="Consolas" w:hAnsi="Consolas"/>
+        </w:rPr>
+        <w:t>self.learning_rate = learning_rate</w:t>
+      </w:r>
+    </w:p>
+    <w:p>
+      <w:pPr>
+        <w:pStyle w:val="Code"/>
+        <w:rPr>
+          <w:rFonts w:ascii="Consolas" w:hAnsi="Consolas"/>
+        </w:rPr>
+      </w:pPr>
+      <w:r>
+        <w:rPr>
+          <w:rFonts w:ascii="Consolas" w:hAnsi="Consolas"/>
+        </w:rPr>
+        <w:t xml:space="preserve">        </w:t>
+      </w:r>
+      <w:r>
+        <w:rPr>
+          <w:rFonts w:ascii="Consolas" w:hAnsi="Consolas"/>
+        </w:rPr>
+        <w:t>self.max_epochs = max_epochs</w:t>
+      </w:r>
+    </w:p>
+    <w:p>
+      <w:pPr>
+        <w:pStyle w:val="Code"/>
+        <w:rPr>
+          <w:rFonts w:ascii="Consolas" w:hAnsi="Consolas"/>
+        </w:rPr>
+      </w:pPr>
+      <w:r>
+        <w:rPr>
+          <w:rFonts w:ascii="Consolas" w:hAnsi="Consolas"/>
+        </w:rPr>
+        <w:t xml:space="preserve">        </w:t>
+      </w:r>
+      <w:r>
+        <w:rPr>
+          <w:rFonts w:ascii="Consolas" w:hAnsi="Consolas"/>
+        </w:rPr>
+        <w:t>self.prototypes = []  # список прототипів (вектори ваг)</w:t>
+      </w:r>
+    </w:p>
+    <w:p>
+      <w:pPr>
+        <w:pStyle w:val="Code"/>
+        <w:rPr>
+          <w:rFonts w:ascii="Consolas" w:hAnsi="Consolas"/>
+        </w:rPr>
+      </w:pPr>
+      <w:r>
+        <w:rPr>
+          <w:rFonts w:ascii="Consolas" w:hAnsi="Consolas"/>
+        </w:rPr>
+        <w:t xml:space="preserve">        </w:t>
+      </w:r>
+      <w:r>
+        <w:rPr>
+          <w:rFonts w:ascii="Consolas" w:hAnsi="Consolas"/>
+        </w:rPr>
+        <w:t>self.prototype_labels = []  # мітки класів прототипів</w:t>
+      </w:r>
+    </w:p>
+    <w:p>
+      <w:pPr>
+        <w:pStyle w:val="Code"/>
+        <w:rPr>
+          <w:rFonts w:ascii="Consolas" w:hAnsi="Consolas"/>
+        </w:rPr>
+      </w:pPr>
+      <w:r>
+        <w:rPr>
+          <w:rFonts w:ascii="Consolas" w:hAnsi="Consolas"/>
+        </w:rPr>
+      </w:r>
+    </w:p>
+    <w:p>
+      <w:pPr>
+        <w:pStyle w:val="Code"/>
+        <w:rPr>
+          <w:rFonts w:ascii="Consolas" w:hAnsi="Consolas"/>
+        </w:rPr>
+      </w:pPr>
+      <w:r>
+        <w:rPr>
+          <w:rFonts w:ascii="Consolas" w:hAnsi="Consolas"/>
+        </w:rPr>
+        <w:t xml:space="preserve">    </w:t>
+      </w:r>
+      <w:r>
+        <w:rPr>
+          <w:rFonts w:ascii="Consolas" w:hAnsi="Consolas"/>
+        </w:rPr>
+        <w:t>def fit(self, X, y):</w:t>
+      </w:r>
+    </w:p>
+    <w:p>
+      <w:pPr>
+        <w:pStyle w:val="Code"/>
+        <w:rPr>
+          <w:rFonts w:ascii="Consolas" w:hAnsi="Consolas"/>
+        </w:rPr>
+      </w:pPr>
+      <w:r>
+        <w:rPr>
+          <w:rFonts w:ascii="Consolas" w:hAnsi="Consolas"/>
+        </w:rPr>
+        <w:t xml:space="preserve">        </w:t>
+      </w:r>
+      <w:r>
+        <w:rPr>
+          <w:rFonts w:ascii="Consolas" w:hAnsi="Consolas"/>
+        </w:rPr>
+        <w:t>"""</w:t>
+      </w:r>
+    </w:p>
+    <w:p>
+      <w:pPr>
+        <w:pStyle w:val="Code"/>
+        <w:rPr>
+          <w:rFonts w:ascii="Consolas" w:hAnsi="Consolas"/>
+        </w:rPr>
+      </w:pPr>
+      <w:r>
+        <w:rPr>
+          <w:rFonts w:ascii="Consolas" w:hAnsi="Consolas"/>
+        </w:rPr>
+        <w:t xml:space="preserve">        </w:t>
+      </w:r>
+      <w:r>
+        <w:rPr>
+          <w:rFonts w:ascii="Consolas" w:hAnsi="Consolas"/>
+        </w:rPr>
+        <w:t>Навчання LVQ</w:t>
+      </w:r>
+    </w:p>
+    <w:p>
+      <w:pPr>
+        <w:pStyle w:val="Code"/>
+        <w:rPr>
+          <w:rFonts w:ascii="Consolas" w:hAnsi="Consolas"/>
+        </w:rPr>
+      </w:pPr>
+      <w:r>
+        <w:rPr>
+          <w:rFonts w:ascii="Consolas" w:hAnsi="Consolas"/>
+        </w:rPr>
+        <w:t xml:space="preserve">        </w:t>
+      </w:r>
+      <w:r>
+        <w:rPr>
+          <w:rFonts w:ascii="Consolas" w:hAnsi="Consolas"/>
+        </w:rPr>
+        <w:t>X: вхідні дані (n_samples, n_features)</w:t>
+      </w:r>
+    </w:p>
+    <w:p>
+      <w:pPr>
+        <w:pStyle w:val="Code"/>
+        <w:rPr>
+          <w:rFonts w:ascii="Consolas" w:hAnsi="Consolas"/>
+        </w:rPr>
+      </w:pPr>
+      <w:r>
+        <w:rPr>
+          <w:rFonts w:ascii="Consolas" w:hAnsi="Consolas"/>
+        </w:rPr>
+        <w:t xml:space="preserve">        </w:t>
+      </w:r>
+      <w:r>
+        <w:rPr>
+          <w:rFonts w:ascii="Consolas" w:hAnsi="Consolas"/>
+        </w:rPr>
+        <w:t>y: цільові мітки (0 або 1)</w:t>
+      </w:r>
+    </w:p>
+    <w:p>
+      <w:pPr>
+        <w:pStyle w:val="Code"/>
+        <w:rPr>
+          <w:rFonts w:ascii="Consolas" w:hAnsi="Consolas"/>
+        </w:rPr>
+      </w:pPr>
+      <w:r>
+        <w:rPr>
+          <w:rFonts w:ascii="Consolas" w:hAnsi="Consolas"/>
+        </w:rPr>
+        <w:t xml:space="preserve">        </w:t>
+      </w:r>
+      <w:r>
+        <w:rPr>
+          <w:rFonts w:ascii="Consolas" w:hAnsi="Consolas"/>
+        </w:rPr>
+        <w:t>"""</w:t>
+      </w:r>
+    </w:p>
+    <w:p>
+      <w:pPr>
+        <w:pStyle w:val="Code"/>
+        <w:rPr>
+          <w:rFonts w:ascii="Consolas" w:hAnsi="Consolas"/>
+        </w:rPr>
+      </w:pPr>
+      <w:r>
+        <w:rPr>
+          <w:rFonts w:ascii="Consolas" w:hAnsi="Consolas"/>
+        </w:rPr>
+        <w:t xml:space="preserve">        </w:t>
+      </w:r>
+      <w:r>
+        <w:rPr>
+          <w:rFonts w:ascii="Consolas" w:hAnsi="Consolas"/>
+        </w:rPr>
+        <w:t>n_features = X.shape[1]</w:t>
+      </w:r>
+    </w:p>
+    <w:p>
+      <w:pPr>
+        <w:pStyle w:val="Code"/>
+        <w:rPr>
+          <w:rFonts w:ascii="Consolas" w:hAnsi="Consolas"/>
+        </w:rPr>
+      </w:pPr>
+      <w:r>
+        <w:rPr>
+          <w:rFonts w:ascii="Consolas" w:hAnsi="Consolas"/>
+        </w:rPr>
+        <w:t xml:space="preserve">        </w:t>
+      </w:r>
+      <w:r>
+        <w:rPr>
+          <w:rFonts w:ascii="Consolas" w:hAnsi="Consolas"/>
+        </w:rPr>
+        <w:t>self.prototypes = []</w:t>
+      </w:r>
+    </w:p>
+    <w:p>
+      <w:pPr>
+        <w:pStyle w:val="Code"/>
+        <w:rPr>
+          <w:rFonts w:ascii="Consolas" w:hAnsi="Consolas"/>
+        </w:rPr>
+      </w:pPr>
+      <w:r>
+        <w:rPr>
+          <w:rFonts w:ascii="Consolas" w:hAnsi="Consolas"/>
+        </w:rPr>
+        <w:t xml:space="preserve">        </w:t>
+      </w:r>
+      <w:r>
+        <w:rPr>
+          <w:rFonts w:ascii="Consolas" w:hAnsi="Consolas"/>
+        </w:rPr>
+        <w:t>self.prototype_labels = []</w:t>
+      </w:r>
+    </w:p>
+    <w:p>
+      <w:pPr>
+        <w:pStyle w:val="Code"/>
+        <w:rPr>
+          <w:rFonts w:ascii="Consolas" w:hAnsi="Consolas"/>
+        </w:rPr>
+      </w:pPr>
+      <w:r>
+        <w:rPr>
+          <w:rFonts w:ascii="Consolas" w:hAnsi="Consolas"/>
+        </w:rPr>
+      </w:r>
+    </w:p>
+    <w:p>
+      <w:pPr>
+        <w:pStyle w:val="Code"/>
+        <w:rPr>
+          <w:rFonts w:ascii="Consolas" w:hAnsi="Consolas"/>
+        </w:rPr>
+      </w:pPr>
+      <w:r>
+        <w:rPr>
+          <w:rFonts w:ascii="Consolas" w:hAnsi="Consolas"/>
+        </w:rPr>
+        <w:t xml:space="preserve">        </w:t>
+      </w:r>
+      <w:r>
+        <w:rPr>
+          <w:rFonts w:ascii="Consolas" w:hAnsi="Consolas"/>
+        </w:rPr>
+        <w:t># Ініціалізація прототипів: випадкові зразки з кожного класу</w:t>
+      </w:r>
+    </w:p>
+    <w:p>
+      <w:pPr>
+        <w:pStyle w:val="Code"/>
+        <w:rPr>
+          <w:rFonts w:ascii="Consolas" w:hAnsi="Consolas"/>
+        </w:rPr>
+      </w:pPr>
+      <w:r>
+        <w:rPr>
+          <w:rFonts w:ascii="Consolas" w:hAnsi="Consolas"/>
+        </w:rPr>
+        <w:t xml:space="preserve">        </w:t>
+      </w:r>
+      <w:r>
+        <w:rPr>
+          <w:rFonts w:ascii="Consolas" w:hAnsi="Consolas"/>
+        </w:rPr>
+        <w:t>for class_label in [0, 1]:</w:t>
+      </w:r>
+    </w:p>
+    <w:p>
+      <w:pPr>
+        <w:pStyle w:val="Code"/>
+        <w:rPr>
+          <w:rFonts w:ascii="Consolas" w:hAnsi="Consolas"/>
+        </w:rPr>
+      </w:pPr>
+      <w:r>
+        <w:rPr>
+          <w:rFonts w:ascii="Consolas" w:hAnsi="Consolas"/>
+        </w:rPr>
+        <w:t xml:space="preserve">            </w:t>
+      </w:r>
+      <w:r>
+        <w:rPr>
+          <w:rFonts w:ascii="Consolas" w:hAnsi="Consolas"/>
+        </w:rPr>
+        <w:t>X_class = X[y == class_label]</w:t>
+      </w:r>
+    </w:p>
+    <w:p>
+      <w:pPr>
+        <w:pStyle w:val="Code"/>
+        <w:rPr>
+          <w:rFonts w:ascii="Consolas" w:hAnsi="Consolas"/>
+        </w:rPr>
+      </w:pPr>
+      <w:r>
+        <w:rPr>
+          <w:rFonts w:ascii="Consolas" w:hAnsi="Consolas"/>
+        </w:rPr>
+        <w:t xml:space="preserve">            </w:t>
+      </w:r>
+      <w:r>
+        <w:rPr>
+          <w:rFonts w:ascii="Consolas" w:hAnsi="Consolas"/>
+        </w:rPr>
+        <w:t>n_prototypes = min(self.n_prototypes_per_class, len(X_class))</w:t>
+      </w:r>
+    </w:p>
+    <w:p>
+      <w:pPr>
+        <w:pStyle w:val="Code"/>
+        <w:rPr>
+          <w:rFonts w:ascii="Consolas" w:hAnsi="Consolas"/>
+        </w:rPr>
+      </w:pPr>
+      <w:r>
+        <w:rPr>
+          <w:rFonts w:ascii="Consolas" w:hAnsi="Consolas"/>
+        </w:rPr>
+        <w:t xml:space="preserve">            </w:t>
+      </w:r>
+      <w:r>
+        <w:rPr>
+          <w:rFonts w:ascii="Consolas" w:hAnsi="Consolas"/>
+        </w:rPr>
+        <w:t>indices = np.random.choice(len(X_class), n_prototypes, replace=False)</w:t>
+      </w:r>
+    </w:p>
+    <w:p>
+      <w:pPr>
+        <w:pStyle w:val="Code"/>
+        <w:rPr>
+          <w:rFonts w:ascii="Consolas" w:hAnsi="Consolas"/>
+        </w:rPr>
+      </w:pPr>
+      <w:r>
+        <w:rPr>
+          <w:rFonts w:ascii="Consolas" w:hAnsi="Consolas"/>
+        </w:rPr>
+        <w:t xml:space="preserve">            </w:t>
+      </w:r>
+      <w:r>
+        <w:rPr>
+          <w:rFonts w:ascii="Consolas" w:hAnsi="Consolas"/>
+        </w:rPr>
+        <w:t>for idx in indices:</w:t>
+      </w:r>
+    </w:p>
+    <w:p>
+      <w:pPr>
+        <w:pStyle w:val="Code"/>
+        <w:rPr>
+          <w:rFonts w:ascii="Consolas" w:hAnsi="Consolas"/>
+        </w:rPr>
+      </w:pPr>
+      <w:r>
+        <w:rPr>
+          <w:rFonts w:ascii="Consolas" w:hAnsi="Consolas"/>
+        </w:rPr>
+        <w:t xml:space="preserve">                </w:t>
+      </w:r>
+      <w:r>
+        <w:rPr>
+          <w:rFonts w:ascii="Consolas" w:hAnsi="Consolas"/>
+        </w:rPr>
+        <w:t>self.prototypes.append(X_class[idx].copy())</w:t>
+      </w:r>
+    </w:p>
+    <w:p>
+      <w:pPr>
+        <w:pStyle w:val="Code"/>
+        <w:rPr>
+          <w:rFonts w:ascii="Consolas" w:hAnsi="Consolas"/>
+        </w:rPr>
+      </w:pPr>
+      <w:r>
+        <w:rPr>
+          <w:rFonts w:ascii="Consolas" w:hAnsi="Consolas"/>
+        </w:rPr>
+        <w:t xml:space="preserve">                </w:t>
+      </w:r>
+      <w:r>
+        <w:rPr>
+          <w:rFonts w:ascii="Consolas" w:hAnsi="Consolas"/>
+        </w:rPr>
+        <w:t>self.prototype_labels.append(class_label)</w:t>
+      </w:r>
+    </w:p>
+    <w:p>
+      <w:pPr>
+        <w:pStyle w:val="Code"/>
+        <w:rPr>
+          <w:rFonts w:ascii="Consolas" w:hAnsi="Consolas"/>
+        </w:rPr>
+      </w:pPr>
+      <w:r>
+        <w:rPr>
+          <w:rFonts w:ascii="Consolas" w:hAnsi="Consolas"/>
+        </w:rPr>
+      </w:r>
+    </w:p>
+    <w:p>
+      <w:pPr>
+        <w:pStyle w:val="Code"/>
+        <w:rPr>
+          <w:rFonts w:ascii="Consolas" w:hAnsi="Consolas"/>
+        </w:rPr>
+      </w:pPr>
+      <w:r>
+        <w:rPr>
+          <w:rFonts w:ascii="Consolas" w:hAnsi="Consolas"/>
+        </w:rPr>
+        <w:t xml:space="preserve">        </w:t>
+      </w:r>
+      <w:r>
+        <w:rPr>
+          <w:rFonts w:ascii="Consolas" w:hAnsi="Consolas"/>
+        </w:rPr>
+        <w:t>self.prototypes = np.array(self.prototypes)</w:t>
+      </w:r>
+    </w:p>
+    <w:p>
+      <w:pPr>
+        <w:pStyle w:val="Code"/>
+        <w:rPr>
+          <w:rFonts w:ascii="Consolas" w:hAnsi="Consolas"/>
+        </w:rPr>
+      </w:pPr>
+      <w:r>
+        <w:rPr>
+          <w:rFonts w:ascii="Consolas" w:hAnsi="Consolas"/>
+        </w:rPr>
+        <w:t xml:space="preserve">        </w:t>
+      </w:r>
+      <w:r>
+        <w:rPr>
+          <w:rFonts w:ascii="Consolas" w:hAnsi="Consolas"/>
+        </w:rPr>
+        <w:t>self.prototype_labels = np.array(self.prototype_labels)</w:t>
+      </w:r>
+    </w:p>
+    <w:p>
+      <w:pPr>
+        <w:pStyle w:val="Code"/>
+        <w:rPr>
+          <w:rFonts w:ascii="Consolas" w:hAnsi="Consolas"/>
+        </w:rPr>
+      </w:pPr>
+      <w:r>
+        <w:rPr>
+          <w:rFonts w:ascii="Consolas" w:hAnsi="Consolas"/>
+        </w:rPr>
+      </w:r>
+    </w:p>
+    <w:p>
+      <w:pPr>
+        <w:pStyle w:val="Code"/>
+        <w:rPr>
+          <w:rFonts w:ascii="Consolas" w:hAnsi="Consolas"/>
+        </w:rPr>
+      </w:pPr>
+      <w:r>
+        <w:rPr>
+          <w:rFonts w:ascii="Consolas" w:hAnsi="Consolas"/>
+        </w:rPr>
+        <w:t xml:space="preserve">        </w:t>
+      </w:r>
+      <w:r>
+        <w:rPr>
+          <w:rFonts w:ascii="Consolas" w:hAnsi="Consolas"/>
+        </w:rPr>
+        <w:t># Навчання</w:t>
+      </w:r>
+    </w:p>
+    <w:p>
+      <w:pPr>
+        <w:pStyle w:val="Code"/>
+        <w:rPr>
+          <w:rFonts w:ascii="Consolas" w:hAnsi="Consolas"/>
+        </w:rPr>
+      </w:pPr>
+      <w:r>
+        <w:rPr>
+          <w:rFonts w:ascii="Consolas" w:hAnsi="Consolas"/>
+        </w:rPr>
+        <w:t xml:space="preserve">        </w:t>
+      </w:r>
+      <w:r>
+        <w:rPr>
+          <w:rFonts w:ascii="Consolas" w:hAnsi="Consolas"/>
+        </w:rPr>
+        <w:t>for epoch in range(self.max_epochs):</w:t>
+      </w:r>
+    </w:p>
+    <w:p>
+      <w:pPr>
+        <w:pStyle w:val="Code"/>
+        <w:rPr>
+          <w:rFonts w:ascii="Consolas" w:hAnsi="Consolas"/>
+        </w:rPr>
+      </w:pPr>
+      <w:r>
+        <w:rPr>
+          <w:rFonts w:ascii="Consolas" w:hAnsi="Consolas"/>
+        </w:rPr>
+        <w:t xml:space="preserve">            </w:t>
+      </w:r>
+      <w:r>
+        <w:rPr>
+          <w:rFonts w:ascii="Consolas" w:hAnsi="Consolas"/>
+        </w:rPr>
+        <w:t># Перемішуємо дані</w:t>
+      </w:r>
+    </w:p>
+    <w:p>
+      <w:pPr>
+        <w:pStyle w:val="Code"/>
+        <w:rPr>
+          <w:rFonts w:ascii="Consolas" w:hAnsi="Consolas"/>
+        </w:rPr>
+      </w:pPr>
+      <w:r>
+        <w:rPr>
+          <w:rFonts w:ascii="Consolas" w:hAnsi="Consolas"/>
+        </w:rPr>
+        <w:t xml:space="preserve">            </w:t>
+      </w:r>
+      <w:r>
+        <w:rPr>
+          <w:rFonts w:ascii="Consolas" w:hAnsi="Consolas"/>
+        </w:rPr>
+        <w:t>indices = np.random.permutation(len(X))</w:t>
+      </w:r>
+    </w:p>
+    <w:p>
+      <w:pPr>
+        <w:pStyle w:val="Code"/>
+        <w:rPr>
+          <w:rFonts w:ascii="Consolas" w:hAnsi="Consolas"/>
+        </w:rPr>
+      </w:pPr>
+      <w:r>
+        <w:rPr>
+          <w:rFonts w:ascii="Consolas" w:hAnsi="Consolas"/>
+        </w:rPr>
+        <w:t xml:space="preserve">            </w:t>
+      </w:r>
+      <w:r>
+        <w:rPr>
+          <w:rFonts w:ascii="Consolas" w:hAnsi="Consolas"/>
+        </w:rPr>
+        <w:t>epoch_errors = 0</w:t>
+      </w:r>
+    </w:p>
+    <w:p>
+      <w:pPr>
+        <w:pStyle w:val="Code"/>
+        <w:rPr>
+          <w:rFonts w:ascii="Consolas" w:hAnsi="Consolas"/>
+        </w:rPr>
+      </w:pPr>
+      <w:r>
+        <w:rPr>
+          <w:rFonts w:ascii="Consolas" w:hAnsi="Consolas"/>
+        </w:rPr>
+      </w:r>
+    </w:p>
+    <w:p>
+      <w:pPr>
+        <w:pStyle w:val="Code"/>
+        <w:rPr>
+          <w:rFonts w:ascii="Consolas" w:hAnsi="Consolas"/>
+        </w:rPr>
+      </w:pPr>
+      <w:r>
+        <w:rPr>
+          <w:rFonts w:ascii="Consolas" w:hAnsi="Consolas"/>
+        </w:rPr>
+        <w:t xml:space="preserve">            </w:t>
+      </w:r>
+      <w:r>
+        <w:rPr>
+          <w:rFonts w:ascii="Consolas" w:hAnsi="Consolas"/>
+        </w:rPr>
+        <w:t>for i in indices:</w:t>
+      </w:r>
+    </w:p>
+    <w:p>
+      <w:pPr>
+        <w:pStyle w:val="Code"/>
+        <w:rPr>
+          <w:rFonts w:ascii="Consolas" w:hAnsi="Consolas"/>
+        </w:rPr>
+      </w:pPr>
+      <w:r>
+        <w:rPr>
+          <w:rFonts w:ascii="Consolas" w:hAnsi="Consolas"/>
+        </w:rPr>
+        <w:t xml:space="preserve">                </w:t>
+      </w:r>
+      <w:r>
+        <w:rPr>
+          <w:rFonts w:ascii="Consolas" w:hAnsi="Consolas"/>
+        </w:rPr>
+        <w:t>x = X[i]</w:t>
+      </w:r>
+    </w:p>
+    <w:p>
+      <w:pPr>
+        <w:pStyle w:val="Code"/>
+        <w:rPr>
+          <w:rFonts w:ascii="Consolas" w:hAnsi="Consolas"/>
+        </w:rPr>
+      </w:pPr>
+      <w:r>
+        <w:rPr>
+          <w:rFonts w:ascii="Consolas" w:hAnsi="Consolas"/>
+        </w:rPr>
+        <w:t xml:space="preserve">                </w:t>
+      </w:r>
+      <w:r>
+        <w:rPr>
+          <w:rFonts w:ascii="Consolas" w:hAnsi="Consolas"/>
+        </w:rPr>
+        <w:t>true_label = y[i]</w:t>
+      </w:r>
+    </w:p>
+    <w:p>
+      <w:pPr>
+        <w:pStyle w:val="Code"/>
+        <w:rPr>
+          <w:rFonts w:ascii="Consolas" w:hAnsi="Consolas"/>
+        </w:rPr>
+      </w:pPr>
+      <w:r>
+        <w:rPr>
+          <w:rFonts w:ascii="Consolas" w:hAnsi="Consolas"/>
+        </w:rPr>
+      </w:r>
+    </w:p>
+    <w:p>
+      <w:pPr>
+        <w:pStyle w:val="Code"/>
+        <w:rPr>
+          <w:rFonts w:ascii="Consolas" w:hAnsi="Consolas"/>
+        </w:rPr>
+      </w:pPr>
+      <w:r>
+        <w:rPr>
+          <w:rFonts w:ascii="Consolas" w:hAnsi="Consolas"/>
+        </w:rPr>
+        <w:t xml:space="preserve">                </w:t>
+      </w:r>
+      <w:r>
+        <w:rPr>
+          <w:rFonts w:ascii="Consolas" w:hAnsi="Consolas"/>
+        </w:rPr>
+        <w:t># Знаходимо найближчий прототип</w:t>
+      </w:r>
+    </w:p>
+    <w:p>
+      <w:pPr>
+        <w:pStyle w:val="Code"/>
+        <w:rPr>
+          <w:rFonts w:ascii="Consolas" w:hAnsi="Consolas"/>
+        </w:rPr>
+      </w:pPr>
+      <w:r>
+        <w:rPr>
+          <w:rFonts w:ascii="Consolas" w:hAnsi="Consolas"/>
+        </w:rPr>
+        <w:t xml:space="preserve">                </w:t>
+      </w:r>
+      <w:r>
+        <w:rPr>
+          <w:rFonts w:ascii="Consolas" w:hAnsi="Consolas"/>
+        </w:rPr>
+        <w:t>distances = np.linalg.norm(self.prototypes - x, axis=1)</w:t>
+      </w:r>
+    </w:p>
+    <w:p>
+      <w:pPr>
+        <w:pStyle w:val="Code"/>
+        <w:rPr>
+          <w:rFonts w:ascii="Consolas" w:hAnsi="Consolas"/>
+        </w:rPr>
+      </w:pPr>
+      <w:r>
+        <w:rPr>
+          <w:rFonts w:ascii="Consolas" w:hAnsi="Consolas"/>
+        </w:rPr>
+        <w:t xml:space="preserve">                </w:t>
+      </w:r>
+      <w:r>
+        <w:rPr>
+          <w:rFonts w:ascii="Consolas" w:hAnsi="Consolas"/>
+        </w:rPr>
+        <w:t>winner_idx = np.argmin(distances)</w:t>
+      </w:r>
+    </w:p>
+    <w:p>
+      <w:pPr>
+        <w:pStyle w:val="Code"/>
+        <w:rPr>
+          <w:rFonts w:ascii="Consolas" w:hAnsi="Consolas"/>
+        </w:rPr>
+      </w:pPr>
+      <w:r>
+        <w:rPr>
+          <w:rFonts w:ascii="Consolas" w:hAnsi="Consolas"/>
+        </w:rPr>
+        <w:t xml:space="preserve">                </w:t>
+      </w:r>
+      <w:r>
+        <w:rPr>
+          <w:rFonts w:ascii="Consolas" w:hAnsi="Consolas"/>
+        </w:rPr>
+        <w:t>winner_label = self.prototype_labels[winner_idx]</w:t>
+      </w:r>
+    </w:p>
+    <w:p>
+      <w:pPr>
+        <w:pStyle w:val="Code"/>
+        <w:rPr>
+          <w:rFonts w:ascii="Consolas" w:hAnsi="Consolas"/>
+        </w:rPr>
+      </w:pPr>
+      <w:r>
+        <w:rPr>
+          <w:rFonts w:ascii="Consolas" w:hAnsi="Consolas"/>
+        </w:rPr>
+        <w:t xml:space="preserve">                </w:t>
+      </w:r>
+      <w:r>
+        <w:rPr>
+          <w:rFonts w:ascii="Consolas" w:hAnsi="Consolas"/>
+        </w:rPr>
+        <w:t># Оновлення за правилом LVQ</w:t>
+      </w:r>
+    </w:p>
+    <w:p>
+      <w:pPr>
+        <w:pStyle w:val="Code"/>
+        <w:rPr>
+          <w:rFonts w:ascii="Consolas" w:hAnsi="Consolas"/>
+        </w:rPr>
+      </w:pPr>
+      <w:r>
+        <w:rPr>
+          <w:rFonts w:ascii="Consolas" w:hAnsi="Consolas"/>
+        </w:rPr>
+        <w:t xml:space="preserve">                </w:t>
+      </w:r>
+      <w:r>
+        <w:rPr>
+          <w:rFonts w:ascii="Consolas" w:hAnsi="Consolas"/>
+        </w:rPr>
+        <w:t>if winner_label == true_label:</w:t>
+      </w:r>
+    </w:p>
+    <w:p>
+      <w:pPr>
+        <w:pStyle w:val="Code"/>
+        <w:rPr>
+          <w:rFonts w:ascii="Consolas" w:hAnsi="Consolas"/>
+        </w:rPr>
+      </w:pPr>
+      <w:r>
+        <w:rPr>
+          <w:rFonts w:ascii="Consolas" w:hAnsi="Consolas"/>
+        </w:rPr>
+        <w:t xml:space="preserve">                    </w:t>
+      </w:r>
+      <w:r>
+        <w:rPr>
+          <w:rFonts w:ascii="Consolas" w:hAnsi="Consolas"/>
+        </w:rPr>
+        <w:t># Правильна класифікація → наближаємо прототип</w:t>
+      </w:r>
+    </w:p>
+    <w:p>
+      <w:pPr>
+        <w:pStyle w:val="Code"/>
+        <w:rPr>
+          <w:rFonts w:ascii="Consolas" w:hAnsi="Consolas"/>
+        </w:rPr>
+      </w:pPr>
+      <w:r>
+        <w:rPr>
+          <w:rFonts w:ascii="Consolas" w:hAnsi="Consolas"/>
+        </w:rPr>
+        <w:t xml:space="preserve">                    </w:t>
+      </w:r>
+      <w:r>
+        <w:rPr>
+          <w:rFonts w:ascii="Consolas" w:hAnsi="Consolas"/>
+        </w:rPr>
+        <w:t>self.prototypes[winner_idx] += self.learning_rate * (</w:t>
+      </w:r>
+    </w:p>
+    <w:p>
+      <w:pPr>
+        <w:pStyle w:val="Code"/>
+        <w:rPr>
+          <w:rFonts w:ascii="Consolas" w:hAnsi="Consolas"/>
+        </w:rPr>
+      </w:pPr>
+      <w:r>
+        <w:rPr>
+          <w:rFonts w:ascii="Consolas" w:hAnsi="Consolas"/>
+        </w:rPr>
+        <w:t xml:space="preserve">                        </w:t>
+      </w:r>
+      <w:r>
+        <w:rPr>
+          <w:rFonts w:ascii="Consolas" w:hAnsi="Consolas"/>
+        </w:rPr>
+        <w:t>x - self.prototypes[winner_idx]</w:t>
+      </w:r>
+    </w:p>
+    <w:p>
+      <w:pPr>
+        <w:pStyle w:val="Code"/>
+        <w:rPr>
+          <w:rFonts w:ascii="Consolas" w:hAnsi="Consolas"/>
+        </w:rPr>
+      </w:pPr>
+      <w:r>
+        <w:rPr>
+          <w:rFonts w:ascii="Consolas" w:hAnsi="Consolas"/>
+        </w:rPr>
+        <w:t xml:space="preserve">                    </w:t>
+      </w:r>
+      <w:r>
+        <w:rPr>
+          <w:rFonts w:ascii="Consolas" w:hAnsi="Consolas"/>
+        </w:rPr>
+        <w:t>)</w:t>
+      </w:r>
+    </w:p>
+    <w:p>
+      <w:pPr>
+        <w:pStyle w:val="Code"/>
+        <w:rPr>
+          <w:rFonts w:ascii="Consolas" w:hAnsi="Consolas"/>
+        </w:rPr>
+      </w:pPr>
+      <w:r>
+        <w:rPr>
+          <w:rFonts w:ascii="Consolas" w:hAnsi="Consolas"/>
+        </w:rPr>
+        <w:t xml:space="preserve">                </w:t>
+      </w:r>
+      <w:r>
+        <w:rPr>
+          <w:rFonts w:ascii="Consolas" w:hAnsi="Consolas"/>
+        </w:rPr>
+        <w:t>else:</w:t>
+      </w:r>
+    </w:p>
+    <w:p>
+      <w:pPr>
+        <w:pStyle w:val="Code"/>
+        <w:rPr>
+          <w:rFonts w:ascii="Consolas" w:hAnsi="Consolas"/>
+        </w:rPr>
+      </w:pPr>
+      <w:r>
+        <w:rPr>
+          <w:rFonts w:ascii="Consolas" w:hAnsi="Consolas"/>
+        </w:rPr>
+        <w:t xml:space="preserve">                    </w:t>
+      </w:r>
+      <w:r>
+        <w:rPr>
+          <w:rFonts w:ascii="Consolas" w:hAnsi="Consolas"/>
+        </w:rPr>
+        <w:t># Помилкова класифікація → віддаляємо прототип</w:t>
+      </w:r>
+    </w:p>
+    <w:p>
+      <w:pPr>
+        <w:pStyle w:val="Code"/>
+        <w:rPr>
+          <w:rFonts w:ascii="Consolas" w:hAnsi="Consolas"/>
+        </w:rPr>
+      </w:pPr>
+      <w:r>
+        <w:rPr>
+          <w:rFonts w:ascii="Consolas" w:hAnsi="Consolas"/>
+        </w:rPr>
+        <w:t xml:space="preserve">                    </w:t>
+      </w:r>
+      <w:r>
+        <w:rPr>
+          <w:rFonts w:ascii="Consolas" w:hAnsi="Consolas"/>
+        </w:rPr>
+        <w:t>self.prototypes[winner_idx] -= self.learning_rate * (</w:t>
+      </w:r>
+    </w:p>
+    <w:p>
+      <w:pPr>
+        <w:pStyle w:val="Code"/>
+        <w:rPr>
+          <w:rFonts w:ascii="Consolas" w:hAnsi="Consolas"/>
+        </w:rPr>
+      </w:pPr>
+      <w:r>
+        <w:rPr>
+          <w:rFonts w:ascii="Consolas" w:hAnsi="Consolas"/>
+        </w:rPr>
+        <w:t xml:space="preserve">                        </w:t>
+      </w:r>
+      <w:r>
+        <w:rPr>
+          <w:rFonts w:ascii="Consolas" w:hAnsi="Consolas"/>
+        </w:rPr>
+        <w:t>x - self.prototypes[winner_idx]</w:t>
+      </w:r>
+    </w:p>
+    <w:p>
+      <w:pPr>
+        <w:pStyle w:val="Code"/>
+        <w:rPr>
+          <w:rFonts w:ascii="Consolas" w:hAnsi="Consolas"/>
+        </w:rPr>
+      </w:pPr>
+      <w:r>
+        <w:rPr>
+          <w:rFonts w:ascii="Consolas" w:hAnsi="Consolas"/>
+        </w:rPr>
+        <w:t xml:space="preserve">                    </w:t>
+      </w:r>
+      <w:r>
+        <w:rPr>
+          <w:rFonts w:ascii="Consolas" w:hAnsi="Consolas"/>
+        </w:rPr>
+        <w:t>)</w:t>
+      </w:r>
+    </w:p>
+    <w:p>
+      <w:pPr>
+        <w:pStyle w:val="Code"/>
+        <w:rPr>
+          <w:rFonts w:ascii="Consolas" w:hAnsi="Consolas"/>
+        </w:rPr>
+      </w:pPr>
+      <w:r>
+        <w:rPr>
+          <w:rFonts w:ascii="Consolas" w:hAnsi="Consolas"/>
+        </w:rPr>
+      </w:r>
+    </w:p>
+    <w:p>
+      <w:pPr>
+        <w:pStyle w:val="Code"/>
+        <w:rPr>
+          <w:rFonts w:ascii="Consolas" w:hAnsi="Consolas"/>
+        </w:rPr>
+      </w:pPr>
+      <w:r>
+        <w:rPr>
+          <w:rFonts w:ascii="Consolas" w:hAnsi="Consolas"/>
+        </w:rPr>
+        <w:t xml:space="preserve">            </w:t>
+      </w:r>
+      <w:r>
+        <w:rPr>
+          <w:rFonts w:ascii="Consolas" w:hAnsi="Consolas"/>
+        </w:rPr>
+        <w:t># Зменшуємо швидкість навчання з часом</w:t>
+      </w:r>
+    </w:p>
+    <w:p>
+      <w:pPr>
+        <w:pStyle w:val="Code"/>
+        <w:rPr>
+          <w:rFonts w:ascii="Consolas" w:hAnsi="Consolas"/>
+        </w:rPr>
+      </w:pPr>
+      <w:r>
+        <w:rPr>
+          <w:rFonts w:ascii="Consolas" w:hAnsi="Consolas"/>
+        </w:rPr>
+        <w:t xml:space="preserve">            </w:t>
+      </w:r>
+      <w:r>
+        <w:rPr>
+          <w:rFonts w:ascii="Consolas" w:hAnsi="Consolas"/>
+        </w:rPr>
+        <w:t>self.learning_rate *= 0.99</w:t>
+      </w:r>
+    </w:p>
+    <w:p>
+      <w:pPr>
+        <w:pStyle w:val="Code"/>
+        <w:rPr>
+          <w:rFonts w:ascii="Consolas" w:hAnsi="Consolas"/>
+        </w:rPr>
+      </w:pPr>
+      <w:r>
+        <w:rPr>
+          <w:rFonts w:ascii="Consolas" w:hAnsi="Consolas"/>
+        </w:rPr>
+      </w:r>
+    </w:p>
+    <w:p>
+      <w:pPr>
+        <w:pStyle w:val="Code"/>
+        <w:rPr>
+          <w:rFonts w:ascii="Consolas" w:hAnsi="Consolas"/>
+        </w:rPr>
+      </w:pPr>
+      <w:r>
+        <w:rPr>
+          <w:rFonts w:ascii="Consolas" w:hAnsi="Consolas"/>
+        </w:rPr>
+        <w:t xml:space="preserve">        </w:t>
+      </w:r>
+      <w:r>
+        <w:rPr>
+          <w:rFonts w:ascii="Consolas" w:hAnsi="Consolas"/>
+        </w:rPr>
+        <w:t>return self</w:t>
+      </w:r>
+    </w:p>
+    <w:p>
+      <w:pPr>
+        <w:pStyle w:val="Code"/>
+        <w:rPr>
+          <w:rFonts w:ascii="Consolas" w:hAnsi="Consolas"/>
+        </w:rPr>
+      </w:pPr>
+      <w:r>
+        <w:rPr>
+          <w:rFonts w:ascii="Consolas" w:hAnsi="Consolas"/>
+        </w:rPr>
+      </w:r>
+    </w:p>
+    <w:p>
+      <w:pPr>
+        <w:pStyle w:val="Code"/>
+        <w:rPr>
+          <w:rFonts w:ascii="Consolas" w:hAnsi="Consolas"/>
+        </w:rPr>
+      </w:pPr>
+      <w:r>
+        <w:rPr>
+          <w:rFonts w:ascii="Consolas" w:hAnsi="Consolas"/>
+        </w:rPr>
+        <w:t xml:space="preserve">    </w:t>
+      </w:r>
+      <w:r>
+        <w:rPr>
+          <w:rFonts w:ascii="Consolas" w:hAnsi="Consolas"/>
+        </w:rPr>
+        <w:t>def predict(self, X):</w:t>
+      </w:r>
+    </w:p>
+    <w:p>
+      <w:pPr>
+        <w:pStyle w:val="Code"/>
+        <w:rPr>
+          <w:rFonts w:ascii="Consolas" w:hAnsi="Consolas"/>
+        </w:rPr>
+      </w:pPr>
+      <w:r>
+        <w:rPr>
+          <w:rFonts w:ascii="Consolas" w:hAnsi="Consolas"/>
+        </w:rPr>
+        <w:t xml:space="preserve">        </w:t>
+      </w:r>
+      <w:r>
+        <w:rPr>
+          <w:rFonts w:ascii="Consolas" w:hAnsi="Consolas"/>
+        </w:rPr>
+        <w:t>"""</w:t>
+      </w:r>
+    </w:p>
+    <w:p>
+      <w:pPr>
+        <w:pStyle w:val="Code"/>
+        <w:rPr>
+          <w:rFonts w:ascii="Consolas" w:hAnsi="Consolas"/>
+        </w:rPr>
+      </w:pPr>
+      <w:r>
+        <w:rPr>
+          <w:rFonts w:ascii="Consolas" w:hAnsi="Consolas"/>
+        </w:rPr>
+        <w:t xml:space="preserve">        </w:t>
+      </w:r>
+      <w:r>
+        <w:rPr>
+          <w:rFonts w:ascii="Consolas" w:hAnsi="Consolas"/>
+        </w:rPr>
+        <w:t>Передбачення класів для нових зразків</w:t>
+      </w:r>
+    </w:p>
+    <w:p>
+      <w:pPr>
+        <w:pStyle w:val="Code"/>
+        <w:rPr>
+          <w:rFonts w:ascii="Consolas" w:hAnsi="Consolas"/>
+        </w:rPr>
+      </w:pPr>
+      <w:r>
+        <w:rPr>
+          <w:rFonts w:ascii="Consolas" w:hAnsi="Consolas"/>
+        </w:rPr>
+        <w:t xml:space="preserve">        </w:t>
+      </w:r>
+      <w:r>
+        <w:rPr>
+          <w:rFonts w:ascii="Consolas" w:hAnsi="Consolas"/>
+        </w:rPr>
+        <w:t>"""</w:t>
+      </w:r>
+    </w:p>
+    <w:p>
+      <w:pPr>
+        <w:pStyle w:val="Code"/>
+        <w:rPr>
+          <w:rFonts w:ascii="Consolas" w:hAnsi="Consolas"/>
+        </w:rPr>
+      </w:pPr>
+      <w:r>
+        <w:rPr>
+          <w:rFonts w:ascii="Consolas" w:hAnsi="Consolas"/>
+        </w:rPr>
+        <w:t xml:space="preserve">        </w:t>
+      </w:r>
+      <w:r>
+        <w:rPr>
+          <w:rFonts w:ascii="Consolas" w:hAnsi="Consolas"/>
+        </w:rPr>
+        <w:t>predictions = []</w:t>
+      </w:r>
+    </w:p>
+    <w:p>
+      <w:pPr>
+        <w:pStyle w:val="Code"/>
+        <w:rPr>
+          <w:rFonts w:ascii="Consolas" w:hAnsi="Consolas"/>
+        </w:rPr>
+      </w:pPr>
+      <w:r>
+        <w:rPr>
+          <w:rFonts w:ascii="Consolas" w:hAnsi="Consolas"/>
+        </w:rPr>
+        <w:t xml:space="preserve">        </w:t>
+      </w:r>
+      <w:r>
+        <w:rPr>
+          <w:rFonts w:ascii="Consolas" w:hAnsi="Consolas"/>
+        </w:rPr>
+        <w:t>for x in X:</w:t>
+      </w:r>
+    </w:p>
+    <w:p>
+      <w:pPr>
+        <w:pStyle w:val="Code"/>
+        <w:rPr>
+          <w:rFonts w:ascii="Consolas" w:hAnsi="Consolas"/>
+        </w:rPr>
+      </w:pPr>
+      <w:r>
+        <w:rPr>
+          <w:rFonts w:ascii="Consolas" w:hAnsi="Consolas"/>
+        </w:rPr>
+        <w:t xml:space="preserve">            </w:t>
+      </w:r>
+      <w:r>
+        <w:rPr>
+          <w:rFonts w:ascii="Consolas" w:hAnsi="Consolas"/>
+        </w:rPr>
+        <w:t>distances = np.linalg.norm(self.prototypes - x, axis=1)</w:t>
+      </w:r>
+    </w:p>
+    <w:p>
+      <w:pPr>
+        <w:pStyle w:val="Code"/>
+        <w:rPr>
+          <w:rFonts w:ascii="Consolas" w:hAnsi="Consolas"/>
+        </w:rPr>
+      </w:pPr>
+      <w:r>
+        <w:rPr>
+          <w:rFonts w:ascii="Consolas" w:hAnsi="Consolas"/>
+        </w:rPr>
+        <w:t xml:space="preserve">            </w:t>
+      </w:r>
+      <w:r>
+        <w:rPr>
+          <w:rFonts w:ascii="Consolas" w:hAnsi="Consolas"/>
+        </w:rPr>
+        <w:t>winner_idx = np.argmin(distances)</w:t>
+      </w:r>
+    </w:p>
+    <w:p>
+      <w:pPr>
+        <w:pStyle w:val="Code"/>
+        <w:rPr>
+          <w:rFonts w:ascii="Consolas" w:hAnsi="Consolas"/>
+        </w:rPr>
+      </w:pPr>
+      <w:r>
+        <w:rPr>
+          <w:rFonts w:ascii="Consolas" w:hAnsi="Consolas"/>
+        </w:rPr>
+        <w:t xml:space="preserve">            </w:t>
+      </w:r>
+      <w:r>
+        <w:rPr>
+          <w:rFonts w:ascii="Consolas" w:hAnsi="Consolas"/>
+        </w:rPr>
+        <w:t>predictions.append(self.prototype_labels[winner_idx])</w:t>
+      </w:r>
+    </w:p>
+    <w:p>
+      <w:pPr>
+        <w:pStyle w:val="Code"/>
+        <w:rPr>
+          <w:rFonts w:ascii="Consolas" w:hAnsi="Consolas"/>
+        </w:rPr>
+      </w:pPr>
+      <w:r>
+        <w:rPr>
+          <w:rFonts w:ascii="Consolas" w:hAnsi="Consolas"/>
+        </w:rPr>
+        <w:t xml:space="preserve">        </w:t>
+      </w:r>
+      <w:r>
+        <w:rPr>
+          <w:rFonts w:ascii="Consolas" w:hAnsi="Consolas"/>
+        </w:rPr>
+        <w:t>return np.array(predictions)</w:t>
+      </w:r>
+    </w:p>
+    <w:p>
+      <w:pPr>
+        <w:pStyle w:val="Code"/>
+        <w:rPr>
+          <w:rFonts w:ascii="Consolas" w:hAnsi="Consolas"/>
+        </w:rPr>
+      </w:pPr>
+      <w:r>
+        <w:rPr>
+          <w:rFonts w:ascii="Consolas" w:hAnsi="Consolas"/>
+        </w:rPr>
+      </w:r>
+    </w:p>
+    <w:p>
+      <w:pPr>
+        <w:pStyle w:val="Code"/>
+        <w:rPr>
+          <w:rFonts w:ascii="Consolas" w:hAnsi="Consolas"/>
+        </w:rPr>
+      </w:pPr>
+      <w:r>
+        <w:rPr>
+          <w:rFonts w:ascii="Consolas" w:hAnsi="Consolas"/>
+        </w:rPr>
+        <w:t xml:space="preserve">    </w:t>
+      </w:r>
+      <w:r>
+        <w:rPr>
+          <w:rFonts w:ascii="Consolas" w:hAnsi="Consolas"/>
+        </w:rPr>
+        <w:t>def predict_proba(self, X):</w:t>
+      </w:r>
+    </w:p>
+    <w:p>
+      <w:pPr>
+        <w:pStyle w:val="Code"/>
+        <w:rPr>
+          <w:rFonts w:ascii="Consolas" w:hAnsi="Consolas"/>
+        </w:rPr>
+      </w:pPr>
+      <w:r>
+        <w:rPr>
+          <w:rFonts w:ascii="Consolas" w:hAnsi="Consolas"/>
+        </w:rPr>
+        <w:t xml:space="preserve">        </w:t>
+      </w:r>
+      <w:r>
+        <w:rPr>
+          <w:rFonts w:ascii="Consolas" w:hAnsi="Consolas"/>
+        </w:rPr>
+        <w:t>"""</w:t>
+      </w:r>
+    </w:p>
+    <w:p>
+      <w:pPr>
+        <w:pStyle w:val="Code"/>
+        <w:rPr>
+          <w:rFonts w:ascii="Consolas" w:hAnsi="Consolas"/>
+        </w:rPr>
+      </w:pPr>
+      <w:r>
+        <w:rPr>
+          <w:rFonts w:ascii="Consolas" w:hAnsi="Consolas"/>
+        </w:rPr>
+        <w:t xml:space="preserve">        </w:t>
+      </w:r>
+      <w:r>
+        <w:rPr>
+          <w:rFonts w:ascii="Consolas" w:hAnsi="Consolas"/>
+        </w:rPr>
+        <w:t>Повертає ймовірність класу 1 (на основі відстаней)</w:t>
+      </w:r>
+    </w:p>
+    <w:p>
+      <w:pPr>
+        <w:pStyle w:val="Code"/>
+        <w:rPr>
+          <w:rFonts w:ascii="Consolas" w:hAnsi="Consolas"/>
+        </w:rPr>
+      </w:pPr>
+      <w:r>
+        <w:rPr>
+          <w:rFonts w:ascii="Consolas" w:hAnsi="Consolas"/>
+        </w:rPr>
+        <w:t xml:space="preserve">        </w:t>
+      </w:r>
+      <w:r>
+        <w:rPr>
+          <w:rFonts w:ascii="Consolas" w:hAnsi="Consolas"/>
+        </w:rPr>
+        <w:t>"""</w:t>
+      </w:r>
+    </w:p>
+    <w:p>
+      <w:pPr>
+        <w:pStyle w:val="Code"/>
+        <w:rPr>
+          <w:rFonts w:ascii="Consolas" w:hAnsi="Consolas"/>
+        </w:rPr>
+      </w:pPr>
+      <w:r>
+        <w:rPr>
+          <w:rFonts w:ascii="Consolas" w:hAnsi="Consolas"/>
+        </w:rPr>
+        <w:t xml:space="preserve">        </w:t>
+      </w:r>
+      <w:r>
+        <w:rPr>
+          <w:rFonts w:ascii="Consolas" w:hAnsi="Consolas"/>
+        </w:rPr>
+        <w:t>proba = []</w:t>
+      </w:r>
+    </w:p>
+    <w:p>
+      <w:pPr>
+        <w:pStyle w:val="Code"/>
+        <w:rPr>
+          <w:rFonts w:ascii="Consolas" w:hAnsi="Consolas"/>
+        </w:rPr>
+      </w:pPr>
+      <w:r>
+        <w:rPr>
+          <w:rFonts w:ascii="Consolas" w:hAnsi="Consolas"/>
+        </w:rPr>
+        <w:t xml:space="preserve">        </w:t>
+      </w:r>
+      <w:r>
+        <w:rPr>
+          <w:rFonts w:ascii="Consolas" w:hAnsi="Consolas"/>
+        </w:rPr>
+        <w:t>for x in X:</w:t>
+      </w:r>
+    </w:p>
+    <w:p>
+      <w:pPr>
+        <w:pStyle w:val="Code"/>
+        <w:rPr>
+          <w:rFonts w:ascii="Consolas" w:hAnsi="Consolas"/>
+        </w:rPr>
+      </w:pPr>
+      <w:r>
+        <w:rPr>
+          <w:rFonts w:ascii="Consolas" w:hAnsi="Consolas"/>
+        </w:rPr>
+        <w:t xml:space="preserve">            </w:t>
+      </w:r>
+      <w:r>
+        <w:rPr>
+          <w:rFonts w:ascii="Consolas" w:hAnsi="Consolas"/>
+        </w:rPr>
+        <w:t>distances = np.linalg.norm(self.prototypes - x, axis=1)</w:t>
+      </w:r>
+    </w:p>
+    <w:p>
+      <w:pPr>
+        <w:pStyle w:val="Code"/>
+        <w:rPr>
+          <w:rFonts w:ascii="Consolas" w:hAnsi="Consolas"/>
+        </w:rPr>
+      </w:pPr>
+      <w:r>
+        <w:rPr>
+          <w:rFonts w:ascii="Consolas" w:hAnsi="Consolas"/>
+        </w:rPr>
+        <w:t xml:space="preserve">            </w:t>
+      </w:r>
+      <w:r>
+        <w:rPr>
+          <w:rFonts w:ascii="Consolas" w:hAnsi="Consolas"/>
+        </w:rPr>
+        <w:t># Знаходимо найближчі прототипи кожного класу</w:t>
+      </w:r>
+    </w:p>
+    <w:p>
+      <w:pPr>
+        <w:pStyle w:val="Code"/>
+        <w:rPr>
+          <w:rFonts w:ascii="Consolas" w:hAnsi="Consolas"/>
+        </w:rPr>
+      </w:pPr>
+      <w:r>
+        <w:rPr>
+          <w:rFonts w:ascii="Consolas" w:hAnsi="Consolas"/>
+        </w:rPr>
+        <w:t xml:space="preserve">            </w:t>
+      </w:r>
+      <w:r>
+        <w:rPr>
+          <w:rFonts w:ascii="Consolas" w:hAnsi="Consolas"/>
+        </w:rPr>
+        <w:t>min_dist_class0 = min(</w:t>
+      </w:r>
+    </w:p>
+    <w:p>
+      <w:pPr>
+        <w:pStyle w:val="Code"/>
+        <w:rPr>
+          <w:rFonts w:ascii="Consolas" w:hAnsi="Consolas"/>
+        </w:rPr>
+      </w:pPr>
+      <w:r>
+        <w:rPr>
+          <w:rFonts w:ascii="Consolas" w:hAnsi="Consolas"/>
+        </w:rPr>
+        <w:t xml:space="preserve">                </w:t>
+      </w:r>
+      <w:r>
+        <w:rPr>
+          <w:rFonts w:ascii="Consolas" w:hAnsi="Consolas"/>
+        </w:rPr>
+        <w:t>[</w:t>
+      </w:r>
+    </w:p>
+    <w:p>
+      <w:pPr>
+        <w:pStyle w:val="Code"/>
+        <w:rPr>
+          <w:rFonts w:ascii="Consolas" w:hAnsi="Consolas"/>
+        </w:rPr>
+      </w:pPr>
+      <w:r>
+        <w:rPr>
+          <w:rFonts w:ascii="Consolas" w:hAnsi="Consolas"/>
+        </w:rPr>
+        <w:t xml:space="preserve">                    </w:t>
+      </w:r>
+      <w:r>
+        <w:rPr>
+          <w:rFonts w:ascii="Consolas" w:hAnsi="Consolas"/>
+        </w:rPr>
+        <w:t>distances[i]</w:t>
+      </w:r>
+    </w:p>
+    <w:p>
+      <w:pPr>
+        <w:pStyle w:val="Code"/>
+        <w:rPr>
+          <w:rFonts w:ascii="Consolas" w:hAnsi="Consolas"/>
+        </w:rPr>
+      </w:pPr>
+      <w:r>
+        <w:rPr>
+          <w:rFonts w:ascii="Consolas" w:hAnsi="Consolas"/>
+        </w:rPr>
+        <w:t xml:space="preserve">                    </w:t>
+      </w:r>
+      <w:r>
+        <w:rPr>
+          <w:rFonts w:ascii="Consolas" w:hAnsi="Consolas"/>
+        </w:rPr>
+        <w:t>for i in range(len(self.prototypes))</w:t>
+      </w:r>
+    </w:p>
+    <w:p>
+      <w:pPr>
+        <w:pStyle w:val="Code"/>
+        <w:rPr>
+          <w:rFonts w:ascii="Consolas" w:hAnsi="Consolas"/>
+        </w:rPr>
+      </w:pPr>
+      <w:r>
+        <w:rPr>
+          <w:rFonts w:ascii="Consolas" w:hAnsi="Consolas"/>
+        </w:rPr>
+        <w:t xml:space="preserve">                    </w:t>
+      </w:r>
+      <w:r>
+        <w:rPr>
+          <w:rFonts w:ascii="Consolas" w:hAnsi="Consolas"/>
+        </w:rPr>
+        <w:t>if self.prototype_labels[i] == 0</w:t>
+      </w:r>
+    </w:p>
+    <w:p>
+      <w:pPr>
+        <w:pStyle w:val="Code"/>
+        <w:rPr>
+          <w:rFonts w:ascii="Consolas" w:hAnsi="Consolas"/>
+        </w:rPr>
+      </w:pPr>
+      <w:r>
+        <w:rPr>
+          <w:rFonts w:ascii="Consolas" w:hAnsi="Consolas"/>
+        </w:rPr>
+        <w:t xml:space="preserve">                </w:t>
+      </w:r>
+      <w:r>
+        <w:rPr>
+          <w:rFonts w:ascii="Consolas" w:hAnsi="Consolas"/>
+        </w:rPr>
+        <w:t>],</w:t>
+      </w:r>
+    </w:p>
+    <w:p>
+      <w:pPr>
+        <w:pStyle w:val="Code"/>
+        <w:rPr>
+          <w:rFonts w:ascii="Consolas" w:hAnsi="Consolas"/>
+        </w:rPr>
+      </w:pPr>
+      <w:r>
+        <w:rPr>
+          <w:rFonts w:ascii="Consolas" w:hAnsi="Consolas"/>
+        </w:rPr>
+        <w:t xml:space="preserve">                </w:t>
+      </w:r>
+      <w:r>
+        <w:rPr>
+          <w:rFonts w:ascii="Consolas" w:hAnsi="Consolas"/>
+        </w:rPr>
+        <w:t>default=np.inf,</w:t>
+      </w:r>
+    </w:p>
+    <w:p>
+      <w:pPr>
+        <w:pStyle w:val="Code"/>
+        <w:rPr>
+          <w:rFonts w:ascii="Consolas" w:hAnsi="Consolas"/>
+        </w:rPr>
+      </w:pPr>
+      <w:r>
+        <w:rPr>
+          <w:rFonts w:ascii="Consolas" w:hAnsi="Consolas"/>
+        </w:rPr>
+        <w:t xml:space="preserve">            </w:t>
+      </w:r>
+      <w:r>
+        <w:rPr>
+          <w:rFonts w:ascii="Consolas" w:hAnsi="Consolas"/>
+        </w:rPr>
+        <w:t>)</w:t>
+      </w:r>
+    </w:p>
+    <w:p>
+      <w:pPr>
+        <w:pStyle w:val="Code"/>
+        <w:rPr>
+          <w:rFonts w:ascii="Consolas" w:hAnsi="Consolas"/>
+        </w:rPr>
+      </w:pPr>
+      <w:r>
+        <w:rPr>
+          <w:rFonts w:ascii="Consolas" w:hAnsi="Consolas"/>
+        </w:rPr>
+        <w:t xml:space="preserve">            </w:t>
+      </w:r>
+      <w:r>
+        <w:rPr>
+          <w:rFonts w:ascii="Consolas" w:hAnsi="Consolas"/>
+        </w:rPr>
+        <w:t>min_dist_class1 = min(</w:t>
+      </w:r>
+    </w:p>
+    <w:p>
+      <w:pPr>
+        <w:pStyle w:val="Code"/>
+        <w:rPr>
+          <w:rFonts w:ascii="Consolas" w:hAnsi="Consolas"/>
+        </w:rPr>
+      </w:pPr>
+      <w:r>
+        <w:rPr>
+          <w:rFonts w:ascii="Consolas" w:hAnsi="Consolas"/>
+        </w:rPr>
+        <w:t xml:space="preserve">                </w:t>
+      </w:r>
+      <w:r>
+        <w:rPr>
+          <w:rFonts w:ascii="Consolas" w:hAnsi="Consolas"/>
+        </w:rPr>
+        <w:t>[</w:t>
+      </w:r>
+    </w:p>
+    <w:p>
+      <w:pPr>
+        <w:pStyle w:val="Code"/>
+        <w:rPr>
+          <w:rFonts w:ascii="Consolas" w:hAnsi="Consolas"/>
+        </w:rPr>
+      </w:pPr>
+      <w:r>
+        <w:rPr>
+          <w:rFonts w:ascii="Consolas" w:hAnsi="Consolas"/>
+        </w:rPr>
+        <w:t xml:space="preserve">                    </w:t>
+      </w:r>
+      <w:r>
+        <w:rPr>
+          <w:rFonts w:ascii="Consolas" w:hAnsi="Consolas"/>
+        </w:rPr>
+        <w:t>distances[i]</w:t>
+      </w:r>
+    </w:p>
+    <w:p>
+      <w:pPr>
+        <w:pStyle w:val="Code"/>
+        <w:rPr>
+          <w:rFonts w:ascii="Consolas" w:hAnsi="Consolas"/>
+        </w:rPr>
+      </w:pPr>
+      <w:r>
+        <w:rPr>
+          <w:rFonts w:ascii="Consolas" w:hAnsi="Consolas"/>
+        </w:rPr>
+        <w:t xml:space="preserve">                    </w:t>
+      </w:r>
+      <w:r>
+        <w:rPr>
+          <w:rFonts w:ascii="Consolas" w:hAnsi="Consolas"/>
+        </w:rPr>
+        <w:t>for i in range(len(self.prototypes))</w:t>
+      </w:r>
+    </w:p>
+    <w:p>
+      <w:pPr>
+        <w:pStyle w:val="Code"/>
+        <w:rPr>
+          <w:rFonts w:ascii="Consolas" w:hAnsi="Consolas"/>
+        </w:rPr>
+      </w:pPr>
+      <w:r>
+        <w:rPr>
+          <w:rFonts w:ascii="Consolas" w:hAnsi="Consolas"/>
+        </w:rPr>
+        <w:t xml:space="preserve">                    </w:t>
+      </w:r>
+      <w:r>
+        <w:rPr>
+          <w:rFonts w:ascii="Consolas" w:hAnsi="Consolas"/>
+        </w:rPr>
+        <w:t>if self.prototype_labels[i] == 1</w:t>
+      </w:r>
+    </w:p>
+    <w:p>
+      <w:pPr>
+        <w:pStyle w:val="Code"/>
+        <w:rPr>
+          <w:rFonts w:ascii="Consolas" w:hAnsi="Consolas"/>
+        </w:rPr>
+      </w:pPr>
+      <w:r>
+        <w:rPr>
+          <w:rFonts w:ascii="Consolas" w:hAnsi="Consolas"/>
+        </w:rPr>
+        <w:t xml:space="preserve">                </w:t>
+      </w:r>
+      <w:r>
+        <w:rPr>
+          <w:rFonts w:ascii="Consolas" w:hAnsi="Consolas"/>
+        </w:rPr>
+        <w:t>],</w:t>
+      </w:r>
+    </w:p>
+    <w:p>
+      <w:pPr>
+        <w:pStyle w:val="Code"/>
+        <w:rPr>
+          <w:rFonts w:ascii="Consolas" w:hAnsi="Consolas"/>
+        </w:rPr>
+      </w:pPr>
+      <w:r>
+        <w:rPr>
+          <w:rFonts w:ascii="Consolas" w:hAnsi="Consolas"/>
+        </w:rPr>
+        <w:t xml:space="preserve">                </w:t>
+      </w:r>
+      <w:r>
+        <w:rPr>
+          <w:rFonts w:ascii="Consolas" w:hAnsi="Consolas"/>
+        </w:rPr>
+        <w:t>default=np.inf,</w:t>
+      </w:r>
+    </w:p>
+    <w:p>
+      <w:pPr>
+        <w:pStyle w:val="Code"/>
+        <w:rPr>
+          <w:rFonts w:ascii="Consolas" w:hAnsi="Consolas"/>
+        </w:rPr>
+      </w:pPr>
+      <w:r>
+        <w:rPr>
+          <w:rFonts w:ascii="Consolas" w:hAnsi="Consolas"/>
+        </w:rPr>
+        <w:t xml:space="preserve">            </w:t>
+      </w:r>
+      <w:r>
+        <w:rPr>
+          <w:rFonts w:ascii="Consolas" w:hAnsi="Consolas"/>
+        </w:rPr>
+        <w:t>)</w:t>
+      </w:r>
+    </w:p>
+    <w:p>
+      <w:pPr>
+        <w:pStyle w:val="Code"/>
+        <w:rPr>
+          <w:rFonts w:ascii="Consolas" w:hAnsi="Consolas"/>
+        </w:rPr>
+      </w:pPr>
+      <w:r>
+        <w:rPr>
+          <w:rFonts w:ascii="Consolas" w:hAnsi="Consolas"/>
+        </w:rPr>
+      </w:r>
+    </w:p>
+    <w:p>
+      <w:pPr>
+        <w:pStyle w:val="Code"/>
+        <w:rPr>
+          <w:rFonts w:ascii="Consolas" w:hAnsi="Consolas"/>
+        </w:rPr>
+      </w:pPr>
+      <w:r>
+        <w:rPr>
+          <w:rFonts w:ascii="Consolas" w:hAnsi="Consolas"/>
+        </w:rPr>
+        <w:t xml:space="preserve">            </w:t>
+      </w:r>
+      <w:r>
+        <w:rPr>
+          <w:rFonts w:ascii="Consolas" w:hAnsi="Consolas"/>
+        </w:rPr>
+        <w:t># Ймовірність класу 1 (обернено пропорційна відстані)</w:t>
+      </w:r>
+    </w:p>
+    <w:p>
+      <w:pPr>
+        <w:pStyle w:val="Code"/>
+        <w:rPr>
+          <w:rFonts w:ascii="Consolas" w:hAnsi="Consolas"/>
+        </w:rPr>
+      </w:pPr>
+      <w:r>
+        <w:rPr>
+          <w:rFonts w:ascii="Consolas" w:hAnsi="Consolas"/>
+        </w:rPr>
+        <w:t xml:space="preserve">            </w:t>
+      </w:r>
+      <w:r>
+        <w:rPr>
+          <w:rFonts w:ascii="Consolas" w:hAnsi="Consolas"/>
+        </w:rPr>
+        <w:t>if min_dist_class0 + min_dist_class1 &gt; 0:</w:t>
+      </w:r>
+    </w:p>
+    <w:p>
+      <w:pPr>
+        <w:pStyle w:val="Code"/>
+        <w:rPr>
+          <w:rFonts w:ascii="Consolas" w:hAnsi="Consolas"/>
+        </w:rPr>
+      </w:pPr>
+      <w:r>
+        <w:rPr>
+          <w:rFonts w:ascii="Consolas" w:hAnsi="Consolas"/>
+        </w:rPr>
+        <w:t xml:space="preserve">                </w:t>
+      </w:r>
+      <w:r>
+        <w:rPr>
+          <w:rFonts w:ascii="Consolas" w:hAnsi="Consolas"/>
+        </w:rPr>
+        <w:t>prob = min_dist_class0 / (min_dist_class0 + min_dist_class1)</w:t>
+      </w:r>
+    </w:p>
+    <w:p>
+      <w:pPr>
+        <w:pStyle w:val="Code"/>
+        <w:rPr>
+          <w:rFonts w:ascii="Consolas" w:hAnsi="Consolas"/>
+        </w:rPr>
+      </w:pPr>
+      <w:r>
+        <w:rPr>
+          <w:rFonts w:ascii="Consolas" w:hAnsi="Consolas"/>
+        </w:rPr>
+        <w:t xml:space="preserve">            </w:t>
+      </w:r>
+      <w:r>
+        <w:rPr>
+          <w:rFonts w:ascii="Consolas" w:hAnsi="Consolas"/>
+        </w:rPr>
+        <w:t>else:</w:t>
+      </w:r>
+    </w:p>
+    <w:p>
+      <w:pPr>
+        <w:pStyle w:val="Code"/>
+        <w:rPr>
+          <w:rFonts w:ascii="Consolas" w:hAnsi="Consolas"/>
+        </w:rPr>
+      </w:pPr>
+      <w:r>
+        <w:rPr>
+          <w:rFonts w:ascii="Consolas" w:hAnsi="Consolas"/>
+        </w:rPr>
+        <w:t xml:space="preserve">                </w:t>
+      </w:r>
+      <w:r>
+        <w:rPr>
+          <w:rFonts w:ascii="Consolas" w:hAnsi="Consolas"/>
+        </w:rPr>
+        <w:t>prob = 0.5</w:t>
+      </w:r>
+    </w:p>
+    <w:p>
+      <w:pPr>
+        <w:pStyle w:val="Code"/>
+        <w:rPr>
+          <w:rFonts w:ascii="Consolas" w:hAnsi="Consolas"/>
+        </w:rPr>
+      </w:pPr>
+      <w:r>
+        <w:rPr>
+          <w:rFonts w:ascii="Consolas" w:hAnsi="Consolas"/>
+        </w:rPr>
+        <w:t xml:space="preserve">            </w:t>
+      </w:r>
+      <w:r>
+        <w:rPr>
+          <w:rFonts w:ascii="Consolas" w:hAnsi="Consolas"/>
+        </w:rPr>
+        <w:t>proba.append(prob)</w:t>
+      </w:r>
+    </w:p>
+    <w:p>
+      <w:pPr>
+        <w:pStyle w:val="Code"/>
+        <w:rPr>
+          <w:rFonts w:ascii="Consolas" w:hAnsi="Consolas"/>
+        </w:rPr>
+      </w:pPr>
+      <w:r>
+        <w:rPr>
+          <w:rFonts w:ascii="Consolas" w:hAnsi="Consolas"/>
+        </w:rPr>
+        <w:t xml:space="preserve">        </w:t>
+      </w:r>
+      <w:r>
+        <w:rPr>
+          <w:rFonts w:ascii="Consolas" w:hAnsi="Consolas"/>
+        </w:rPr>
+        <w:t>return np.array(proba)</w:t>
+      </w:r>
+    </w:p>
+    <w:p>
+      <w:pPr>
+        <w:pStyle w:val="Code"/>
+        <w:rPr>
+          <w:rFonts w:ascii="Consolas" w:hAnsi="Consolas"/>
+        </w:rPr>
+      </w:pPr>
+      <w:r>
+        <w:rPr>
+          <w:rFonts w:ascii="Consolas" w:hAnsi="Consolas"/>
+        </w:rPr>
+      </w:r>
+    </w:p>
+    <w:p>
+      <w:pPr>
+        <w:pStyle w:val="Code"/>
+        <w:rPr>
+          <w:rFonts w:ascii="Consolas" w:hAnsi="Consolas"/>
+        </w:rPr>
+      </w:pPr>
+      <w:r>
+        <w:rPr>
+          <w:rFonts w:ascii="Consolas" w:hAnsi="Consolas"/>
+        </w:rPr>
+      </w:r>
+    </w:p>
+    <w:p>
+      <w:pPr>
+        <w:pStyle w:val="Code"/>
+        <w:rPr>
+          <w:rFonts w:ascii="Consolas" w:hAnsi="Consolas"/>
+        </w:rPr>
+      </w:pPr>
+      <w:r>
+        <w:rPr>
+          <w:rFonts w:ascii="Consolas" w:hAnsi="Consolas"/>
+        </w:rPr>
+        <w:t># Генерація даних</w:t>
+      </w:r>
+    </w:p>
+    <w:p>
+      <w:pPr>
+        <w:pStyle w:val="Code"/>
+        <w:rPr>
+          <w:rFonts w:ascii="Consolas" w:hAnsi="Consolas"/>
+        </w:rPr>
+      </w:pPr>
+      <w:r>
+        <w:rPr>
+          <w:rFonts w:ascii="Consolas" w:hAnsi="Consolas"/>
+        </w:rPr>
+        <w:t>N = 500</w:t>
+      </w:r>
+    </w:p>
+    <w:p>
+      <w:pPr>
+        <w:pStyle w:val="Code"/>
+        <w:rPr>
+          <w:rFonts w:ascii="Consolas" w:hAnsi="Consolas"/>
+        </w:rPr>
+      </w:pPr>
+      <w:r>
+        <w:rPr>
+          <w:rFonts w:ascii="Consolas" w:hAnsi="Consolas"/>
+        </w:rPr>
+      </w:r>
+    </w:p>
+    <w:p>
+      <w:pPr>
+        <w:pStyle w:val="Code"/>
+        <w:rPr>
+          <w:rFonts w:ascii="Consolas" w:hAnsi="Consolas"/>
+        </w:rPr>
+      </w:pPr>
+      <w:r>
+        <w:rPr>
+          <w:rFonts w:ascii="Consolas" w:hAnsi="Consolas"/>
+        </w:rPr>
+        <w:t>X = np.random.rand(N, 18)</w:t>
+      </w:r>
+    </w:p>
+    <w:p>
+      <w:pPr>
+        <w:pStyle w:val="Code"/>
+        <w:rPr>
+          <w:rFonts w:ascii="Consolas" w:hAnsi="Consolas"/>
+        </w:rPr>
+      </w:pPr>
+      <w:r>
+        <w:rPr>
+          <w:rFonts w:ascii="Consolas" w:hAnsi="Consolas"/>
+        </w:rPr>
+        <w:t>y = np.random.randint(0, 2, N)</w:t>
+      </w:r>
+    </w:p>
+    <w:p>
+      <w:pPr>
+        <w:pStyle w:val="Code"/>
+        <w:rPr>
+          <w:rFonts w:ascii="Consolas" w:hAnsi="Consolas"/>
+        </w:rPr>
+      </w:pPr>
+      <w:r>
+        <w:rPr>
+          <w:rFonts w:ascii="Consolas" w:hAnsi="Consolas"/>
+        </w:rPr>
+      </w:r>
+    </w:p>
+    <w:p>
+      <w:pPr>
+        <w:pStyle w:val="Code"/>
+        <w:rPr>
+          <w:rFonts w:ascii="Consolas" w:hAnsi="Consolas"/>
+        </w:rPr>
+      </w:pPr>
+      <w:r>
+        <w:rPr>
+          <w:rFonts w:ascii="Consolas" w:hAnsi="Consolas"/>
+        </w:rPr>
+        <w:t># Розділення на навчальну та тестову вибірки</w:t>
+      </w:r>
+    </w:p>
+    <w:p>
+      <w:pPr>
+        <w:pStyle w:val="Code"/>
+        <w:rPr>
+          <w:rFonts w:ascii="Consolas" w:hAnsi="Consolas"/>
+        </w:rPr>
+      </w:pPr>
+      <w:r>
+        <w:rPr>
+          <w:rFonts w:ascii="Consolas" w:hAnsi="Consolas"/>
+        </w:rPr>
+        <w:t>X_train, X_test, y_train, y_test = train_test_split(</w:t>
+      </w:r>
+    </w:p>
+    <w:p>
+      <w:pPr>
+        <w:pStyle w:val="Code"/>
+        <w:rPr>
+          <w:rFonts w:ascii="Consolas" w:hAnsi="Consolas"/>
+        </w:rPr>
+      </w:pPr>
+      <w:r>
+        <w:rPr>
+          <w:rFonts w:ascii="Consolas" w:hAnsi="Consolas"/>
+        </w:rPr>
+        <w:t xml:space="preserve">    </w:t>
+      </w:r>
+      <w:r>
+        <w:rPr>
+          <w:rFonts w:ascii="Consolas" w:hAnsi="Consolas"/>
+        </w:rPr>
+        <w:t>X, y, test_size=0.8, random_state=42</w:t>
+      </w:r>
+    </w:p>
+    <w:p>
+      <w:pPr>
+        <w:pStyle w:val="Code"/>
+        <w:rPr>
+          <w:rFonts w:ascii="Consolas" w:hAnsi="Consolas"/>
+        </w:rPr>
+      </w:pPr>
+      <w:r>
+        <w:rPr>
+          <w:rFonts w:ascii="Consolas" w:hAnsi="Consolas"/>
+        </w:rPr>
+        <w:t>)</w:t>
+      </w:r>
+    </w:p>
+    <w:p>
+      <w:pPr>
+        <w:pStyle w:val="Code"/>
+        <w:rPr>
+          <w:rFonts w:ascii="Consolas" w:hAnsi="Consolas"/>
+        </w:rPr>
+      </w:pPr>
+      <w:r>
+        <w:rPr>
+          <w:rFonts w:ascii="Consolas" w:hAnsi="Consolas"/>
+        </w:rPr>
+      </w:r>
+    </w:p>
+    <w:p>
+      <w:pPr>
+        <w:pStyle w:val="Code"/>
+        <w:rPr>
+          <w:rFonts w:ascii="Consolas" w:hAnsi="Consolas"/>
+        </w:rPr>
+      </w:pPr>
+      <w:r>
+        <w:rPr>
+          <w:rFonts w:ascii="Consolas" w:hAnsi="Consolas"/>
+        </w:rPr>
+        <w:t># Створення та навчання LVQ</w:t>
+      </w:r>
+    </w:p>
+    <w:p>
+      <w:pPr>
+        <w:pStyle w:val="Code"/>
+        <w:rPr>
+          <w:rFonts w:ascii="Consolas" w:hAnsi="Consolas"/>
+        </w:rPr>
+      </w:pPr>
+      <w:r>
+        <w:rPr>
+          <w:rFonts w:ascii="Consolas" w:hAnsi="Consolas"/>
+        </w:rPr>
+        <w:t>lvq = LVQ(n_prototypes_per_class=5, learning_rate=0.1, max_epochs=30)</w:t>
+      </w:r>
+    </w:p>
+    <w:p>
+      <w:pPr>
+        <w:pStyle w:val="Code"/>
+        <w:rPr>
+          <w:rFonts w:ascii="Consolas" w:hAnsi="Consolas"/>
+        </w:rPr>
+      </w:pPr>
+      <w:r>
+        <w:rPr>
+          <w:rFonts w:ascii="Consolas" w:hAnsi="Consolas"/>
+        </w:rPr>
+        <w:t>lvq.fit(X_train, y_train)</w:t>
+      </w:r>
+    </w:p>
+    <w:p>
+      <w:pPr>
+        <w:pStyle w:val="Code"/>
+        <w:rPr>
+          <w:rFonts w:ascii="Consolas" w:hAnsi="Consolas"/>
+        </w:rPr>
+      </w:pPr>
+      <w:r>
+        <w:rPr>
+          <w:rFonts w:ascii="Consolas" w:hAnsi="Consolas"/>
+        </w:rPr>
+      </w:r>
+    </w:p>
+    <w:p>
+      <w:pPr>
+        <w:pStyle w:val="Code"/>
+        <w:rPr>
+          <w:rFonts w:ascii="Consolas" w:hAnsi="Consolas"/>
+        </w:rPr>
+      </w:pPr>
+      <w:r>
+        <w:rPr>
+          <w:rFonts w:ascii="Consolas" w:hAnsi="Consolas"/>
+        </w:rPr>
+        <w:t># Передбачення</w:t>
+      </w:r>
+    </w:p>
+    <w:p>
+      <w:pPr>
+        <w:pStyle w:val="Code"/>
+        <w:rPr>
+          <w:rFonts w:ascii="Consolas" w:hAnsi="Consolas"/>
+        </w:rPr>
+      </w:pPr>
+      <w:r>
+        <w:rPr>
+          <w:rFonts w:ascii="Consolas" w:hAnsi="Consolas"/>
+        </w:rPr>
+        <w:t>y_train_pred = lvq.predict(X_train)</w:t>
+      </w:r>
+    </w:p>
+    <w:p>
+      <w:pPr>
+        <w:pStyle w:val="Code"/>
+        <w:rPr>
+          <w:rFonts w:ascii="Consolas" w:hAnsi="Consolas"/>
+        </w:rPr>
+      </w:pPr>
+      <w:r>
+        <w:rPr>
+          <w:rFonts w:ascii="Consolas" w:hAnsi="Consolas"/>
+        </w:rPr>
+        <w:t>y_test_pred = lvq.predict(X_test)</w:t>
+      </w:r>
+    </w:p>
+    <w:p>
+      <w:pPr>
+        <w:pStyle w:val="Code"/>
+        <w:rPr>
+          <w:rFonts w:ascii="Consolas" w:hAnsi="Consolas"/>
+        </w:rPr>
+      </w:pPr>
+      <w:r>
+        <w:rPr>
+          <w:rFonts w:ascii="Consolas" w:hAnsi="Consolas"/>
+        </w:rPr>
+      </w:r>
+    </w:p>
+    <w:p>
+      <w:pPr>
+        <w:pStyle w:val="Code"/>
+        <w:rPr>
+          <w:rFonts w:ascii="Consolas" w:hAnsi="Consolas"/>
+        </w:rPr>
+      </w:pPr>
+      <w:r>
+        <w:rPr>
+          <w:rFonts w:ascii="Consolas" w:hAnsi="Consolas"/>
+        </w:rPr>
+        <w:t># Точність</w:t>
+      </w:r>
+    </w:p>
+    <w:p>
+      <w:pPr>
+        <w:pStyle w:val="Code"/>
+        <w:rPr>
+          <w:rFonts w:ascii="Consolas" w:hAnsi="Consolas"/>
+        </w:rPr>
+      </w:pPr>
+      <w:r>
+        <w:rPr>
+          <w:rFonts w:ascii="Consolas" w:hAnsi="Consolas"/>
+        </w:rPr>
+        <w:t>train_acc = accuracy_score(y_train, y_train_pred)</w:t>
+      </w:r>
+    </w:p>
+    <w:p>
+      <w:pPr>
+        <w:pStyle w:val="Code"/>
+        <w:rPr>
+          <w:rFonts w:ascii="Consolas" w:hAnsi="Consolas"/>
+        </w:rPr>
+      </w:pPr>
+      <w:r>
+        <w:rPr>
+          <w:rFonts w:ascii="Consolas" w:hAnsi="Consolas"/>
+        </w:rPr>
+        <w:t>test_acc = accuracy_score(y_test, y_test_pred)</w:t>
+      </w:r>
+    </w:p>
+    <w:p>
+      <w:pPr>
+        <w:pStyle w:val="Code"/>
+        <w:rPr>
+          <w:rFonts w:ascii="Consolas" w:hAnsi="Consolas"/>
+        </w:rPr>
+      </w:pPr>
+      <w:r>
+        <w:rPr>
+          <w:rFonts w:ascii="Consolas" w:hAnsi="Consolas"/>
+        </w:rPr>
+      </w:r>
+    </w:p>
+    <w:p>
+      <w:pPr>
+        <w:pStyle w:val="Code"/>
+        <w:rPr>
+          <w:rFonts w:ascii="Consolas" w:hAnsi="Consolas"/>
+        </w:rPr>
+      </w:pPr>
+      <w:r>
+        <w:rPr>
+          <w:rFonts w:ascii="Consolas" w:hAnsi="Consolas"/>
+        </w:rPr>
+        <w:t>print("\n2. Результати LVQ:")</w:t>
+      </w:r>
+    </w:p>
+    <w:p>
+      <w:pPr>
+        <w:pStyle w:val="Code"/>
+        <w:rPr>
+          <w:rFonts w:ascii="Consolas" w:hAnsi="Consolas"/>
+        </w:rPr>
+      </w:pPr>
+      <w:r>
+        <w:rPr>
+          <w:rFonts w:ascii="Consolas" w:hAnsi="Consolas"/>
+        </w:rPr>
+        <w:t>print(f"   Точність на навчальних даних: {train_acc * 100:.2f}%")</w:t>
+      </w:r>
+    </w:p>
+    <w:p>
+      <w:pPr>
+        <w:pStyle w:val="Code"/>
+        <w:rPr>
+          <w:rFonts w:ascii="Consolas" w:hAnsi="Consolas"/>
+        </w:rPr>
+      </w:pPr>
+      <w:r>
+        <w:rPr>
+          <w:rFonts w:ascii="Consolas" w:hAnsi="Consolas"/>
+        </w:rPr>
+        <w:t>print(f"   Точність на тестових даних: {test_acc * 100:.2f}%")</w:t>
+      </w:r>
+    </w:p>
+    <w:p>
+      <w:pPr>
+        <w:pStyle w:val="Code"/>
+        <w:rPr>
+          <w:rFonts w:ascii="Consolas" w:hAnsi="Consolas"/>
+        </w:rPr>
+      </w:pPr>
+      <w:r>
+        <w:rPr>
+          <w:rFonts w:ascii="Consolas" w:hAnsi="Consolas"/>
+        </w:rPr>
+      </w:r>
+    </w:p>
+    <w:p>
+      <w:pPr>
+        <w:pStyle w:val="Code"/>
+        <w:rPr>
+          <w:rFonts w:ascii="Consolas" w:hAnsi="Consolas"/>
+        </w:rPr>
+      </w:pPr>
+      <w:r>
+        <w:rPr>
+          <w:rFonts w:ascii="Consolas" w:hAnsi="Consolas"/>
+        </w:rPr>
+        <w:t># Інформація про прототипи</w:t>
+      </w:r>
+    </w:p>
+    <w:p>
+      <w:pPr>
+        <w:pStyle w:val="Code"/>
+        <w:rPr>
+          <w:rFonts w:ascii="Consolas" w:hAnsi="Consolas"/>
+        </w:rPr>
+      </w:pPr>
+      <w:r>
+        <w:rPr>
+          <w:rFonts w:ascii="Consolas" w:hAnsi="Consolas"/>
+        </w:rPr>
+        <w:t>print("\n3. Прототипи:")</w:t>
+      </w:r>
+    </w:p>
+    <w:p>
+      <w:pPr>
+        <w:pStyle w:val="Code"/>
+        <w:rPr>
+          <w:rFonts w:ascii="Consolas" w:hAnsi="Consolas"/>
+        </w:rPr>
+      </w:pPr>
+      <w:r>
+        <w:rPr>
+          <w:rFonts w:ascii="Consolas" w:hAnsi="Consolas"/>
+        </w:rPr>
+        <w:t>print(f"   Кількість прототипів: {len(lvq.prototypes)}")</w:t>
+      </w:r>
+    </w:p>
+    <w:p>
+      <w:pPr>
+        <w:pStyle w:val="Code"/>
+        <w:rPr>
+          <w:rFonts w:ascii="Consolas" w:hAnsi="Consolas"/>
+        </w:rPr>
+      </w:pPr>
+      <w:r>
+        <w:rPr>
+          <w:rFonts w:ascii="Consolas" w:hAnsi="Consolas"/>
+        </w:rPr>
+        <w:t>for label in [0, 1]:</w:t>
+      </w:r>
+    </w:p>
+    <w:p>
+      <w:pPr>
+        <w:pStyle w:val="Code"/>
+        <w:rPr>
+          <w:rFonts w:ascii="Consolas" w:hAnsi="Consolas"/>
+        </w:rPr>
+      </w:pPr>
+      <w:r>
+        <w:rPr>
+          <w:rFonts w:ascii="Consolas" w:hAnsi="Consolas"/>
+        </w:rPr>
+        <w:t xml:space="preserve">    </w:t>
+      </w:r>
+      <w:r>
+        <w:rPr>
+          <w:rFonts w:ascii="Consolas" w:hAnsi="Consolas"/>
+        </w:rPr>
+        <w:t>n_protos = np.sum(lvq.prototype_labels == label)</w:t>
+      </w:r>
+    </w:p>
+    <w:p>
+      <w:pPr>
+        <w:pStyle w:val="Code"/>
+        <w:rPr>
+          <w:rFonts w:ascii="Consolas" w:hAnsi="Consolas"/>
+        </w:rPr>
+      </w:pPr>
+      <w:r>
+        <w:rPr>
+          <w:rFonts w:ascii="Consolas" w:hAnsi="Consolas"/>
+        </w:rPr>
+        <w:t xml:space="preserve">    </w:t>
+      </w:r>
+      <w:r>
+        <w:rPr>
+          <w:rFonts w:ascii="Consolas" w:hAnsi="Consolas"/>
+        </w:rPr>
+        <w:t>print(f"   Клас {label}: {n_protos} прототипів")</w:t>
+      </w:r>
+    </w:p>
+    <w:p>
+      <w:pPr>
+        <w:pStyle w:val="Code"/>
+        <w:rPr>
+          <w:rFonts w:ascii="Consolas" w:hAnsi="Consolas"/>
+        </w:rPr>
+      </w:pPr>
+      <w:r>
+        <w:rPr>
+          <w:rFonts w:ascii="Consolas" w:hAnsi="Consolas"/>
+        </w:rPr>
+      </w:r>
+    </w:p>
+    <w:p>
+      <w:pPr>
+        <w:pStyle w:val="P1"/>
+        <w:rPr/>
+      </w:pPr>
+      <w:r>
+        <w:rPr/>
+      </w:r>
+    </w:p>
+    <w:p>
+      <w:pPr>
+        <w:pStyle w:val="H3"/>
+        <w:rPr/>
+      </w:pPr>
+      <w:r>
+        <w:rPr/>
+        <w:t>Результат в консолі</w:t>
+      </w:r>
+    </w:p>
+    <w:p>
+      <w:pPr>
+        <w:pStyle w:val="P1"/>
+        <w:rPr/>
+      </w:pPr>
+      <w:r>
+        <w:rPr/>
+      </w:r>
+    </w:p>
+    <w:p>
+      <w:pPr>
+        <w:pStyle w:val="Code"/>
+        <w:rPr>
+          <w:rFonts w:ascii="Consolas" w:hAnsi="Consolas"/>
+        </w:rPr>
+      </w:pPr>
+      <w:r>
+        <w:rPr>
+          <w:rFonts w:ascii="Consolas" w:hAnsi="Consolas"/>
+        </w:rPr>
+        <w:t>2. Результати LVQ:</w:t>
+      </w:r>
+    </w:p>
+    <w:p>
+      <w:pPr>
+        <w:pStyle w:val="Code"/>
+        <w:rPr>
+          <w:rFonts w:ascii="Consolas" w:hAnsi="Consolas"/>
+        </w:rPr>
+      </w:pPr>
+      <w:r>
+        <w:rPr>
+          <w:rFonts w:ascii="Consolas" w:hAnsi="Consolas"/>
+        </w:rPr>
+        <w:t xml:space="preserve">   </w:t>
+      </w:r>
+      <w:r>
+        <w:rPr>
+          <w:rFonts w:ascii="Consolas" w:hAnsi="Consolas"/>
+        </w:rPr>
+        <w:t>Точність на навчальних даних: 85.00%</w:t>
+      </w:r>
+    </w:p>
+    <w:p>
+      <w:pPr>
+        <w:pStyle w:val="Code"/>
+        <w:rPr>
+          <w:rFonts w:ascii="Consolas" w:hAnsi="Consolas"/>
+        </w:rPr>
+      </w:pPr>
+      <w:r>
+        <w:rPr>
+          <w:rFonts w:ascii="Consolas" w:hAnsi="Consolas"/>
+        </w:rPr>
+        <w:t xml:space="preserve">   </w:t>
+      </w:r>
+      <w:r>
+        <w:rPr>
+          <w:rFonts w:ascii="Consolas" w:hAnsi="Consolas"/>
+        </w:rPr>
+        <w:t>Точність на тестових даних: 51.50%</w:t>
+      </w:r>
+    </w:p>
+    <w:p>
+      <w:pPr>
+        <w:pStyle w:val="Code"/>
+        <w:rPr>
+          <w:rFonts w:ascii="Consolas" w:hAnsi="Consolas"/>
+        </w:rPr>
+      </w:pPr>
+      <w:r>
+        <w:rPr>
+          <w:rFonts w:ascii="Consolas" w:hAnsi="Consolas"/>
+        </w:rPr>
+      </w:r>
+    </w:p>
+    <w:p>
+      <w:pPr>
+        <w:pStyle w:val="Code"/>
+        <w:rPr>
+          <w:rFonts w:ascii="Consolas" w:hAnsi="Consolas"/>
+        </w:rPr>
+      </w:pPr>
+      <w:r>
+        <w:rPr>
+          <w:rFonts w:ascii="Consolas" w:hAnsi="Consolas"/>
+        </w:rPr>
+        <w:t>3. Прототипи:</w:t>
+      </w:r>
+    </w:p>
+    <w:p>
+      <w:pPr>
+        <w:pStyle w:val="Code"/>
+        <w:rPr>
+          <w:rFonts w:ascii="Consolas" w:hAnsi="Consolas"/>
+        </w:rPr>
+      </w:pPr>
+      <w:r>
+        <w:rPr>
+          <w:rFonts w:ascii="Consolas" w:hAnsi="Consolas"/>
+        </w:rPr>
+        <w:t xml:space="preserve">   </w:t>
+      </w:r>
+      <w:r>
+        <w:rPr>
+          <w:rFonts w:ascii="Consolas" w:hAnsi="Consolas"/>
+        </w:rPr>
+        <w:t>Кількість прототипів: 10</w:t>
+      </w:r>
+    </w:p>
+    <w:p>
+      <w:pPr>
+        <w:pStyle w:val="Code"/>
+        <w:rPr>
+          <w:rFonts w:ascii="Consolas" w:hAnsi="Consolas"/>
+        </w:rPr>
+      </w:pPr>
+      <w:r>
+        <w:rPr>
+          <w:rFonts w:ascii="Consolas" w:hAnsi="Consolas"/>
+        </w:rPr>
+        <w:t xml:space="preserve">   </w:t>
+      </w:r>
+      <w:r>
+        <w:rPr>
+          <w:rFonts w:ascii="Consolas" w:hAnsi="Consolas"/>
+        </w:rPr>
+        <w:t>Клас 0: 5 прототипів</w:t>
+      </w:r>
+    </w:p>
+    <w:p>
+      <w:pPr>
+        <w:pStyle w:val="Code"/>
+        <w:rPr>
+          <w:rFonts w:ascii="Consolas" w:hAnsi="Consolas"/>
+        </w:rPr>
+      </w:pPr>
+      <w:r>
+        <w:rPr>
+          <w:rFonts w:ascii="Consolas" w:hAnsi="Consolas"/>
+        </w:rPr>
+        <w:t xml:space="preserve">   </w:t>
+      </w:r>
+      <w:r>
+        <w:rPr>
+          <w:rFonts w:ascii="Consolas" w:hAnsi="Consolas"/>
+        </w:rPr>
+        <w:t>Клас 1: 5 прототипів</w:t>
+      </w:r>
+    </w:p>
+    <w:p>
+      <w:pPr>
+        <w:pStyle w:val="P1"/>
+        <w:rPr/>
+      </w:pPr>
+      <w:r>
+        <w:rPr/>
+      </w:r>
+    </w:p>
+    <w:p>
+      <w:pPr>
+        <w:pStyle w:val="H3"/>
+        <w:rPr/>
+      </w:pPr>
+      <w:r>
+        <w:rPr/>
+        <w:t>Порівняння результатів</w:t>
+      </w:r>
+    </w:p>
+    <w:p>
+      <w:pPr>
+        <w:pStyle w:val="P1"/>
+        <w:rPr/>
+      </w:pPr>
+      <w:r>
+        <w:rPr/>
+      </w:r>
+    </w:p>
+    <w:p>
+      <w:pPr>
+        <w:pStyle w:val="P1"/>
+        <w:rPr/>
+      </w:pPr>
+      <w:r>
+        <w:rPr/>
+        <w:t>Під час виконання було зроблено експерименти з різними вхідними даними. Деталі на таблиці 2.1 нижче:</w:t>
+      </w:r>
+    </w:p>
+    <w:p>
+      <w:pPr>
+        <w:pStyle w:val="P1"/>
+        <w:rPr/>
+      </w:pPr>
+      <w:r>
+        <w:rPr/>
+      </w:r>
+    </w:p>
+    <w:p>
+      <w:pPr>
+        <w:pStyle w:val="P1"/>
+        <w:rPr/>
+      </w:pPr>
+      <w:r>
+        <w:rPr/>
+        <w:t>Таблиця 2.1 — Порівняння вхідних даних</w:t>
+      </w:r>
+    </w:p>
+    <w:p>
+      <w:pPr>
+        <w:pStyle w:val="P1"/>
+        <w:rPr/>
+      </w:pPr>
+      <w:r>
+        <w:rPr/>
       </w:r>
     </w:p>
     <w:sectPr>

</xml_diff>